<commit_message>
error handling middleware, dsa questions
</commit_message>
<xml_diff>
--- a/interview questions/1.html.docx
+++ b/interview questions/1.html.docx
@@ -4,23 +4,7 @@
   <w:body>
     <w:p>
       <w:pPr>
-        <w:rPr>
-          <w:rFonts w:ascii="Segoe UI Emoji" w:hAnsi="Segoe UI Emoji" w:cs="Segoe UI Emoji"/>
-          <w:b/>
-          <w:bCs/>
-        </w:rPr>
-      </w:pPr>
-      <w:r>
-        <w:rPr>
-          <w:rFonts w:ascii="Segoe UI Emoji" w:hAnsi="Segoe UI Emoji" w:cs="Segoe UI Emoji"/>
-          <w:b/>
-          <w:bCs/>
-        </w:rPr>
-        <w:t>Absolutely. Here are the Top 10 Important HTML Interview Questions and Answers in English, especially useful for a MERN Stack Developer interview.</w:t>
-      </w:r>
-    </w:p>
-    <w:p>
-      <w:pPr>
+        <w:spacing w:line="240" w:lineRule="auto"/>
         <w:rPr>
           <w:rFonts w:ascii="Segoe UI Emoji" w:hAnsi="Segoe UI Emoji" w:cs="Segoe UI Emoji"/>
           <w:b/>
@@ -38,6 +22,7 @@
     </w:p>
     <w:p>
       <w:pPr>
+        <w:spacing w:line="240" w:lineRule="auto"/>
         <w:rPr>
           <w:rFonts w:ascii="Segoe UI Emoji" w:hAnsi="Segoe UI Emoji" w:cs="Segoe UI Emoji"/>
           <w:b/>
@@ -58,30 +43,20 @@
           <w:b/>
           <w:bCs/>
         </w:rPr>
-        <w:br/>
-        <w:t xml:space="preserve">HTML stands for </w:t>
-      </w:r>
-      <w:proofErr w:type="spellStart"/>
-      <w:r>
-        <w:rPr>
-          <w:rFonts w:ascii="Segoe UI Emoji" w:hAnsi="Segoe UI Emoji" w:cs="Segoe UI Emoji"/>
-          <w:b/>
-          <w:bCs/>
-        </w:rPr>
-        <w:t>HyperText</w:t>
-      </w:r>
-      <w:proofErr w:type="spellEnd"/>
-      <w:r>
-        <w:rPr>
-          <w:rFonts w:ascii="Segoe UI Emoji" w:hAnsi="Segoe UI Emoji" w:cs="Segoe UI Emoji"/>
-          <w:b/>
-          <w:bCs/>
-        </w:rPr>
-        <w:t xml:space="preserve"> Markup Language. It is used to create the structure of web pages.</w:t>
-      </w:r>
-    </w:p>
-    <w:p>
-      <w:pPr>
+        <w:t xml:space="preserve"> </w:t>
+      </w:r>
+      <w:r>
+        <w:rPr>
+          <w:rFonts w:ascii="Segoe UI Emoji" w:hAnsi="Segoe UI Emoji" w:cs="Segoe UI Emoji"/>
+          <w:b/>
+          <w:bCs/>
+        </w:rPr>
+        <w:t>HTML stands for HyperText Markup Language. It is used to create the structure of web pages.</w:t>
+      </w:r>
+    </w:p>
+    <w:p>
+      <w:pPr>
+        <w:spacing w:line="240" w:lineRule="auto"/>
         <w:rPr>
           <w:rFonts w:ascii="Segoe UI Emoji" w:hAnsi="Segoe UI Emoji" w:cs="Segoe UI Emoji"/>
           <w:b/>
@@ -99,6 +74,7 @@
     </w:p>
     <w:p>
       <w:pPr>
+        <w:spacing w:line="240" w:lineRule="auto"/>
         <w:rPr>
           <w:rFonts w:ascii="Segoe UI Emoji" w:hAnsi="Segoe UI Emoji" w:cs="Segoe UI Emoji"/>
           <w:b/>
@@ -116,41 +92,25 @@
     </w:p>
     <w:p>
       <w:pPr>
-        <w:rPr>
-          <w:rFonts w:ascii="Segoe UI Emoji" w:hAnsi="Segoe UI Emoji" w:cs="Segoe UI Emoji"/>
-          <w:b/>
-          <w:bCs/>
-        </w:rPr>
-      </w:pPr>
-      <w:r>
-        <w:rPr>
-          <w:rFonts w:ascii="Segoe UI Emoji" w:hAnsi="Segoe UI Emoji" w:cs="Segoe UI Emoji"/>
-          <w:b/>
-          <w:bCs/>
-        </w:rPr>
-        <w:t xml:space="preserve">&lt;p&gt;This is my </w:t>
-      </w:r>
-      <w:proofErr w:type="gramStart"/>
-      <w:r>
-        <w:rPr>
-          <w:rFonts w:ascii="Segoe UI Emoji" w:hAnsi="Segoe UI Emoji" w:cs="Segoe UI Emoji"/>
-          <w:b/>
-          <w:bCs/>
-        </w:rPr>
-        <w:t>website.&lt;</w:t>
-      </w:r>
-      <w:proofErr w:type="gramEnd"/>
-      <w:r>
-        <w:rPr>
-          <w:rFonts w:ascii="Segoe UI Emoji" w:hAnsi="Segoe UI Emoji" w:cs="Segoe UI Emoji"/>
-          <w:b/>
-          <w:bCs/>
-        </w:rPr>
-        <w:t>/p&gt;</w:t>
-      </w:r>
-    </w:p>
-    <w:p>
-      <w:pPr>
+        <w:spacing w:line="240" w:lineRule="auto"/>
+        <w:rPr>
+          <w:rFonts w:ascii="Segoe UI Emoji" w:hAnsi="Segoe UI Emoji" w:cs="Segoe UI Emoji"/>
+          <w:b/>
+          <w:bCs/>
+        </w:rPr>
+      </w:pPr>
+      <w:r>
+        <w:rPr>
+          <w:rFonts w:ascii="Segoe UI Emoji" w:hAnsi="Segoe UI Emoji" w:cs="Segoe UI Emoji"/>
+          <w:b/>
+          <w:bCs/>
+        </w:rPr>
+        <w:t>&lt;p&gt;This is my website.&lt;/p&gt;</w:t>
+      </w:r>
+    </w:p>
+    <w:p>
+      <w:pPr>
+        <w:spacing w:line="240" w:lineRule="auto"/>
         <w:rPr>
           <w:rFonts w:ascii="Segoe UI Emoji" w:hAnsi="Segoe UI Emoji" w:cs="Segoe UI Emoji"/>
           <w:b/>
@@ -168,6 +128,7 @@
     </w:p>
     <w:p>
       <w:pPr>
+        <w:spacing w:line="240" w:lineRule="auto"/>
         <w:rPr>
           <w:rFonts w:ascii="Segoe UI Emoji" w:hAnsi="Segoe UI Emoji" w:cs="Segoe UI Emoji"/>
           <w:b/>
@@ -187,6 +148,7 @@
     </w:p>
     <w:p>
       <w:pPr>
+        <w:spacing w:line="240" w:lineRule="auto"/>
         <w:rPr>
           <w:rFonts w:ascii="Segoe UI Emoji" w:hAnsi="Segoe UI Emoji" w:cs="Segoe UI Emoji"/>
           <w:b/>
@@ -204,6 +166,7 @@
     </w:p>
     <w:p>
       <w:pPr>
+        <w:spacing w:line="240" w:lineRule="auto"/>
         <w:rPr>
           <w:rFonts w:ascii="Segoe UI Emoji" w:hAnsi="Segoe UI Emoji" w:cs="Segoe UI Emoji"/>
           <w:b/>
@@ -224,12 +187,20 @@
           <w:b/>
           <w:bCs/>
         </w:rPr>
-        <w:br/>
+        <w:t xml:space="preserve"> </w:t>
+      </w:r>
+      <w:r>
+        <w:rPr>
+          <w:rFonts w:ascii="Segoe UI Emoji" w:hAnsi="Segoe UI Emoji" w:cs="Segoe UI Emoji"/>
+          <w:b/>
+          <w:bCs/>
+        </w:rPr>
         <w:t>HTML5 is the modern version of HTML. It introduced new semantic elements, multimedia support, improved forms, and browser APIs.</w:t>
       </w:r>
     </w:p>
     <w:p>
       <w:pPr>
+        <w:spacing w:line="240" w:lineRule="auto"/>
         <w:rPr>
           <w:rFonts w:ascii="Segoe UI Emoji" w:hAnsi="Segoe UI Emoji" w:cs="Segoe UI Emoji"/>
           <w:b/>
@@ -247,6 +218,7 @@
     </w:p>
     <w:p>
       <w:pPr>
+        <w:spacing w:line="240" w:lineRule="auto"/>
         <w:rPr>
           <w:rFonts w:ascii="Segoe UI Emoji" w:hAnsi="Segoe UI Emoji" w:cs="Segoe UI Emoji"/>
           <w:b/>
@@ -264,6 +236,7 @@
     </w:p>
     <w:p>
       <w:pPr>
+        <w:spacing w:line="240" w:lineRule="auto"/>
         <w:rPr>
           <w:rFonts w:ascii="Segoe UI Emoji" w:hAnsi="Segoe UI Emoji" w:cs="Segoe UI Emoji"/>
           <w:b/>
@@ -281,6 +254,7 @@
     </w:p>
     <w:p>
       <w:pPr>
+        <w:spacing w:line="240" w:lineRule="auto"/>
         <w:rPr>
           <w:rFonts w:ascii="Segoe UI Emoji" w:hAnsi="Segoe UI Emoji" w:cs="Segoe UI Emoji"/>
           <w:b/>
@@ -298,6 +272,7 @@
     </w:p>
     <w:p>
       <w:pPr>
+        <w:spacing w:line="240" w:lineRule="auto"/>
         <w:rPr>
           <w:rFonts w:ascii="Segoe UI Emoji" w:hAnsi="Segoe UI Emoji" w:cs="Segoe UI Emoji"/>
           <w:b/>
@@ -315,6 +290,7 @@
     </w:p>
     <w:p>
       <w:pPr>
+        <w:spacing w:line="240" w:lineRule="auto"/>
         <w:rPr>
           <w:rFonts w:ascii="Segoe UI Emoji" w:hAnsi="Segoe UI Emoji" w:cs="Segoe UI Emoji"/>
           <w:b/>
@@ -332,6 +308,7 @@
     </w:p>
     <w:p>
       <w:pPr>
+        <w:spacing w:line="240" w:lineRule="auto"/>
         <w:rPr>
           <w:rFonts w:ascii="Segoe UI Emoji" w:hAnsi="Segoe UI Emoji" w:cs="Segoe UI Emoji"/>
           <w:b/>
@@ -349,6 +326,7 @@
     </w:p>
     <w:p>
       <w:pPr>
+        <w:spacing w:line="240" w:lineRule="auto"/>
         <w:rPr>
           <w:rFonts w:ascii="Segoe UI Emoji" w:hAnsi="Segoe UI Emoji" w:cs="Segoe UI Emoji"/>
           <w:b/>
@@ -366,6 +344,7 @@
     </w:p>
     <w:p>
       <w:pPr>
+        <w:spacing w:line="240" w:lineRule="auto"/>
         <w:rPr>
           <w:rFonts w:ascii="Segoe UI Emoji" w:hAnsi="Segoe UI Emoji" w:cs="Segoe UI Emoji"/>
           <w:b/>
@@ -383,6 +362,7 @@
     </w:p>
     <w:p>
       <w:pPr>
+        <w:spacing w:line="240" w:lineRule="auto"/>
         <w:rPr>
           <w:rFonts w:ascii="Segoe UI Emoji" w:hAnsi="Segoe UI Emoji" w:cs="Segoe UI Emoji"/>
           <w:b/>
@@ -402,51 +382,25 @@
     </w:p>
     <w:p>
       <w:pPr>
-        <w:rPr>
-          <w:rFonts w:ascii="Segoe UI Emoji" w:hAnsi="Segoe UI Emoji" w:cs="Segoe UI Emoji"/>
-          <w:b/>
-          <w:bCs/>
-        </w:rPr>
-      </w:pPr>
-    </w:p>
-    <w:p>
-      <w:pPr>
-        <w:rPr>
-          <w:rFonts w:ascii="Segoe UI Emoji" w:hAnsi="Segoe UI Emoji" w:cs="Segoe UI Emoji"/>
-          <w:b/>
-          <w:bCs/>
-        </w:rPr>
-      </w:pPr>
-    </w:p>
-    <w:p>
-      <w:pPr>
-        <w:rPr>
-          <w:rFonts w:ascii="Segoe UI Emoji" w:hAnsi="Segoe UI Emoji" w:cs="Segoe UI Emoji"/>
-          <w:b/>
-          <w:bCs/>
-        </w:rPr>
-      </w:pPr>
-    </w:p>
-    <w:p>
-      <w:pPr>
-        <w:rPr>
-          <w:rFonts w:ascii="Segoe UI Emoji" w:hAnsi="Segoe UI Emoji" w:cs="Segoe UI Emoji"/>
-          <w:b/>
-          <w:bCs/>
-        </w:rPr>
-      </w:pPr>
-      <w:r>
-        <w:rPr>
-          <w:rFonts w:ascii="Segoe UI Emoji" w:hAnsi="Segoe UI Emoji" w:cs="Segoe UI Emoji"/>
-          <w:b/>
-          <w:bCs/>
-        </w:rPr>
-        <w:lastRenderedPageBreak/>
+        <w:spacing w:line="240" w:lineRule="auto"/>
+        <w:rPr>
+          <w:rFonts w:ascii="Segoe UI Emoji" w:hAnsi="Segoe UI Emoji" w:cs="Segoe UI Emoji"/>
+          <w:b/>
+          <w:bCs/>
+        </w:rPr>
+      </w:pPr>
+      <w:r>
+        <w:rPr>
+          <w:rFonts w:ascii="Segoe UI Emoji" w:hAnsi="Segoe UI Emoji" w:cs="Segoe UI Emoji"/>
+          <w:b/>
+          <w:bCs/>
+        </w:rPr>
         <w:t>3. What is Semantic HTML?</w:t>
       </w:r>
     </w:p>
     <w:p>
       <w:pPr>
+        <w:spacing w:line="240" w:lineRule="auto"/>
         <w:rPr>
           <w:rFonts w:ascii="Segoe UI Emoji" w:hAnsi="Segoe UI Emoji" w:cs="Segoe UI Emoji"/>
           <w:b/>
@@ -467,12 +421,50 @@
           <w:b/>
           <w:bCs/>
         </w:rPr>
-        <w:br/>
+        <w:t xml:space="preserve"> </w:t>
+      </w:r>
+      <w:r>
+        <w:rPr>
+          <w:rFonts w:ascii="Segoe UI Emoji" w:hAnsi="Segoe UI Emoji" w:cs="Segoe UI Emoji"/>
+          <w:b/>
+          <w:bCs/>
+        </w:rPr>
         <w:t>Semantic HTML means using HTML elements that clearly describe the meaning and purpose of the content.</w:t>
       </w:r>
     </w:p>
     <w:p>
       <w:pPr>
+        <w:spacing w:line="240" w:lineRule="auto"/>
+        <w:rPr>
+          <w:rFonts w:ascii="Segoe UI Emoji" w:hAnsi="Segoe UI Emoji" w:cs="Segoe UI Emoji"/>
+          <w:b/>
+          <w:bCs/>
+        </w:rPr>
+      </w:pPr>
+    </w:p>
+    <w:p>
+      <w:pPr>
+        <w:spacing w:line="240" w:lineRule="auto"/>
+        <w:rPr>
+          <w:rFonts w:ascii="Segoe UI Emoji" w:hAnsi="Segoe UI Emoji" w:cs="Segoe UI Emoji"/>
+          <w:b/>
+          <w:bCs/>
+        </w:rPr>
+      </w:pPr>
+    </w:p>
+    <w:p>
+      <w:pPr>
+        <w:spacing w:line="240" w:lineRule="auto"/>
+        <w:rPr>
+          <w:rFonts w:ascii="Segoe UI Emoji" w:hAnsi="Segoe UI Emoji" w:cs="Segoe UI Emoji"/>
+          <w:b/>
+          <w:bCs/>
+        </w:rPr>
+      </w:pPr>
+    </w:p>
+    <w:p>
+      <w:pPr>
+        <w:spacing w:line="240" w:lineRule="auto"/>
         <w:rPr>
           <w:rFonts w:ascii="Segoe UI Emoji" w:hAnsi="Segoe UI Emoji" w:cs="Segoe UI Emoji"/>
           <w:b/>
@@ -490,6 +482,7 @@
     </w:p>
     <w:p>
       <w:pPr>
+        <w:spacing w:line="240" w:lineRule="auto"/>
         <w:rPr>
           <w:rFonts w:ascii="Segoe UI Emoji" w:hAnsi="Segoe UI Emoji" w:cs="Segoe UI Emoji"/>
           <w:b/>
@@ -507,6 +500,7 @@
     </w:p>
     <w:p>
       <w:pPr>
+        <w:spacing w:line="240" w:lineRule="auto"/>
         <w:rPr>
           <w:rFonts w:ascii="Segoe UI Emoji" w:hAnsi="Segoe UI Emoji" w:cs="Segoe UI Emoji"/>
           <w:b/>
@@ -524,15 +518,17 @@
     </w:p>
     <w:p>
       <w:pPr>
-        <w:rPr>
-          <w:rFonts w:ascii="Segoe UI Emoji" w:hAnsi="Segoe UI Emoji" w:cs="Segoe UI Emoji"/>
-          <w:b/>
-          <w:bCs/>
-        </w:rPr>
-      </w:pPr>
-    </w:p>
-    <w:p>
-      <w:pPr>
+        <w:spacing w:line="240" w:lineRule="auto"/>
+        <w:rPr>
+          <w:rFonts w:ascii="Segoe UI Emoji" w:hAnsi="Segoe UI Emoji" w:cs="Segoe UI Emoji"/>
+          <w:b/>
+          <w:bCs/>
+        </w:rPr>
+      </w:pPr>
+    </w:p>
+    <w:p>
+      <w:pPr>
+        <w:spacing w:line="240" w:lineRule="auto"/>
         <w:rPr>
           <w:rFonts w:ascii="Segoe UI Emoji" w:hAnsi="Segoe UI Emoji" w:cs="Segoe UI Emoji"/>
           <w:b/>
@@ -550,6 +546,7 @@
     </w:p>
     <w:p>
       <w:pPr>
+        <w:spacing w:line="240" w:lineRule="auto"/>
         <w:rPr>
           <w:rFonts w:ascii="Segoe UI Emoji" w:hAnsi="Segoe UI Emoji" w:cs="Segoe UI Emoji"/>
           <w:b/>
@@ -567,6 +564,7 @@
     </w:p>
     <w:p>
       <w:pPr>
+        <w:spacing w:line="240" w:lineRule="auto"/>
         <w:rPr>
           <w:rFonts w:ascii="Segoe UI Emoji" w:hAnsi="Segoe UI Emoji" w:cs="Segoe UI Emoji"/>
           <w:b/>
@@ -584,6 +582,7 @@
     </w:p>
     <w:p>
       <w:pPr>
+        <w:spacing w:line="240" w:lineRule="auto"/>
         <w:rPr>
           <w:rFonts w:ascii="Segoe UI Emoji" w:hAnsi="Segoe UI Emoji" w:cs="Segoe UI Emoji"/>
           <w:b/>
@@ -601,6 +600,7 @@
     </w:p>
     <w:p>
       <w:pPr>
+        <w:spacing w:line="240" w:lineRule="auto"/>
         <w:rPr>
           <w:rFonts w:ascii="Segoe UI Emoji" w:hAnsi="Segoe UI Emoji" w:cs="Segoe UI Emoji"/>
           <w:b/>
@@ -618,6 +618,7 @@
     </w:p>
     <w:p>
       <w:pPr>
+        <w:spacing w:line="240" w:lineRule="auto"/>
         <w:rPr>
           <w:rFonts w:ascii="Segoe UI Emoji" w:hAnsi="Segoe UI Emoji" w:cs="Segoe UI Emoji"/>
           <w:b/>
@@ -635,15 +636,7 @@
     </w:p>
     <w:p>
       <w:pPr>
-        <w:rPr>
-          <w:rFonts w:ascii="Segoe UI Emoji" w:hAnsi="Segoe UI Emoji" w:cs="Segoe UI Emoji"/>
-          <w:b/>
-          <w:bCs/>
-        </w:rPr>
-      </w:pPr>
-    </w:p>
-    <w:p>
-      <w:pPr>
+        <w:spacing w:line="240" w:lineRule="auto"/>
         <w:rPr>
           <w:rFonts w:ascii="Segoe UI Emoji" w:hAnsi="Segoe UI Emoji" w:cs="Segoe UI Emoji"/>
           <w:b/>
@@ -661,6 +654,7 @@
     </w:p>
     <w:p>
       <w:pPr>
+        <w:spacing w:line="240" w:lineRule="auto"/>
         <w:rPr>
           <w:rFonts w:ascii="Segoe UI Emoji" w:hAnsi="Segoe UI Emoji" w:cs="Segoe UI Emoji"/>
           <w:b/>
@@ -682,6 +676,7 @@
           <w:ilvl w:val="0"/>
           <w:numId w:val="2"/>
         </w:numPr>
+        <w:spacing w:line="240" w:lineRule="auto"/>
         <w:rPr>
           <w:rFonts w:ascii="Segoe UI Emoji" w:hAnsi="Segoe UI Emoji" w:cs="Segoe UI Emoji"/>
           <w:b/>
@@ -703,6 +698,7 @@
           <w:ilvl w:val="0"/>
           <w:numId w:val="2"/>
         </w:numPr>
+        <w:spacing w:line="240" w:lineRule="auto"/>
         <w:rPr>
           <w:rFonts w:ascii="Segoe UI Emoji" w:hAnsi="Segoe UI Emoji" w:cs="Segoe UI Emoji"/>
           <w:b/>
@@ -724,6 +720,7 @@
           <w:ilvl w:val="0"/>
           <w:numId w:val="2"/>
         </w:numPr>
+        <w:spacing w:line="240" w:lineRule="auto"/>
         <w:rPr>
           <w:rFonts w:ascii="Segoe UI Emoji" w:hAnsi="Segoe UI Emoji" w:cs="Segoe UI Emoji"/>
           <w:b/>
@@ -741,6 +738,7 @@
     </w:p>
     <w:p>
       <w:pPr>
+        <w:spacing w:line="240" w:lineRule="auto"/>
         <w:rPr>
           <w:rFonts w:ascii="Segoe UI Emoji" w:hAnsi="Segoe UI Emoji" w:cs="Segoe UI Emoji"/>
           <w:b/>
@@ -760,91 +758,20 @@
     </w:p>
     <w:p>
       <w:pPr>
-        <w:rPr>
-          <w:rFonts w:ascii="Segoe UI Emoji" w:hAnsi="Segoe UI Emoji" w:cs="Segoe UI Emoji"/>
-          <w:b/>
-          <w:bCs/>
-        </w:rPr>
-      </w:pPr>
-    </w:p>
-    <w:p>
-      <w:pPr>
-        <w:rPr>
-          <w:rFonts w:ascii="Segoe UI Emoji" w:hAnsi="Segoe UI Emoji" w:cs="Segoe UI Emoji"/>
-          <w:b/>
-          <w:bCs/>
-        </w:rPr>
-      </w:pPr>
-    </w:p>
-    <w:p>
-      <w:pPr>
-        <w:rPr>
-          <w:rFonts w:ascii="Segoe UI Emoji" w:hAnsi="Segoe UI Emoji" w:cs="Segoe UI Emoji"/>
-          <w:b/>
-          <w:bCs/>
-        </w:rPr>
-      </w:pPr>
-    </w:p>
-    <w:p>
-      <w:pPr>
-        <w:rPr>
-          <w:rFonts w:ascii="Segoe UI Emoji" w:hAnsi="Segoe UI Emoji" w:cs="Segoe UI Emoji"/>
-          <w:b/>
-          <w:bCs/>
-        </w:rPr>
-      </w:pPr>
-    </w:p>
-    <w:p>
-      <w:pPr>
-        <w:rPr>
-          <w:rFonts w:ascii="Segoe UI Emoji" w:hAnsi="Segoe UI Emoji" w:cs="Segoe UI Emoji"/>
-          <w:b/>
-          <w:bCs/>
-        </w:rPr>
-      </w:pPr>
-    </w:p>
-    <w:p>
-      <w:pPr>
-        <w:rPr>
-          <w:rFonts w:ascii="Segoe UI Emoji" w:hAnsi="Segoe UI Emoji" w:cs="Segoe UI Emoji"/>
-          <w:b/>
-          <w:bCs/>
-        </w:rPr>
-      </w:pPr>
-    </w:p>
-    <w:p>
-      <w:pPr>
-        <w:rPr>
-          <w:rFonts w:ascii="Segoe UI Emoji" w:hAnsi="Segoe UI Emoji" w:cs="Segoe UI Emoji"/>
-          <w:b/>
-          <w:bCs/>
-        </w:rPr>
-      </w:pPr>
-      <w:r>
-        <w:rPr>
-          <w:rFonts w:ascii="Segoe UI Emoji" w:hAnsi="Segoe UI Emoji" w:cs="Segoe UI Emoji"/>
-          <w:b/>
-          <w:bCs/>
-        </w:rPr>
-        <w:lastRenderedPageBreak/>
+        <w:spacing w:line="240" w:lineRule="auto"/>
+        <w:rPr>
+          <w:rFonts w:ascii="Segoe UI Emoji" w:hAnsi="Segoe UI Emoji" w:cs="Segoe UI Emoji"/>
+          <w:b/>
+          <w:bCs/>
+        </w:rPr>
+      </w:pPr>
+      <w:r>
+        <w:rPr>
+          <w:rFonts w:ascii="Segoe UI Emoji" w:hAnsi="Segoe UI Emoji" w:cs="Segoe UI Emoji"/>
+          <w:b/>
+          <w:bCs/>
+        </w:rPr>
         <w:t>4. What is the difference between &lt;div&gt; and &lt;span&gt;?</w:t>
-      </w:r>
-    </w:p>
-    <w:p>
-      <w:pPr>
-        <w:rPr>
-          <w:rFonts w:ascii="Segoe UI Emoji" w:hAnsi="Segoe UI Emoji" w:cs="Segoe UI Emoji"/>
-          <w:b/>
-          <w:bCs/>
-        </w:rPr>
-      </w:pPr>
-      <w:r>
-        <w:rPr>
-          <w:rFonts w:ascii="Segoe UI Emoji" w:hAnsi="Segoe UI Emoji" w:cs="Segoe UI Emoji"/>
-          <w:b/>
-          <w:bCs/>
-        </w:rPr>
-        <w:t>Answer:</w:t>
       </w:r>
     </w:p>
     <w:tbl>
@@ -876,12 +803,29 @@
           </w:tcPr>
           <w:p>
             <w:pPr>
+              <w:spacing w:line="240" w:lineRule="auto"/>
               <w:rPr>
                 <w:rFonts w:ascii="Segoe UI Emoji" w:hAnsi="Segoe UI Emoji" w:cs="Segoe UI Emoji"/>
                 <w:b/>
                 <w:bCs/>
               </w:rPr>
             </w:pPr>
+            <w:r>
+              <w:rPr>
+                <w:rFonts w:ascii="Segoe UI Emoji" w:hAnsi="Segoe UI Emoji" w:cs="Segoe UI Emoji"/>
+                <w:b/>
+                <w:bCs/>
+              </w:rPr>
+              <w:t>Answer:</w:t>
+            </w:r>
+            <w:r>
+              <w:rPr>
+                <w:rFonts w:ascii="Segoe UI Emoji" w:hAnsi="Segoe UI Emoji" w:cs="Segoe UI Emoji"/>
+                <w:b/>
+                <w:bCs/>
+              </w:rPr>
+              <w:t xml:space="preserve"> </w:t>
+            </w:r>
             <w:r>
               <w:rPr>
                 <w:rFonts w:ascii="Segoe UI Emoji" w:hAnsi="Segoe UI Emoji" w:cs="Segoe UI Emoji"/>
@@ -900,6 +844,7 @@
           </w:tcPr>
           <w:p>
             <w:pPr>
+              <w:spacing w:line="240" w:lineRule="auto"/>
               <w:rPr>
                 <w:rFonts w:ascii="Segoe UI Emoji" w:hAnsi="Segoe UI Emoji" w:cs="Segoe UI Emoji"/>
                 <w:b/>
@@ -929,6 +874,7 @@
           </w:tcPr>
           <w:p>
             <w:pPr>
+              <w:spacing w:line="240" w:lineRule="auto"/>
               <w:rPr>
                 <w:rFonts w:ascii="Segoe UI Emoji" w:hAnsi="Segoe UI Emoji" w:cs="Segoe UI Emoji"/>
                 <w:b/>
@@ -953,6 +899,7 @@
           </w:tcPr>
           <w:p>
             <w:pPr>
+              <w:spacing w:line="240" w:lineRule="auto"/>
               <w:rPr>
                 <w:rFonts w:ascii="Segoe UI Emoji" w:hAnsi="Segoe UI Emoji" w:cs="Segoe UI Emoji"/>
                 <w:b/>
@@ -982,6 +929,7 @@
           </w:tcPr>
           <w:p>
             <w:pPr>
+              <w:spacing w:line="240" w:lineRule="auto"/>
               <w:rPr>
                 <w:rFonts w:ascii="Segoe UI Emoji" w:hAnsi="Segoe UI Emoji" w:cs="Segoe UI Emoji"/>
                 <w:b/>
@@ -1006,6 +954,7 @@
           </w:tcPr>
           <w:p>
             <w:pPr>
+              <w:spacing w:line="240" w:lineRule="auto"/>
               <w:rPr>
                 <w:rFonts w:ascii="Segoe UI Emoji" w:hAnsi="Segoe UI Emoji" w:cs="Segoe UI Emoji"/>
                 <w:b/>
@@ -1035,6 +984,7 @@
           </w:tcPr>
           <w:p>
             <w:pPr>
+              <w:spacing w:line="240" w:lineRule="auto"/>
               <w:rPr>
                 <w:rFonts w:ascii="Segoe UI Emoji" w:hAnsi="Segoe UI Emoji" w:cs="Segoe UI Emoji"/>
                 <w:b/>
@@ -1059,6 +1009,7 @@
           </w:tcPr>
           <w:p>
             <w:pPr>
+              <w:spacing w:line="240" w:lineRule="auto"/>
               <w:rPr>
                 <w:rFonts w:ascii="Segoe UI Emoji" w:hAnsi="Segoe UI Emoji" w:cs="Segoe UI Emoji"/>
                 <w:b/>
@@ -1079,6 +1030,7 @@
     </w:tbl>
     <w:p>
       <w:pPr>
+        <w:spacing w:line="240" w:lineRule="auto"/>
         <w:rPr>
           <w:rFonts w:ascii="Segoe UI Emoji" w:hAnsi="Segoe UI Emoji" w:cs="Segoe UI Emoji"/>
           <w:b/>
@@ -1096,6 +1048,7 @@
     </w:p>
     <w:p>
       <w:pPr>
+        <w:spacing w:line="240" w:lineRule="auto"/>
         <w:rPr>
           <w:rFonts w:ascii="Segoe UI Emoji" w:hAnsi="Segoe UI Emoji" w:cs="Segoe UI Emoji"/>
           <w:b/>
@@ -1113,15 +1066,7 @@
     </w:p>
     <w:p>
       <w:pPr>
-        <w:rPr>
-          <w:rFonts w:ascii="Segoe UI Emoji" w:hAnsi="Segoe UI Emoji" w:cs="Segoe UI Emoji"/>
-          <w:b/>
-          <w:bCs/>
-        </w:rPr>
-      </w:pPr>
-    </w:p>
-    <w:p>
-      <w:pPr>
+        <w:spacing w:line="240" w:lineRule="auto"/>
         <w:rPr>
           <w:rFonts w:ascii="Segoe UI Emoji" w:hAnsi="Segoe UI Emoji" w:cs="Segoe UI Emoji"/>
           <w:b/>
@@ -1139,6 +1084,7 @@
     </w:p>
     <w:p>
       <w:pPr>
+        <w:spacing w:line="240" w:lineRule="auto"/>
         <w:rPr>
           <w:rFonts w:ascii="Segoe UI Emoji" w:hAnsi="Segoe UI Emoji" w:cs="Segoe UI Emoji"/>
           <w:b/>
@@ -1158,6 +1104,7 @@
     </w:p>
     <w:p>
       <w:pPr>
+        <w:spacing w:line="240" w:lineRule="auto"/>
         <w:rPr>
           <w:rFonts w:ascii="Segoe UI Emoji" w:hAnsi="Segoe UI Emoji" w:cs="Segoe UI Emoji"/>
           <w:b/>
@@ -1175,6 +1122,7 @@
     </w:p>
     <w:p>
       <w:pPr>
+        <w:spacing w:line="240" w:lineRule="auto"/>
         <w:rPr>
           <w:rFonts w:ascii="Segoe UI Emoji" w:hAnsi="Segoe UI Emoji" w:cs="Segoe UI Emoji"/>
           <w:b/>
@@ -1201,23 +1149,56 @@
     </w:p>
     <w:p>
       <w:pPr>
-        <w:rPr>
-          <w:rFonts w:ascii="Segoe UI Emoji" w:hAnsi="Segoe UI Emoji" w:cs="Segoe UI Emoji"/>
-          <w:b/>
-          <w:bCs/>
-        </w:rPr>
-      </w:pPr>
-      <w:r>
-        <w:rPr>
-          <w:rFonts w:ascii="Segoe UI Emoji" w:hAnsi="Segoe UI Emoji" w:cs="Segoe UI Emoji"/>
-          <w:b/>
-          <w:bCs/>
-        </w:rPr>
+        <w:spacing w:line="240" w:lineRule="auto"/>
+        <w:rPr>
+          <w:rFonts w:ascii="Segoe UI Emoji" w:hAnsi="Segoe UI Emoji" w:cs="Segoe UI Emoji"/>
+          <w:b/>
+          <w:bCs/>
+        </w:rPr>
+      </w:pPr>
+    </w:p>
+    <w:p>
+      <w:pPr>
+        <w:spacing w:line="240" w:lineRule="auto"/>
+        <w:rPr>
+          <w:rFonts w:ascii="Segoe UI Emoji" w:hAnsi="Segoe UI Emoji" w:cs="Segoe UI Emoji"/>
+          <w:b/>
+          <w:bCs/>
+        </w:rPr>
+      </w:pPr>
+    </w:p>
+    <w:p>
+      <w:pPr>
+        <w:spacing w:line="240" w:lineRule="auto"/>
+        <w:rPr>
+          <w:rFonts w:ascii="Segoe UI Emoji" w:hAnsi="Segoe UI Emoji" w:cs="Segoe UI Emoji"/>
+          <w:b/>
+          <w:bCs/>
+        </w:rPr>
+      </w:pPr>
+    </w:p>
+    <w:p>
+      <w:pPr>
+        <w:spacing w:line="240" w:lineRule="auto"/>
+        <w:rPr>
+          <w:rFonts w:ascii="Segoe UI Emoji" w:hAnsi="Segoe UI Emoji" w:cs="Segoe UI Emoji"/>
+          <w:b/>
+          <w:bCs/>
+        </w:rPr>
+      </w:pPr>
+      <w:r>
+        <w:rPr>
+          <w:rFonts w:ascii="Segoe UI Emoji" w:hAnsi="Segoe UI Emoji" w:cs="Segoe UI Emoji"/>
+          <w:b/>
+          <w:bCs/>
+        </w:rPr>
+        <w:lastRenderedPageBreak/>
         <w:t>Example:</w:t>
       </w:r>
     </w:p>
     <w:p>
       <w:pPr>
+        <w:spacing w:line="240" w:lineRule="auto"/>
         <w:rPr>
           <w:rFonts w:ascii="Segoe UI Emoji" w:hAnsi="Segoe UI Emoji" w:cs="Segoe UI Emoji"/>
           <w:b/>
@@ -1235,15 +1216,17 @@
     </w:p>
     <w:p>
       <w:pPr>
-        <w:rPr>
-          <w:rFonts w:ascii="Segoe UI Emoji" w:hAnsi="Segoe UI Emoji" w:cs="Segoe UI Emoji"/>
-          <w:b/>
-          <w:bCs/>
-        </w:rPr>
-      </w:pPr>
-    </w:p>
-    <w:p>
-      <w:pPr>
+        <w:spacing w:line="240" w:lineRule="auto"/>
+        <w:rPr>
+          <w:rFonts w:ascii="Segoe UI Emoji" w:hAnsi="Segoe UI Emoji" w:cs="Segoe UI Emoji"/>
+          <w:b/>
+          <w:bCs/>
+        </w:rPr>
+      </w:pPr>
+    </w:p>
+    <w:p>
+      <w:pPr>
+        <w:spacing w:line="240" w:lineRule="auto"/>
         <w:rPr>
           <w:rFonts w:ascii="Segoe UI Emoji" w:hAnsi="Segoe UI Emoji" w:cs="Segoe UI Emoji"/>
           <w:b/>
@@ -1261,6 +1244,7 @@
     </w:p>
     <w:p>
       <w:pPr>
+        <w:spacing w:line="240" w:lineRule="auto"/>
         <w:rPr>
           <w:rFonts w:ascii="Segoe UI Emoji" w:hAnsi="Segoe UI Emoji" w:cs="Segoe UI Emoji"/>
           <w:b/>
@@ -1278,6 +1262,7 @@
     </w:p>
     <w:p>
       <w:pPr>
+        <w:spacing w:line="240" w:lineRule="auto"/>
         <w:rPr>
           <w:rFonts w:ascii="Segoe UI Emoji" w:hAnsi="Segoe UI Emoji" w:cs="Segoe UI Emoji"/>
           <w:b/>
@@ -1295,6 +1280,7 @@
     </w:p>
     <w:p>
       <w:pPr>
+        <w:spacing w:line="240" w:lineRule="auto"/>
         <w:rPr>
           <w:rFonts w:ascii="Segoe UI Emoji" w:hAnsi="Segoe UI Emoji" w:cs="Segoe UI Emoji"/>
           <w:b/>
@@ -1312,41 +1298,25 @@
     </w:p>
     <w:p>
       <w:pPr>
-        <w:rPr>
-          <w:rFonts w:ascii="Segoe UI Emoji" w:hAnsi="Segoe UI Emoji" w:cs="Segoe UI Emoji"/>
-          <w:b/>
-          <w:bCs/>
-        </w:rPr>
-      </w:pPr>
-      <w:r>
-        <w:rPr>
-          <w:rFonts w:ascii="Segoe UI Emoji" w:hAnsi="Segoe UI Emoji" w:cs="Segoe UI Emoji"/>
-          <w:b/>
-          <w:bCs/>
-        </w:rPr>
-        <w:t xml:space="preserve">    </w:t>
-      </w:r>
-      <w:proofErr w:type="spellStart"/>
-      <w:r>
-        <w:rPr>
-          <w:rFonts w:ascii="Segoe UI Emoji" w:hAnsi="Segoe UI Emoji" w:cs="Segoe UI Emoji"/>
-          <w:b/>
-          <w:bCs/>
-        </w:rPr>
-        <w:t>color</w:t>
-      </w:r>
-      <w:proofErr w:type="spellEnd"/>
-      <w:r>
-        <w:rPr>
-          <w:rFonts w:ascii="Segoe UI Emoji" w:hAnsi="Segoe UI Emoji" w:cs="Segoe UI Emoji"/>
-          <w:b/>
-          <w:bCs/>
-        </w:rPr>
-        <w:t>: red;</w:t>
-      </w:r>
-    </w:p>
-    <w:p>
-      <w:pPr>
+        <w:spacing w:line="240" w:lineRule="auto"/>
+        <w:rPr>
+          <w:rFonts w:ascii="Segoe UI Emoji" w:hAnsi="Segoe UI Emoji" w:cs="Segoe UI Emoji"/>
+          <w:b/>
+          <w:bCs/>
+        </w:rPr>
+      </w:pPr>
+      <w:r>
+        <w:rPr>
+          <w:rFonts w:ascii="Segoe UI Emoji" w:hAnsi="Segoe UI Emoji" w:cs="Segoe UI Emoji"/>
+          <w:b/>
+          <w:bCs/>
+        </w:rPr>
+        <w:t xml:space="preserve">    color: red;</w:t>
+      </w:r>
+    </w:p>
+    <w:p>
+      <w:pPr>
+        <w:spacing w:line="240" w:lineRule="auto"/>
         <w:rPr>
           <w:rFonts w:ascii="Segoe UI Emoji" w:hAnsi="Segoe UI Emoji" w:cs="Segoe UI Emoji"/>
           <w:b/>
@@ -1364,15 +1334,7 @@
     </w:p>
     <w:p>
       <w:pPr>
-        <w:rPr>
-          <w:rFonts w:ascii="Segoe UI Emoji" w:hAnsi="Segoe UI Emoji" w:cs="Segoe UI Emoji"/>
-          <w:b/>
-          <w:bCs/>
-        </w:rPr>
-      </w:pPr>
-    </w:p>
-    <w:p>
-      <w:pPr>
+        <w:spacing w:line="240" w:lineRule="auto"/>
         <w:rPr>
           <w:rFonts w:ascii="Segoe UI Emoji" w:hAnsi="Segoe UI Emoji" w:cs="Segoe UI Emoji"/>
           <w:b/>
@@ -1390,42 +1352,25 @@
     </w:p>
     <w:p>
       <w:pPr>
-        <w:rPr>
-          <w:rFonts w:ascii="Segoe UI Emoji" w:hAnsi="Segoe UI Emoji" w:cs="Segoe UI Emoji"/>
-          <w:b/>
-          <w:bCs/>
-        </w:rPr>
-      </w:pPr>
-      <w:r>
-        <w:rPr>
-          <w:rFonts w:ascii="Segoe UI Emoji" w:hAnsi="Segoe UI Emoji" w:cs="Segoe UI Emoji"/>
-          <w:b/>
-          <w:bCs/>
-        </w:rPr>
-        <w:lastRenderedPageBreak/>
-        <w:t xml:space="preserve">    </w:t>
-      </w:r>
-      <w:proofErr w:type="spellStart"/>
-      <w:r>
-        <w:rPr>
-          <w:rFonts w:ascii="Segoe UI Emoji" w:hAnsi="Segoe UI Emoji" w:cs="Segoe UI Emoji"/>
-          <w:b/>
-          <w:bCs/>
-        </w:rPr>
-        <w:t>color</w:t>
-      </w:r>
-      <w:proofErr w:type="spellEnd"/>
-      <w:r>
-        <w:rPr>
-          <w:rFonts w:ascii="Segoe UI Emoji" w:hAnsi="Segoe UI Emoji" w:cs="Segoe UI Emoji"/>
-          <w:b/>
-          <w:bCs/>
-        </w:rPr>
-        <w:t>: blue;</w:t>
-      </w:r>
-    </w:p>
-    <w:p>
-      <w:pPr>
+        <w:spacing w:line="240" w:lineRule="auto"/>
+        <w:rPr>
+          <w:rFonts w:ascii="Segoe UI Emoji" w:hAnsi="Segoe UI Emoji" w:cs="Segoe UI Emoji"/>
+          <w:b/>
+          <w:bCs/>
+        </w:rPr>
+      </w:pPr>
+      <w:r>
+        <w:rPr>
+          <w:rFonts w:ascii="Segoe UI Emoji" w:hAnsi="Segoe UI Emoji" w:cs="Segoe UI Emoji"/>
+          <w:b/>
+          <w:bCs/>
+        </w:rPr>
+        <w:t xml:space="preserve">    color: blue;</w:t>
+      </w:r>
+    </w:p>
+    <w:p>
+      <w:pPr>
+        <w:spacing w:line="240" w:lineRule="auto"/>
         <w:rPr>
           <w:rFonts w:ascii="Segoe UI Emoji" w:hAnsi="Segoe UI Emoji" w:cs="Segoe UI Emoji"/>
           <w:b/>
@@ -1443,6 +1388,7 @@
     </w:p>
     <w:p>
       <w:pPr>
+        <w:spacing w:line="240" w:lineRule="auto"/>
         <w:rPr>
           <w:rFonts w:ascii="Segoe UI Emoji" w:hAnsi="Segoe UI Emoji" w:cs="Segoe UI Emoji"/>
           <w:b/>
@@ -1460,6 +1406,7 @@
     </w:p>
     <w:p>
       <w:pPr>
+        <w:spacing w:line="240" w:lineRule="auto"/>
         <w:rPr>
           <w:rFonts w:ascii="Segoe UI Emoji" w:hAnsi="Segoe UI Emoji" w:cs="Segoe UI Emoji"/>
           <w:b/>
@@ -1479,41 +1426,25 @@
     </w:p>
     <w:p>
       <w:pPr>
-        <w:rPr>
-          <w:rFonts w:ascii="Segoe UI Emoji" w:hAnsi="Segoe UI Emoji" w:cs="Segoe UI Emoji"/>
-          <w:b/>
-          <w:bCs/>
-        </w:rPr>
-      </w:pPr>
-      <w:r>
-        <w:rPr>
-          <w:rFonts w:ascii="Segoe UI Emoji" w:hAnsi="Segoe UI Emoji" w:cs="Segoe UI Emoji"/>
-          <w:b/>
-          <w:bCs/>
-        </w:rPr>
-        <w:t xml:space="preserve">6. What </w:t>
-      </w:r>
-      <w:proofErr w:type="gramStart"/>
-      <w:r>
-        <w:rPr>
-          <w:rFonts w:ascii="Segoe UI Emoji" w:hAnsi="Segoe UI Emoji" w:cs="Segoe UI Emoji"/>
-          <w:b/>
-          <w:bCs/>
-        </w:rPr>
-        <w:t>are</w:t>
-      </w:r>
-      <w:proofErr w:type="gramEnd"/>
-      <w:r>
-        <w:rPr>
-          <w:rFonts w:ascii="Segoe UI Emoji" w:hAnsi="Segoe UI Emoji" w:cs="Segoe UI Emoji"/>
-          <w:b/>
-          <w:bCs/>
-        </w:rPr>
-        <w:t xml:space="preserve"> Block-level and Inline elements?</w:t>
-      </w:r>
-    </w:p>
-    <w:p>
-      <w:pPr>
+        <w:spacing w:line="240" w:lineRule="auto"/>
+        <w:rPr>
+          <w:rFonts w:ascii="Segoe UI Emoji" w:hAnsi="Segoe UI Emoji" w:cs="Segoe UI Emoji"/>
+          <w:b/>
+          <w:bCs/>
+        </w:rPr>
+      </w:pPr>
+      <w:r>
+        <w:rPr>
+          <w:rFonts w:ascii="Segoe UI Emoji" w:hAnsi="Segoe UI Emoji" w:cs="Segoe UI Emoji"/>
+          <w:b/>
+          <w:bCs/>
+        </w:rPr>
+        <w:t>6. What are Block-level and Inline elements?</w:t>
+      </w:r>
+    </w:p>
+    <w:p>
+      <w:pPr>
+        <w:spacing w:line="240" w:lineRule="auto"/>
         <w:rPr>
           <w:rFonts w:ascii="Segoe UI Emoji" w:hAnsi="Segoe UI Emoji" w:cs="Segoe UI Emoji"/>
           <w:b/>
@@ -1528,15 +1459,14 @@
         </w:rPr>
         <w:t>Answer:</w:t>
       </w:r>
-    </w:p>
-    <w:p>
-      <w:pPr>
-        <w:rPr>
-          <w:rFonts w:ascii="Segoe UI Emoji" w:hAnsi="Segoe UI Emoji" w:cs="Segoe UI Emoji"/>
-          <w:b/>
-          <w:bCs/>
-        </w:rPr>
-      </w:pPr>
+      <w:r>
+        <w:rPr>
+          <w:rFonts w:ascii="Segoe UI Emoji" w:hAnsi="Segoe UI Emoji" w:cs="Segoe UI Emoji"/>
+          <w:b/>
+          <w:bCs/>
+        </w:rPr>
+        <w:t xml:space="preserve"> </w:t>
+      </w:r>
       <w:r>
         <w:rPr>
           <w:rFonts w:ascii="Segoe UI Emoji" w:hAnsi="Segoe UI Emoji" w:cs="Segoe UI Emoji"/>
@@ -1548,6 +1478,7 @@
     </w:p>
     <w:p>
       <w:pPr>
+        <w:spacing w:line="240" w:lineRule="auto"/>
         <w:rPr>
           <w:rFonts w:ascii="Segoe UI Emoji" w:hAnsi="Segoe UI Emoji" w:cs="Segoe UI Emoji"/>
           <w:b/>
@@ -1565,6 +1496,7 @@
     </w:p>
     <w:p>
       <w:pPr>
+        <w:spacing w:line="240" w:lineRule="auto"/>
         <w:rPr>
           <w:rFonts w:ascii="Segoe UI Emoji" w:hAnsi="Segoe UI Emoji" w:cs="Segoe UI Emoji"/>
           <w:b/>
@@ -1582,6 +1514,7 @@
     </w:p>
     <w:p>
       <w:pPr>
+        <w:spacing w:line="240" w:lineRule="auto"/>
         <w:rPr>
           <w:rFonts w:ascii="Segoe UI Emoji" w:hAnsi="Segoe UI Emoji" w:cs="Segoe UI Emoji"/>
           <w:b/>
@@ -1599,6 +1532,7 @@
     </w:p>
     <w:p>
       <w:pPr>
+        <w:spacing w:line="240" w:lineRule="auto"/>
         <w:rPr>
           <w:rFonts w:ascii="Segoe UI Emoji" w:hAnsi="Segoe UI Emoji" w:cs="Segoe UI Emoji"/>
           <w:b/>
@@ -1616,6 +1550,7 @@
     </w:p>
     <w:p>
       <w:pPr>
+        <w:spacing w:line="240" w:lineRule="auto"/>
         <w:rPr>
           <w:rFonts w:ascii="Segoe UI Emoji" w:hAnsi="Segoe UI Emoji" w:cs="Segoe UI Emoji"/>
           <w:b/>
@@ -1633,6 +1568,7 @@
     </w:p>
     <w:p>
       <w:pPr>
+        <w:spacing w:line="240" w:lineRule="auto"/>
         <w:rPr>
           <w:rFonts w:ascii="Segoe UI Emoji" w:hAnsi="Segoe UI Emoji" w:cs="Segoe UI Emoji"/>
           <w:b/>
@@ -1650,6 +1586,7 @@
     </w:p>
     <w:p>
       <w:pPr>
+        <w:spacing w:line="240" w:lineRule="auto"/>
         <w:rPr>
           <w:rFonts w:ascii="Segoe UI Emoji" w:hAnsi="Segoe UI Emoji" w:cs="Segoe UI Emoji"/>
           <w:b/>
@@ -1667,6 +1604,7 @@
     </w:p>
     <w:p>
       <w:pPr>
+        <w:spacing w:line="240" w:lineRule="auto"/>
         <w:rPr>
           <w:rFonts w:ascii="Segoe UI Emoji" w:hAnsi="Segoe UI Emoji" w:cs="Segoe UI Emoji"/>
           <w:b/>
@@ -1684,6 +1622,7 @@
     </w:p>
     <w:p>
       <w:pPr>
+        <w:spacing w:line="240" w:lineRule="auto"/>
         <w:rPr>
           <w:rFonts w:ascii="Segoe UI Emoji" w:hAnsi="Segoe UI Emoji" w:cs="Segoe UI Emoji"/>
           <w:b/>
@@ -1701,6 +1640,7 @@
     </w:p>
     <w:p>
       <w:pPr>
+        <w:spacing w:line="240" w:lineRule="auto"/>
         <w:rPr>
           <w:rFonts w:ascii="Segoe UI Emoji" w:hAnsi="Segoe UI Emoji" w:cs="Segoe UI Emoji"/>
           <w:b/>
@@ -1718,6 +1658,7 @@
     </w:p>
     <w:p>
       <w:pPr>
+        <w:spacing w:line="240" w:lineRule="auto"/>
         <w:rPr>
           <w:rFonts w:ascii="Segoe UI Emoji" w:hAnsi="Segoe UI Emoji" w:cs="Segoe UI Emoji"/>
           <w:b/>
@@ -1735,6 +1676,7 @@
     </w:p>
     <w:p>
       <w:pPr>
+        <w:spacing w:line="240" w:lineRule="auto"/>
         <w:rPr>
           <w:rFonts w:ascii="Segoe UI Emoji" w:hAnsi="Segoe UI Emoji" w:cs="Segoe UI Emoji"/>
           <w:b/>
@@ -1752,77 +1694,44 @@
     </w:p>
     <w:p>
       <w:pPr>
-        <w:rPr>
-          <w:rFonts w:ascii="Segoe UI Emoji" w:hAnsi="Segoe UI Emoji" w:cs="Segoe UI Emoji"/>
-          <w:b/>
-          <w:bCs/>
-        </w:rPr>
-      </w:pPr>
-      <w:r>
-        <w:rPr>
-          <w:rFonts w:ascii="Segoe UI Emoji" w:hAnsi="Segoe UI Emoji" w:cs="Segoe UI Emoji"/>
-          <w:b/>
-          <w:bCs/>
-        </w:rPr>
-        <w:t>&lt;</w:t>
-      </w:r>
-      <w:proofErr w:type="spellStart"/>
-      <w:r>
-        <w:rPr>
-          <w:rFonts w:ascii="Segoe UI Emoji" w:hAnsi="Segoe UI Emoji" w:cs="Segoe UI Emoji"/>
-          <w:b/>
-          <w:bCs/>
-        </w:rPr>
-        <w:t>em</w:t>
-      </w:r>
-      <w:proofErr w:type="spellEnd"/>
-      <w:r>
-        <w:rPr>
-          <w:rFonts w:ascii="Segoe UI Emoji" w:hAnsi="Segoe UI Emoji" w:cs="Segoe UI Emoji"/>
-          <w:b/>
-          <w:bCs/>
-        </w:rPr>
-        <w:t>&gt;</w:t>
-      </w:r>
-    </w:p>
-    <w:p>
-      <w:pPr>
-        <w:rPr>
-          <w:rFonts w:ascii="Segoe UI Emoji" w:hAnsi="Segoe UI Emoji" w:cs="Segoe UI Emoji"/>
-          <w:b/>
-          <w:bCs/>
-        </w:rPr>
-      </w:pPr>
-      <w:r>
-        <w:rPr>
-          <w:rFonts w:ascii="Segoe UI Emoji" w:hAnsi="Segoe UI Emoji" w:cs="Segoe UI Emoji"/>
-          <w:b/>
-          <w:bCs/>
-        </w:rPr>
-        <w:pict w14:anchorId="09C4744B">
-          <v:rect id="_x0000_i1030" style="width:0;height:1.5pt" o:hralign="center" o:hrstd="t" o:hr="t" fillcolor="#a0a0a0" stroked="f"/>
-        </w:pict>
-      </w:r>
-    </w:p>
-    <w:p>
-      <w:pPr>
-        <w:rPr>
-          <w:rFonts w:ascii="Segoe UI Emoji" w:hAnsi="Segoe UI Emoji" w:cs="Segoe UI Emoji"/>
-          <w:b/>
-          <w:bCs/>
-        </w:rPr>
-      </w:pPr>
-      <w:r>
-        <w:rPr>
-          <w:rFonts w:ascii="Segoe UI Emoji" w:hAnsi="Segoe UI Emoji" w:cs="Segoe UI Emoji"/>
-          <w:b/>
-          <w:bCs/>
-        </w:rPr>
+        <w:spacing w:line="240" w:lineRule="auto"/>
+        <w:rPr>
+          <w:rFonts w:ascii="Segoe UI Emoji" w:hAnsi="Segoe UI Emoji" w:cs="Segoe UI Emoji"/>
+          <w:b/>
+          <w:bCs/>
+        </w:rPr>
+      </w:pPr>
+      <w:r>
+        <w:rPr>
+          <w:rFonts w:ascii="Segoe UI Emoji" w:hAnsi="Segoe UI Emoji" w:cs="Segoe UI Emoji"/>
+          <w:b/>
+          <w:bCs/>
+        </w:rPr>
+        <w:t>&lt;em&gt;</w:t>
+      </w:r>
+    </w:p>
+    <w:p>
+      <w:pPr>
+        <w:spacing w:line="240" w:lineRule="auto"/>
+        <w:rPr>
+          <w:rFonts w:ascii="Segoe UI Emoji" w:hAnsi="Segoe UI Emoji" w:cs="Segoe UI Emoji"/>
+          <w:b/>
+          <w:bCs/>
+        </w:rPr>
+      </w:pPr>
+      <w:r>
+        <w:rPr>
+          <w:rFonts w:ascii="Segoe UI Emoji" w:hAnsi="Segoe UI Emoji" w:cs="Segoe UI Emoji"/>
+          <w:b/>
+          <w:bCs/>
+        </w:rPr>
+        <w:lastRenderedPageBreak/>
         <w:t>7. What is &lt;!DOCTYPE html&gt;?</w:t>
       </w:r>
     </w:p>
     <w:p>
       <w:pPr>
+        <w:spacing w:line="240" w:lineRule="auto"/>
         <w:rPr>
           <w:rFonts w:ascii="Segoe UI Emoji" w:hAnsi="Segoe UI Emoji" w:cs="Segoe UI Emoji"/>
           <w:b/>
@@ -1843,12 +1752,20 @@
           <w:b/>
           <w:bCs/>
         </w:rPr>
-        <w:br/>
+        <w:t xml:space="preserve"> </w:t>
+      </w:r>
+      <w:r>
+        <w:rPr>
+          <w:rFonts w:ascii="Segoe UI Emoji" w:hAnsi="Segoe UI Emoji" w:cs="Segoe UI Emoji"/>
+          <w:b/>
+          <w:bCs/>
+        </w:rPr>
         <w:t>&lt;!DOCTYPE html&gt; tells the browser that the document uses the HTML5 standard.</w:t>
       </w:r>
     </w:p>
     <w:p>
       <w:pPr>
+        <w:spacing w:line="240" w:lineRule="auto"/>
         <w:rPr>
           <w:rFonts w:ascii="Segoe UI Emoji" w:hAnsi="Segoe UI Emoji" w:cs="Segoe UI Emoji"/>
           <w:b/>
@@ -1866,6 +1783,7 @@
     </w:p>
     <w:p>
       <w:pPr>
+        <w:spacing w:line="240" w:lineRule="auto"/>
         <w:rPr>
           <w:rFonts w:ascii="Segoe UI Emoji" w:hAnsi="Segoe UI Emoji" w:cs="Segoe UI Emoji"/>
           <w:b/>
@@ -1883,6 +1801,7 @@
     </w:p>
     <w:p>
       <w:pPr>
+        <w:spacing w:line="240" w:lineRule="auto"/>
         <w:rPr>
           <w:rFonts w:ascii="Segoe UI Emoji" w:hAnsi="Segoe UI Emoji" w:cs="Segoe UI Emoji"/>
           <w:b/>
@@ -1900,24 +1819,25 @@
     </w:p>
     <w:p>
       <w:pPr>
-        <w:rPr>
-          <w:rFonts w:ascii="Segoe UI Emoji" w:hAnsi="Segoe UI Emoji" w:cs="Segoe UI Emoji"/>
-          <w:b/>
-          <w:bCs/>
-        </w:rPr>
-      </w:pPr>
-      <w:r>
-        <w:rPr>
-          <w:rFonts w:ascii="Segoe UI Emoji" w:hAnsi="Segoe UI Emoji" w:cs="Segoe UI Emoji"/>
-          <w:b/>
-          <w:bCs/>
-        </w:rPr>
-        <w:lastRenderedPageBreak/>
+        <w:spacing w:line="240" w:lineRule="auto"/>
+        <w:rPr>
+          <w:rFonts w:ascii="Segoe UI Emoji" w:hAnsi="Segoe UI Emoji" w:cs="Segoe UI Emoji"/>
+          <w:b/>
+          <w:bCs/>
+        </w:rPr>
+      </w:pPr>
+      <w:r>
+        <w:rPr>
+          <w:rFonts w:ascii="Segoe UI Emoji" w:hAnsi="Segoe UI Emoji" w:cs="Segoe UI Emoji"/>
+          <w:b/>
+          <w:bCs/>
+        </w:rPr>
         <w:t>&lt;head&gt;</w:t>
       </w:r>
     </w:p>
     <w:p>
       <w:pPr>
+        <w:spacing w:line="240" w:lineRule="auto"/>
         <w:rPr>
           <w:rFonts w:ascii="Segoe UI Emoji" w:hAnsi="Segoe UI Emoji" w:cs="Segoe UI Emoji"/>
           <w:b/>
@@ -1935,6 +1855,7 @@
     </w:p>
     <w:p>
       <w:pPr>
+        <w:spacing w:line="240" w:lineRule="auto"/>
         <w:rPr>
           <w:rFonts w:ascii="Segoe UI Emoji" w:hAnsi="Segoe UI Emoji" w:cs="Segoe UI Emoji"/>
           <w:b/>
@@ -1952,6 +1873,7 @@
     </w:p>
     <w:p>
       <w:pPr>
+        <w:spacing w:line="240" w:lineRule="auto"/>
         <w:rPr>
           <w:rFonts w:ascii="Segoe UI Emoji" w:hAnsi="Segoe UI Emoji" w:cs="Segoe UI Emoji"/>
           <w:b/>
@@ -1969,6 +1891,7 @@
     </w:p>
     <w:p>
       <w:pPr>
+        <w:spacing w:line="240" w:lineRule="auto"/>
         <w:rPr>
           <w:rFonts w:ascii="Segoe UI Emoji" w:hAnsi="Segoe UI Emoji" w:cs="Segoe UI Emoji"/>
           <w:b/>
@@ -1986,6 +1909,7 @@
     </w:p>
     <w:p>
       <w:pPr>
+        <w:spacing w:line="240" w:lineRule="auto"/>
         <w:rPr>
           <w:rFonts w:ascii="Segoe UI Emoji" w:hAnsi="Segoe UI Emoji" w:cs="Segoe UI Emoji"/>
           <w:b/>
@@ -2003,6 +1927,7 @@
     </w:p>
     <w:p>
       <w:pPr>
+        <w:spacing w:line="240" w:lineRule="auto"/>
         <w:rPr>
           <w:rFonts w:ascii="Segoe UI Emoji" w:hAnsi="Segoe UI Emoji" w:cs="Segoe UI Emoji"/>
           <w:b/>
@@ -2020,6 +1945,7 @@
     </w:p>
     <w:p>
       <w:pPr>
+        <w:spacing w:line="240" w:lineRule="auto"/>
         <w:rPr>
           <w:rFonts w:ascii="Segoe UI Emoji" w:hAnsi="Segoe UI Emoji" w:cs="Segoe UI Emoji"/>
           <w:b/>
@@ -2037,6 +1963,7 @@
     </w:p>
     <w:p>
       <w:pPr>
+        <w:spacing w:line="240" w:lineRule="auto"/>
         <w:rPr>
           <w:rFonts w:ascii="Segoe UI Emoji" w:hAnsi="Segoe UI Emoji" w:cs="Segoe UI Emoji"/>
           <w:b/>
@@ -2056,6 +1983,7 @@
     </w:p>
     <w:p>
       <w:pPr>
+        <w:spacing w:line="240" w:lineRule="auto"/>
         <w:rPr>
           <w:rFonts w:ascii="Segoe UI Emoji" w:hAnsi="Segoe UI Emoji" w:cs="Segoe UI Emoji"/>
           <w:b/>
@@ -2073,6 +2001,7 @@
     </w:p>
     <w:p>
       <w:pPr>
+        <w:spacing w:line="240" w:lineRule="auto"/>
         <w:rPr>
           <w:rFonts w:ascii="Segoe UI Emoji" w:hAnsi="Segoe UI Emoji" w:cs="Segoe UI Emoji"/>
           <w:b/>
@@ -2099,6 +2028,7 @@
     </w:p>
     <w:p>
       <w:pPr>
+        <w:spacing w:line="240" w:lineRule="auto"/>
         <w:rPr>
           <w:rFonts w:ascii="Segoe UI Emoji" w:hAnsi="Segoe UI Emoji" w:cs="Segoe UI Emoji"/>
           <w:b/>
@@ -2116,59 +2046,25 @@
     </w:p>
     <w:p>
       <w:pPr>
-        <w:rPr>
-          <w:rFonts w:ascii="Segoe UI Emoji" w:hAnsi="Segoe UI Emoji" w:cs="Segoe UI Emoji"/>
-          <w:b/>
-          <w:bCs/>
-        </w:rPr>
-      </w:pPr>
-      <w:r>
-        <w:rPr>
-          <w:rFonts w:ascii="Segoe UI Emoji" w:hAnsi="Segoe UI Emoji" w:cs="Segoe UI Emoji"/>
-          <w:b/>
-          <w:bCs/>
-        </w:rPr>
-        <w:t>&lt;</w:t>
-      </w:r>
-      <w:proofErr w:type="spellStart"/>
-      <w:r>
-        <w:rPr>
-          <w:rFonts w:ascii="Segoe UI Emoji" w:hAnsi="Segoe UI Emoji" w:cs="Segoe UI Emoji"/>
-          <w:b/>
-          <w:bCs/>
-        </w:rPr>
-        <w:t>img</w:t>
-      </w:r>
-      <w:proofErr w:type="spellEnd"/>
-      <w:r>
-        <w:rPr>
-          <w:rFonts w:ascii="Segoe UI Emoji" w:hAnsi="Segoe UI Emoji" w:cs="Segoe UI Emoji"/>
-          <w:b/>
-          <w:bCs/>
-        </w:rPr>
-        <w:t xml:space="preserve"> </w:t>
-      </w:r>
-      <w:proofErr w:type="spellStart"/>
-      <w:r>
-        <w:rPr>
-          <w:rFonts w:ascii="Segoe UI Emoji" w:hAnsi="Segoe UI Emoji" w:cs="Segoe UI Emoji"/>
-          <w:b/>
-          <w:bCs/>
-        </w:rPr>
-        <w:t>src</w:t>
-      </w:r>
-      <w:proofErr w:type="spellEnd"/>
-      <w:r>
-        <w:rPr>
-          <w:rFonts w:ascii="Segoe UI Emoji" w:hAnsi="Segoe UI Emoji" w:cs="Segoe UI Emoji"/>
-          <w:b/>
-          <w:bCs/>
-        </w:rPr>
-        <w:t>="profile.jpg" alt="Profile photo"&gt;</w:t>
-      </w:r>
-    </w:p>
-    <w:p>
-      <w:pPr>
+        <w:spacing w:line="240" w:lineRule="auto"/>
+        <w:rPr>
+          <w:rFonts w:ascii="Segoe UI Emoji" w:hAnsi="Segoe UI Emoji" w:cs="Segoe UI Emoji"/>
+          <w:b/>
+          <w:bCs/>
+        </w:rPr>
+      </w:pPr>
+      <w:r>
+        <w:rPr>
+          <w:rFonts w:ascii="Segoe UI Emoji" w:hAnsi="Segoe UI Emoji" w:cs="Segoe UI Emoji"/>
+          <w:b/>
+          <w:bCs/>
+        </w:rPr>
+        <w:t>&lt;img src="profile.jpg" alt="Profile photo"&gt;</w:t>
+      </w:r>
+    </w:p>
+    <w:p>
+      <w:pPr>
+        <w:spacing w:line="240" w:lineRule="auto"/>
         <w:rPr>
           <w:rFonts w:ascii="Segoe UI Emoji" w:hAnsi="Segoe UI Emoji" w:cs="Segoe UI Emoji"/>
           <w:b/>
@@ -2186,6 +2082,7 @@
     </w:p>
     <w:p>
       <w:pPr>
+        <w:spacing w:line="240" w:lineRule="auto"/>
         <w:rPr>
           <w:rFonts w:ascii="Segoe UI Emoji" w:hAnsi="Segoe UI Emoji" w:cs="Segoe UI Emoji"/>
           <w:b/>
@@ -2205,59 +2102,96 @@
     </w:p>
     <w:p>
       <w:pPr>
-        <w:rPr>
-          <w:rFonts w:ascii="Segoe UI Emoji" w:hAnsi="Segoe UI Emoji" w:cs="Segoe UI Emoji"/>
-          <w:b/>
-          <w:bCs/>
-        </w:rPr>
-      </w:pPr>
-      <w:r>
-        <w:rPr>
-          <w:rFonts w:ascii="Segoe UI Emoji" w:hAnsi="Segoe UI Emoji" w:cs="Segoe UI Emoji"/>
-          <w:b/>
-          <w:bCs/>
-        </w:rPr>
-        <w:t xml:space="preserve">9. What is the difference between </w:t>
-      </w:r>
-      <w:proofErr w:type="spellStart"/>
-      <w:r>
-        <w:rPr>
-          <w:rFonts w:ascii="Segoe UI Emoji" w:hAnsi="Segoe UI Emoji" w:cs="Segoe UI Emoji"/>
-          <w:b/>
-          <w:bCs/>
-        </w:rPr>
-        <w:t>localStorage</w:t>
-      </w:r>
-      <w:proofErr w:type="spellEnd"/>
-      <w:r>
-        <w:rPr>
-          <w:rFonts w:ascii="Segoe UI Emoji" w:hAnsi="Segoe UI Emoji" w:cs="Segoe UI Emoji"/>
-          <w:b/>
-          <w:bCs/>
-        </w:rPr>
-        <w:t xml:space="preserve">, </w:t>
-      </w:r>
-      <w:proofErr w:type="spellStart"/>
-      <w:r>
-        <w:rPr>
-          <w:rFonts w:ascii="Segoe UI Emoji" w:hAnsi="Segoe UI Emoji" w:cs="Segoe UI Emoji"/>
-          <w:b/>
-          <w:bCs/>
-        </w:rPr>
-        <w:t>sessionStorage</w:t>
-      </w:r>
-      <w:proofErr w:type="spellEnd"/>
-      <w:r>
-        <w:rPr>
-          <w:rFonts w:ascii="Segoe UI Emoji" w:hAnsi="Segoe UI Emoji" w:cs="Segoe UI Emoji"/>
-          <w:b/>
-          <w:bCs/>
-        </w:rPr>
-        <w:t>, and cookies?</w:t>
-      </w:r>
-    </w:p>
-    <w:p>
-      <w:pPr>
+        <w:spacing w:line="240" w:lineRule="auto"/>
+        <w:rPr>
+          <w:rFonts w:ascii="Segoe UI Emoji" w:hAnsi="Segoe UI Emoji" w:cs="Segoe UI Emoji"/>
+          <w:b/>
+          <w:bCs/>
+        </w:rPr>
+      </w:pPr>
+    </w:p>
+    <w:p>
+      <w:pPr>
+        <w:spacing w:line="240" w:lineRule="auto"/>
+        <w:rPr>
+          <w:rFonts w:ascii="Segoe UI Emoji" w:hAnsi="Segoe UI Emoji" w:cs="Segoe UI Emoji"/>
+          <w:b/>
+          <w:bCs/>
+        </w:rPr>
+      </w:pPr>
+    </w:p>
+    <w:p>
+      <w:pPr>
+        <w:spacing w:line="240" w:lineRule="auto"/>
+        <w:rPr>
+          <w:rFonts w:ascii="Segoe UI Emoji" w:hAnsi="Segoe UI Emoji" w:cs="Segoe UI Emoji"/>
+          <w:b/>
+          <w:bCs/>
+        </w:rPr>
+      </w:pPr>
+    </w:p>
+    <w:p>
+      <w:pPr>
+        <w:spacing w:line="240" w:lineRule="auto"/>
+        <w:rPr>
+          <w:rFonts w:ascii="Segoe UI Emoji" w:hAnsi="Segoe UI Emoji" w:cs="Segoe UI Emoji"/>
+          <w:b/>
+          <w:bCs/>
+        </w:rPr>
+      </w:pPr>
+    </w:p>
+    <w:p>
+      <w:pPr>
+        <w:spacing w:line="240" w:lineRule="auto"/>
+        <w:rPr>
+          <w:rFonts w:ascii="Segoe UI Emoji" w:hAnsi="Segoe UI Emoji" w:cs="Segoe UI Emoji"/>
+          <w:b/>
+          <w:bCs/>
+        </w:rPr>
+      </w:pPr>
+    </w:p>
+    <w:p>
+      <w:pPr>
+        <w:spacing w:line="240" w:lineRule="auto"/>
+        <w:rPr>
+          <w:rFonts w:ascii="Segoe UI Emoji" w:hAnsi="Segoe UI Emoji" w:cs="Segoe UI Emoji"/>
+          <w:b/>
+          <w:bCs/>
+        </w:rPr>
+      </w:pPr>
+    </w:p>
+    <w:p>
+      <w:pPr>
+        <w:spacing w:line="240" w:lineRule="auto"/>
+        <w:rPr>
+          <w:rFonts w:ascii="Segoe UI Emoji" w:hAnsi="Segoe UI Emoji" w:cs="Segoe UI Emoji"/>
+          <w:b/>
+          <w:bCs/>
+        </w:rPr>
+      </w:pPr>
+    </w:p>
+    <w:p>
+      <w:pPr>
+        <w:spacing w:line="240" w:lineRule="auto"/>
+        <w:rPr>
+          <w:rFonts w:ascii="Segoe UI Emoji" w:hAnsi="Segoe UI Emoji" w:cs="Segoe UI Emoji"/>
+          <w:b/>
+          <w:bCs/>
+        </w:rPr>
+      </w:pPr>
+      <w:r>
+        <w:rPr>
+          <w:rFonts w:ascii="Segoe UI Emoji" w:hAnsi="Segoe UI Emoji" w:cs="Segoe UI Emoji"/>
+          <w:b/>
+          <w:bCs/>
+        </w:rPr>
+        <w:lastRenderedPageBreak/>
+        <w:t>9. What is the difference between localStorage, sessionStorage, and cookies?</w:t>
+      </w:r>
+    </w:p>
+    <w:p>
+      <w:pPr>
+        <w:spacing w:line="240" w:lineRule="auto"/>
         <w:rPr>
           <w:rFonts w:ascii="Segoe UI Emoji" w:hAnsi="Segoe UI Emoji" w:cs="Segoe UI Emoji"/>
           <w:b/>
@@ -2304,6 +2238,7 @@
           </w:tcPr>
           <w:p>
             <w:pPr>
+              <w:spacing w:line="240" w:lineRule="auto"/>
               <w:rPr>
                 <w:rFonts w:ascii="Segoe UI Emoji" w:hAnsi="Segoe UI Emoji" w:cs="Segoe UI Emoji"/>
                 <w:b/>
@@ -2328,13 +2263,13 @@
           </w:tcPr>
           <w:p>
             <w:pPr>
+              <w:spacing w:line="240" w:lineRule="auto"/>
               <w:rPr>
                 <w:rFonts w:ascii="Segoe UI Emoji" w:hAnsi="Segoe UI Emoji" w:cs="Segoe UI Emoji"/>
                 <w:b/>
                 <w:bCs/>
               </w:rPr>
             </w:pPr>
-            <w:proofErr w:type="spellStart"/>
             <w:r>
               <w:rPr>
                 <w:rFonts w:ascii="Segoe UI Emoji" w:hAnsi="Segoe UI Emoji" w:cs="Segoe UI Emoji"/>
@@ -2343,7 +2278,6 @@
               </w:rPr>
               <w:t>localStorage</w:t>
             </w:r>
-            <w:proofErr w:type="spellEnd"/>
           </w:p>
         </w:tc>
         <w:tc>
@@ -2354,13 +2288,13 @@
           </w:tcPr>
           <w:p>
             <w:pPr>
+              <w:spacing w:line="240" w:lineRule="auto"/>
               <w:rPr>
                 <w:rFonts w:ascii="Segoe UI Emoji" w:hAnsi="Segoe UI Emoji" w:cs="Segoe UI Emoji"/>
                 <w:b/>
                 <w:bCs/>
               </w:rPr>
             </w:pPr>
-            <w:proofErr w:type="spellStart"/>
             <w:r>
               <w:rPr>
                 <w:rFonts w:ascii="Segoe UI Emoji" w:hAnsi="Segoe UI Emoji" w:cs="Segoe UI Emoji"/>
@@ -2369,7 +2303,6 @@
               </w:rPr>
               <w:t>sessionStorage</w:t>
             </w:r>
-            <w:proofErr w:type="spellEnd"/>
           </w:p>
         </w:tc>
         <w:tc>
@@ -2380,6 +2313,7 @@
           </w:tcPr>
           <w:p>
             <w:pPr>
+              <w:spacing w:line="240" w:lineRule="auto"/>
               <w:rPr>
                 <w:rFonts w:ascii="Segoe UI Emoji" w:hAnsi="Segoe UI Emoji" w:cs="Segoe UI Emoji"/>
                 <w:b/>
@@ -2409,6 +2343,7 @@
           </w:tcPr>
           <w:p>
             <w:pPr>
+              <w:spacing w:line="240" w:lineRule="auto"/>
               <w:rPr>
                 <w:rFonts w:ascii="Segoe UI Emoji" w:hAnsi="Segoe UI Emoji" w:cs="Segoe UI Emoji"/>
                 <w:b/>
@@ -2433,6 +2368,7 @@
           </w:tcPr>
           <w:p>
             <w:pPr>
+              <w:spacing w:line="240" w:lineRule="auto"/>
               <w:rPr>
                 <w:rFonts w:ascii="Segoe UI Emoji" w:hAnsi="Segoe UI Emoji" w:cs="Segoe UI Emoji"/>
                 <w:b/>
@@ -2457,6 +2393,7 @@
           </w:tcPr>
           <w:p>
             <w:pPr>
+              <w:spacing w:line="240" w:lineRule="auto"/>
               <w:rPr>
                 <w:rFonts w:ascii="Segoe UI Emoji" w:hAnsi="Segoe UI Emoji" w:cs="Segoe UI Emoji"/>
                 <w:b/>
@@ -2481,6 +2418,7 @@
           </w:tcPr>
           <w:p>
             <w:pPr>
+              <w:spacing w:line="240" w:lineRule="auto"/>
               <w:rPr>
                 <w:rFonts w:ascii="Segoe UI Emoji" w:hAnsi="Segoe UI Emoji" w:cs="Segoe UI Emoji"/>
                 <w:b/>
@@ -2510,6 +2448,7 @@
           </w:tcPr>
           <w:p>
             <w:pPr>
+              <w:spacing w:line="240" w:lineRule="auto"/>
               <w:rPr>
                 <w:rFonts w:ascii="Segoe UI Emoji" w:hAnsi="Segoe UI Emoji" w:cs="Segoe UI Emoji"/>
                 <w:b/>
@@ -2534,6 +2473,7 @@
           </w:tcPr>
           <w:p>
             <w:pPr>
+              <w:spacing w:line="240" w:lineRule="auto"/>
               <w:rPr>
                 <w:rFonts w:ascii="Segoe UI Emoji" w:hAnsi="Segoe UI Emoji" w:cs="Segoe UI Emoji"/>
                 <w:b/>
@@ -2558,6 +2498,7 @@
           </w:tcPr>
           <w:p>
             <w:pPr>
+              <w:spacing w:line="240" w:lineRule="auto"/>
               <w:rPr>
                 <w:rFonts w:ascii="Segoe UI Emoji" w:hAnsi="Segoe UI Emoji" w:cs="Segoe UI Emoji"/>
                 <w:b/>
@@ -2582,6 +2523,7 @@
           </w:tcPr>
           <w:p>
             <w:pPr>
+              <w:spacing w:line="240" w:lineRule="auto"/>
               <w:rPr>
                 <w:rFonts w:ascii="Segoe UI Emoji" w:hAnsi="Segoe UI Emoji" w:cs="Segoe UI Emoji"/>
                 <w:b/>
@@ -2611,6 +2553,7 @@
           </w:tcPr>
           <w:p>
             <w:pPr>
+              <w:spacing w:line="240" w:lineRule="auto"/>
               <w:rPr>
                 <w:rFonts w:ascii="Segoe UI Emoji" w:hAnsi="Segoe UI Emoji" w:cs="Segoe UI Emoji"/>
                 <w:b/>
@@ -2635,6 +2578,7 @@
           </w:tcPr>
           <w:p>
             <w:pPr>
+              <w:spacing w:line="240" w:lineRule="auto"/>
               <w:rPr>
                 <w:rFonts w:ascii="Segoe UI Emoji" w:hAnsi="Segoe UI Emoji" w:cs="Segoe UI Emoji"/>
                 <w:b/>
@@ -2659,6 +2603,7 @@
           </w:tcPr>
           <w:p>
             <w:pPr>
+              <w:spacing w:line="240" w:lineRule="auto"/>
               <w:rPr>
                 <w:rFonts w:ascii="Segoe UI Emoji" w:hAnsi="Segoe UI Emoji" w:cs="Segoe UI Emoji"/>
                 <w:b/>
@@ -2683,6 +2628,7 @@
           </w:tcPr>
           <w:p>
             <w:pPr>
+              <w:spacing w:line="240" w:lineRule="auto"/>
               <w:rPr>
                 <w:rFonts w:ascii="Segoe UI Emoji" w:hAnsi="Segoe UI Emoji" w:cs="Segoe UI Emoji"/>
                 <w:b/>
@@ -2712,6 +2658,7 @@
           </w:tcPr>
           <w:p>
             <w:pPr>
+              <w:spacing w:line="240" w:lineRule="auto"/>
               <w:rPr>
                 <w:rFonts w:ascii="Segoe UI Emoji" w:hAnsi="Segoe UI Emoji" w:cs="Segoe UI Emoji"/>
                 <w:b/>
@@ -2736,6 +2683,7 @@
           </w:tcPr>
           <w:p>
             <w:pPr>
+              <w:spacing w:line="240" w:lineRule="auto"/>
               <w:rPr>
                 <w:rFonts w:ascii="Segoe UI Emoji" w:hAnsi="Segoe UI Emoji" w:cs="Segoe UI Emoji"/>
                 <w:b/>
@@ -2760,6 +2708,7 @@
           </w:tcPr>
           <w:p>
             <w:pPr>
+              <w:spacing w:line="240" w:lineRule="auto"/>
               <w:rPr>
                 <w:rFonts w:ascii="Segoe UI Emoji" w:hAnsi="Segoe UI Emoji" w:cs="Segoe UI Emoji"/>
                 <w:b/>
@@ -2784,6 +2733,7 @@
           </w:tcPr>
           <w:p>
             <w:pPr>
+              <w:spacing w:line="240" w:lineRule="auto"/>
               <w:rPr>
                 <w:rFonts w:ascii="Segoe UI Emoji" w:hAnsi="Segoe UI Emoji" w:cs="Segoe UI Emoji"/>
                 <w:b/>
@@ -2804,114 +2754,81 @@
     </w:tbl>
     <w:p>
       <w:pPr>
-        <w:rPr>
-          <w:rFonts w:ascii="Segoe UI Emoji" w:hAnsi="Segoe UI Emoji" w:cs="Segoe UI Emoji"/>
-          <w:b/>
-          <w:bCs/>
-        </w:rPr>
-      </w:pPr>
-      <w:r>
-        <w:rPr>
-          <w:rFonts w:ascii="Segoe UI Emoji" w:hAnsi="Segoe UI Emoji" w:cs="Segoe UI Emoji"/>
-          <w:b/>
-          <w:bCs/>
-        </w:rPr>
-        <w:lastRenderedPageBreak/>
+        <w:spacing w:line="240" w:lineRule="auto"/>
+        <w:rPr>
+          <w:rFonts w:ascii="Segoe UI Emoji" w:hAnsi="Segoe UI Emoji" w:cs="Segoe UI Emoji"/>
+          <w:b/>
+          <w:bCs/>
+        </w:rPr>
+      </w:pPr>
+      <w:r>
+        <w:rPr>
+          <w:rFonts w:ascii="Segoe UI Emoji" w:hAnsi="Segoe UI Emoji" w:cs="Segoe UI Emoji"/>
+          <w:b/>
+          <w:bCs/>
+        </w:rPr>
         <w:t>Example:</w:t>
       </w:r>
     </w:p>
     <w:p>
       <w:pPr>
-        <w:rPr>
-          <w:rFonts w:ascii="Segoe UI Emoji" w:hAnsi="Segoe UI Emoji" w:cs="Segoe UI Emoji"/>
-          <w:b/>
-          <w:bCs/>
-        </w:rPr>
-      </w:pPr>
-      <w:proofErr w:type="spellStart"/>
-      <w:r>
-        <w:rPr>
-          <w:rFonts w:ascii="Segoe UI Emoji" w:hAnsi="Segoe UI Emoji" w:cs="Segoe UI Emoji"/>
-          <w:b/>
-          <w:bCs/>
-        </w:rPr>
-        <w:t>localStorage.setItem</w:t>
-      </w:r>
-      <w:proofErr w:type="spellEnd"/>
-      <w:r>
-        <w:rPr>
-          <w:rFonts w:ascii="Segoe UI Emoji" w:hAnsi="Segoe UI Emoji" w:cs="Segoe UI Emoji"/>
-          <w:b/>
-          <w:bCs/>
-        </w:rPr>
-        <w:t>("name", "Sandeep");</w:t>
-      </w:r>
-    </w:p>
-    <w:p>
-      <w:pPr>
-        <w:rPr>
-          <w:rFonts w:ascii="Segoe UI Emoji" w:hAnsi="Segoe UI Emoji" w:cs="Segoe UI Emoji"/>
-          <w:b/>
-          <w:bCs/>
-        </w:rPr>
-      </w:pPr>
-    </w:p>
-    <w:p>
-      <w:pPr>
-        <w:rPr>
-          <w:rFonts w:ascii="Segoe UI Emoji" w:hAnsi="Segoe UI Emoji" w:cs="Segoe UI Emoji"/>
-          <w:b/>
-          <w:bCs/>
-        </w:rPr>
-      </w:pPr>
-      <w:proofErr w:type="spellStart"/>
-      <w:r>
-        <w:rPr>
-          <w:rFonts w:ascii="Segoe UI Emoji" w:hAnsi="Segoe UI Emoji" w:cs="Segoe UI Emoji"/>
-          <w:b/>
-          <w:bCs/>
-        </w:rPr>
-        <w:t>const</w:t>
-      </w:r>
-      <w:proofErr w:type="spellEnd"/>
-      <w:r>
-        <w:rPr>
-          <w:rFonts w:ascii="Segoe UI Emoji" w:hAnsi="Segoe UI Emoji" w:cs="Segoe UI Emoji"/>
-          <w:b/>
-          <w:bCs/>
-        </w:rPr>
-        <w:t xml:space="preserve"> name = </w:t>
-      </w:r>
-      <w:proofErr w:type="spellStart"/>
-      <w:r>
-        <w:rPr>
-          <w:rFonts w:ascii="Segoe UI Emoji" w:hAnsi="Segoe UI Emoji" w:cs="Segoe UI Emoji"/>
-          <w:b/>
-          <w:bCs/>
-        </w:rPr>
-        <w:t>localStorage.getItem</w:t>
-      </w:r>
-      <w:proofErr w:type="spellEnd"/>
-      <w:r>
-        <w:rPr>
-          <w:rFonts w:ascii="Segoe UI Emoji" w:hAnsi="Segoe UI Emoji" w:cs="Segoe UI Emoji"/>
-          <w:b/>
-          <w:bCs/>
-        </w:rPr>
-        <w:t>("name");</w:t>
-      </w:r>
-    </w:p>
-    <w:p>
-      <w:pPr>
-        <w:rPr>
-          <w:rFonts w:ascii="Segoe UI Emoji" w:hAnsi="Segoe UI Emoji" w:cs="Segoe UI Emoji"/>
-          <w:b/>
-          <w:bCs/>
-        </w:rPr>
-      </w:pPr>
-    </w:p>
-    <w:p>
-      <w:pPr>
+        <w:spacing w:line="240" w:lineRule="auto"/>
+        <w:rPr>
+          <w:rFonts w:ascii="Segoe UI Emoji" w:hAnsi="Segoe UI Emoji" w:cs="Segoe UI Emoji"/>
+          <w:b/>
+          <w:bCs/>
+        </w:rPr>
+      </w:pPr>
+      <w:r>
+        <w:rPr>
+          <w:rFonts w:ascii="Segoe UI Emoji" w:hAnsi="Segoe UI Emoji" w:cs="Segoe UI Emoji"/>
+          <w:b/>
+          <w:bCs/>
+        </w:rPr>
+        <w:t>localStorage.setItem("name", "Sandeep");</w:t>
+      </w:r>
+    </w:p>
+    <w:p>
+      <w:pPr>
+        <w:spacing w:line="240" w:lineRule="auto"/>
+        <w:rPr>
+          <w:rFonts w:ascii="Segoe UI Emoji" w:hAnsi="Segoe UI Emoji" w:cs="Segoe UI Emoji"/>
+          <w:b/>
+          <w:bCs/>
+        </w:rPr>
+      </w:pPr>
+    </w:p>
+    <w:p>
+      <w:pPr>
+        <w:spacing w:line="240" w:lineRule="auto"/>
+        <w:rPr>
+          <w:rFonts w:ascii="Segoe UI Emoji" w:hAnsi="Segoe UI Emoji" w:cs="Segoe UI Emoji"/>
+          <w:b/>
+          <w:bCs/>
+        </w:rPr>
+      </w:pPr>
+      <w:r>
+        <w:rPr>
+          <w:rFonts w:ascii="Segoe UI Emoji" w:hAnsi="Segoe UI Emoji" w:cs="Segoe UI Emoji"/>
+          <w:b/>
+          <w:bCs/>
+        </w:rPr>
+        <w:t>const name = localStorage.getItem("name");</w:t>
+      </w:r>
+    </w:p>
+    <w:p>
+      <w:pPr>
+        <w:spacing w:line="240" w:lineRule="auto"/>
+        <w:rPr>
+          <w:rFonts w:ascii="Segoe UI Emoji" w:hAnsi="Segoe UI Emoji" w:cs="Segoe UI Emoji"/>
+          <w:b/>
+          <w:bCs/>
+        </w:rPr>
+      </w:pPr>
+    </w:p>
+    <w:p>
+      <w:pPr>
+        <w:spacing w:line="240" w:lineRule="auto"/>
         <w:rPr>
           <w:rFonts w:ascii="Segoe UI Emoji" w:hAnsi="Segoe UI Emoji" w:cs="Segoe UI Emoji"/>
           <w:b/>
@@ -2929,6 +2846,7 @@
     </w:p>
     <w:p>
       <w:pPr>
+        <w:spacing w:line="240" w:lineRule="auto"/>
         <w:rPr>
           <w:rFonts w:ascii="Segoe UI Emoji" w:hAnsi="Segoe UI Emoji" w:cs="Segoe UI Emoji"/>
           <w:b/>
@@ -2948,6 +2866,7 @@
     </w:p>
     <w:p>
       <w:pPr>
+        <w:spacing w:line="240" w:lineRule="auto"/>
         <w:rPr>
           <w:rFonts w:ascii="Segoe UI Emoji" w:hAnsi="Segoe UI Emoji" w:cs="Segoe UI Emoji"/>
           <w:b/>
@@ -2965,6 +2884,7 @@
     </w:p>
     <w:p>
       <w:pPr>
+        <w:spacing w:line="240" w:lineRule="auto"/>
         <w:rPr>
           <w:rFonts w:ascii="Segoe UI Emoji" w:hAnsi="Segoe UI Emoji" w:cs="Segoe UI Emoji"/>
           <w:b/>
@@ -2985,29 +2905,20 @@
           <w:b/>
           <w:bCs/>
         </w:rPr>
-        <w:br/>
-      </w:r>
-      <w:proofErr w:type="gramStart"/>
-      <w:r>
-        <w:rPr>
-          <w:rFonts w:ascii="Segoe UI Emoji" w:hAnsi="Segoe UI Emoji" w:cs="Segoe UI Emoji"/>
-          <w:b/>
-          <w:bCs/>
-        </w:rPr>
-        <w:t>These control</w:t>
-      </w:r>
-      <w:proofErr w:type="gramEnd"/>
-      <w:r>
-        <w:rPr>
-          <w:rFonts w:ascii="Segoe UI Emoji" w:hAnsi="Segoe UI Emoji" w:cs="Segoe UI Emoji"/>
-          <w:b/>
-          <w:bCs/>
-        </w:rPr>
-        <w:t xml:space="preserve"> how JavaScript files are loaded and executed.</w:t>
-      </w:r>
-    </w:p>
-    <w:p>
-      <w:pPr>
+        <w:t xml:space="preserve"> </w:t>
+      </w:r>
+      <w:r>
+        <w:rPr>
+          <w:rFonts w:ascii="Segoe UI Emoji" w:hAnsi="Segoe UI Emoji" w:cs="Segoe UI Emoji"/>
+          <w:b/>
+          <w:bCs/>
+        </w:rPr>
+        <w:t>These control how JavaScript files are loaded and executed.</w:t>
+      </w:r>
+    </w:p>
+    <w:p>
+      <w:pPr>
+        <w:spacing w:line="240" w:lineRule="auto"/>
         <w:rPr>
           <w:rFonts w:ascii="Segoe UI Emoji" w:hAnsi="Segoe UI Emoji" w:cs="Segoe UI Emoji"/>
           <w:b/>
@@ -3025,41 +2936,25 @@
     </w:p>
     <w:p>
       <w:pPr>
-        <w:rPr>
-          <w:rFonts w:ascii="Segoe UI Emoji" w:hAnsi="Segoe UI Emoji" w:cs="Segoe UI Emoji"/>
-          <w:b/>
-          <w:bCs/>
-        </w:rPr>
-      </w:pPr>
-      <w:r>
-        <w:rPr>
-          <w:rFonts w:ascii="Segoe UI Emoji" w:hAnsi="Segoe UI Emoji" w:cs="Segoe UI Emoji"/>
-          <w:b/>
-          <w:bCs/>
-        </w:rPr>
-        <w:t xml:space="preserve">&lt;script </w:t>
-      </w:r>
-      <w:proofErr w:type="spellStart"/>
-      <w:r>
-        <w:rPr>
-          <w:rFonts w:ascii="Segoe UI Emoji" w:hAnsi="Segoe UI Emoji" w:cs="Segoe UI Emoji"/>
-          <w:b/>
-          <w:bCs/>
-        </w:rPr>
-        <w:t>src</w:t>
-      </w:r>
-      <w:proofErr w:type="spellEnd"/>
-      <w:r>
-        <w:rPr>
-          <w:rFonts w:ascii="Segoe UI Emoji" w:hAnsi="Segoe UI Emoji" w:cs="Segoe UI Emoji"/>
-          <w:b/>
-          <w:bCs/>
-        </w:rPr>
-        <w:t>="app.js"&gt;&lt;/script&gt;</w:t>
-      </w:r>
-    </w:p>
-    <w:p>
-      <w:pPr>
+        <w:spacing w:line="240" w:lineRule="auto"/>
+        <w:rPr>
+          <w:rFonts w:ascii="Segoe UI Emoji" w:hAnsi="Segoe UI Emoji" w:cs="Segoe UI Emoji"/>
+          <w:b/>
+          <w:bCs/>
+        </w:rPr>
+      </w:pPr>
+      <w:r>
+        <w:rPr>
+          <w:rFonts w:ascii="Segoe UI Emoji" w:hAnsi="Segoe UI Emoji" w:cs="Segoe UI Emoji"/>
+          <w:b/>
+          <w:bCs/>
+        </w:rPr>
+        <w:t>&lt;script src="app.js"&gt;&lt;/script&gt;</w:t>
+      </w:r>
+    </w:p>
+    <w:p>
+      <w:pPr>
+        <w:spacing w:line="240" w:lineRule="auto"/>
         <w:rPr>
           <w:rFonts w:ascii="Segoe UI Emoji" w:hAnsi="Segoe UI Emoji" w:cs="Segoe UI Emoji"/>
           <w:b/>
@@ -3077,6 +2972,7 @@
     </w:p>
     <w:p>
       <w:pPr>
+        <w:spacing w:line="240" w:lineRule="auto"/>
         <w:rPr>
           <w:rFonts w:ascii="Segoe UI Emoji" w:hAnsi="Segoe UI Emoji" w:cs="Segoe UI Emoji"/>
           <w:b/>
@@ -3094,41 +2990,25 @@
     </w:p>
     <w:p>
       <w:pPr>
-        <w:rPr>
-          <w:rFonts w:ascii="Segoe UI Emoji" w:hAnsi="Segoe UI Emoji" w:cs="Segoe UI Emoji"/>
-          <w:b/>
-          <w:bCs/>
-        </w:rPr>
-      </w:pPr>
-      <w:r>
-        <w:rPr>
-          <w:rFonts w:ascii="Segoe UI Emoji" w:hAnsi="Segoe UI Emoji" w:cs="Segoe UI Emoji"/>
-          <w:b/>
-          <w:bCs/>
-        </w:rPr>
-        <w:t xml:space="preserve">&lt;script </w:t>
-      </w:r>
-      <w:proofErr w:type="spellStart"/>
-      <w:r>
-        <w:rPr>
-          <w:rFonts w:ascii="Segoe UI Emoji" w:hAnsi="Segoe UI Emoji" w:cs="Segoe UI Emoji"/>
-          <w:b/>
-          <w:bCs/>
-        </w:rPr>
-        <w:t>src</w:t>
-      </w:r>
-      <w:proofErr w:type="spellEnd"/>
-      <w:r>
-        <w:rPr>
-          <w:rFonts w:ascii="Segoe UI Emoji" w:hAnsi="Segoe UI Emoji" w:cs="Segoe UI Emoji"/>
-          <w:b/>
-          <w:bCs/>
-        </w:rPr>
-        <w:t>="app.js" defer&gt;&lt;/script&gt;</w:t>
-      </w:r>
-    </w:p>
-    <w:p>
-      <w:pPr>
+        <w:spacing w:line="240" w:lineRule="auto"/>
+        <w:rPr>
+          <w:rFonts w:ascii="Segoe UI Emoji" w:hAnsi="Segoe UI Emoji" w:cs="Segoe UI Emoji"/>
+          <w:b/>
+          <w:bCs/>
+        </w:rPr>
+      </w:pPr>
+      <w:r>
+        <w:rPr>
+          <w:rFonts w:ascii="Segoe UI Emoji" w:hAnsi="Segoe UI Emoji" w:cs="Segoe UI Emoji"/>
+          <w:b/>
+          <w:bCs/>
+        </w:rPr>
+        <w:t>&lt;script src="app.js" defer&gt;&lt;/script&gt;</w:t>
+      </w:r>
+    </w:p>
+    <w:p>
+      <w:pPr>
+        <w:spacing w:line="240" w:lineRule="auto"/>
         <w:rPr>
           <w:rFonts w:ascii="Segoe UI Emoji" w:hAnsi="Segoe UI Emoji" w:cs="Segoe UI Emoji"/>
           <w:b/>
@@ -3146,6 +3026,7 @@
     </w:p>
     <w:p>
       <w:pPr>
+        <w:spacing w:line="240" w:lineRule="auto"/>
         <w:rPr>
           <w:rFonts w:ascii="Segoe UI Emoji" w:hAnsi="Segoe UI Emoji" w:cs="Segoe UI Emoji"/>
           <w:b/>
@@ -3163,41 +3044,25 @@
     </w:p>
     <w:p>
       <w:pPr>
-        <w:rPr>
-          <w:rFonts w:ascii="Segoe UI Emoji" w:hAnsi="Segoe UI Emoji" w:cs="Segoe UI Emoji"/>
-          <w:b/>
-          <w:bCs/>
-        </w:rPr>
-      </w:pPr>
-      <w:r>
-        <w:rPr>
-          <w:rFonts w:ascii="Segoe UI Emoji" w:hAnsi="Segoe UI Emoji" w:cs="Segoe UI Emoji"/>
-          <w:b/>
-          <w:bCs/>
-        </w:rPr>
-        <w:t xml:space="preserve">&lt;script </w:t>
-      </w:r>
-      <w:proofErr w:type="spellStart"/>
-      <w:r>
-        <w:rPr>
-          <w:rFonts w:ascii="Segoe UI Emoji" w:hAnsi="Segoe UI Emoji" w:cs="Segoe UI Emoji"/>
-          <w:b/>
-          <w:bCs/>
-        </w:rPr>
-        <w:t>src</w:t>
-      </w:r>
-      <w:proofErr w:type="spellEnd"/>
-      <w:r>
-        <w:rPr>
-          <w:rFonts w:ascii="Segoe UI Emoji" w:hAnsi="Segoe UI Emoji" w:cs="Segoe UI Emoji"/>
-          <w:b/>
-          <w:bCs/>
-        </w:rPr>
-        <w:t>="app.js" async&gt;&lt;/script&gt;</w:t>
-      </w:r>
-    </w:p>
-    <w:p>
-      <w:pPr>
+        <w:spacing w:line="240" w:lineRule="auto"/>
+        <w:rPr>
+          <w:rFonts w:ascii="Segoe UI Emoji" w:hAnsi="Segoe UI Emoji" w:cs="Segoe UI Emoji"/>
+          <w:b/>
+          <w:bCs/>
+        </w:rPr>
+      </w:pPr>
+      <w:r>
+        <w:rPr>
+          <w:rFonts w:ascii="Segoe UI Emoji" w:hAnsi="Segoe UI Emoji" w:cs="Segoe UI Emoji"/>
+          <w:b/>
+          <w:bCs/>
+        </w:rPr>
+        <w:t>&lt;script src="app.js" async&gt;&lt;/script&gt;</w:t>
+      </w:r>
+    </w:p>
+    <w:p>
+      <w:pPr>
+        <w:spacing w:line="240" w:lineRule="auto"/>
         <w:rPr>
           <w:rFonts w:ascii="Segoe UI Emoji" w:hAnsi="Segoe UI Emoji" w:cs="Segoe UI Emoji"/>
           <w:b/>
@@ -3215,438 +3080,30 @@
     </w:p>
     <w:p>
       <w:pPr>
-        <w:rPr>
-          <w:rFonts w:ascii="Segoe UI Emoji" w:hAnsi="Segoe UI Emoji" w:cs="Segoe UI Emoji"/>
-          <w:b/>
-          <w:bCs/>
-        </w:rPr>
-      </w:pPr>
-      <w:r>
-        <w:rPr>
-          <w:rFonts w:ascii="Segoe UI Emoji" w:hAnsi="Segoe UI Emoji" w:cs="Segoe UI Emoji"/>
-          <w:b/>
-          <w:bCs/>
-        </w:rPr>
-        <w:t>Interview shortcut:</w:t>
-      </w:r>
-    </w:p>
-    <w:p>
-      <w:pPr>
-        <w:numPr>
-          <w:ilvl w:val="0"/>
-          <w:numId w:val="3"/>
-        </w:numPr>
-        <w:rPr>
-          <w:rFonts w:ascii="Segoe UI Emoji" w:hAnsi="Segoe UI Emoji" w:cs="Segoe UI Emoji"/>
-          <w:b/>
-          <w:bCs/>
-        </w:rPr>
-      </w:pPr>
-      <w:r>
-        <w:rPr>
-          <w:rFonts w:ascii="Segoe UI Emoji" w:hAnsi="Segoe UI Emoji" w:cs="Segoe UI Emoji"/>
-          <w:b/>
-          <w:bCs/>
-        </w:rPr>
-        <w:t xml:space="preserve">defer → download in parallel, execute after parsing </w:t>
-      </w:r>
-    </w:p>
-    <w:p>
-      <w:pPr>
-        <w:numPr>
-          <w:ilvl w:val="0"/>
-          <w:numId w:val="3"/>
-        </w:numPr>
-        <w:rPr>
-          <w:rFonts w:ascii="Segoe UI Emoji" w:hAnsi="Segoe UI Emoji" w:cs="Segoe UI Emoji"/>
-          <w:b/>
-          <w:bCs/>
-        </w:rPr>
-      </w:pPr>
-      <w:r>
-        <w:rPr>
-          <w:rFonts w:ascii="Segoe UI Emoji" w:hAnsi="Segoe UI Emoji" w:cs="Segoe UI Emoji"/>
-          <w:b/>
-          <w:bCs/>
-        </w:rPr>
-        <w:t xml:space="preserve">async → download in parallel, execute as soon as ready </w:t>
-      </w:r>
-    </w:p>
-    <w:p>
-      <w:pPr>
-        <w:rPr>
-          <w:rFonts w:ascii="Segoe UI Emoji" w:hAnsi="Segoe UI Emoji" w:cs="Segoe UI Emoji"/>
-          <w:b/>
-          <w:bCs/>
-        </w:rPr>
-      </w:pPr>
-      <w:r>
-        <w:rPr>
-          <w:rFonts w:ascii="Segoe UI Emoji" w:hAnsi="Segoe UI Emoji" w:cs="Segoe UI Emoji"/>
-          <w:b/>
-          <w:bCs/>
-        </w:rPr>
-        <w:pict w14:anchorId="0BF0217C">
-          <v:rect id="_x0000_i1034" style="width:0;height:1.5pt" o:hralign="center" o:hrstd="t" o:hr="t" fillcolor="#a0a0a0" stroked="f"/>
-        </w:pict>
-      </w:r>
-    </w:p>
-    <w:p>
-      <w:pPr>
-        <w:rPr>
-          <w:rFonts w:ascii="Segoe UI Emoji" w:hAnsi="Segoe UI Emoji" w:cs="Segoe UI Emoji"/>
-          <w:b/>
-          <w:bCs/>
-        </w:rPr>
-      </w:pPr>
-      <w:r>
-        <w:rPr>
-          <w:rFonts w:ascii="Segoe UI Emoji" w:hAnsi="Segoe UI Emoji" w:cs="Segoe UI Emoji"/>
-          <w:b/>
-          <w:bCs/>
-        </w:rPr>
-        <w:t>⭐ Most Important for Your MERN Interview</w:t>
-      </w:r>
-    </w:p>
-    <w:p>
-      <w:pPr>
-        <w:rPr>
-          <w:rFonts w:ascii="Segoe UI Emoji" w:hAnsi="Segoe UI Emoji" w:cs="Segoe UI Emoji"/>
-          <w:b/>
-          <w:bCs/>
-        </w:rPr>
-      </w:pPr>
-      <w:r>
-        <w:rPr>
-          <w:rFonts w:ascii="Segoe UI Emoji" w:hAnsi="Segoe UI Emoji" w:cs="Segoe UI Emoji"/>
-          <w:b/>
-          <w:bCs/>
-        </w:rPr>
-        <w:t>I recommend preparing these topics very well:</w:t>
-      </w:r>
-    </w:p>
-    <w:p>
-      <w:pPr>
-        <w:numPr>
-          <w:ilvl w:val="0"/>
-          <w:numId w:val="4"/>
-        </w:numPr>
-        <w:rPr>
-          <w:rFonts w:ascii="Segoe UI Emoji" w:hAnsi="Segoe UI Emoji" w:cs="Segoe UI Emoji"/>
-          <w:b/>
-          <w:bCs/>
-        </w:rPr>
-      </w:pPr>
-      <w:r>
-        <w:rPr>
-          <w:rFonts w:ascii="Segoe UI Emoji" w:hAnsi="Segoe UI Emoji" w:cs="Segoe UI Emoji"/>
-          <w:b/>
-          <w:bCs/>
+        <w:spacing w:line="240" w:lineRule="auto"/>
+        <w:rPr>
+          <w:rFonts w:ascii="Segoe UI Emoji" w:hAnsi="Segoe UI Emoji" w:cs="Segoe UI Emoji"/>
+          <w:b/>
+          <w:bCs/>
+          <w:vanish/>
+        </w:rPr>
+      </w:pPr>
+      <w:r>
+        <w:rPr>
+          <w:rFonts w:ascii="Segoe UI Emoji" w:hAnsi="Segoe UI Emoji" w:cs="Segoe UI Emoji"/>
+          <w:b/>
+          <w:bCs/>
+          <w:vanish/>
         </w:rPr>
         <w:lastRenderedPageBreak/>
-        <w:t xml:space="preserve">Semantic HTML </w:t>
-      </w:r>
-    </w:p>
-    <w:p>
-      <w:pPr>
-        <w:numPr>
-          <w:ilvl w:val="0"/>
-          <w:numId w:val="4"/>
-        </w:numPr>
-        <w:rPr>
-          <w:rFonts w:ascii="Segoe UI Emoji" w:hAnsi="Segoe UI Emoji" w:cs="Segoe UI Emoji"/>
-          <w:b/>
-          <w:bCs/>
-        </w:rPr>
-      </w:pPr>
-      <w:r>
-        <w:rPr>
-          <w:rFonts w:ascii="Segoe UI Emoji" w:hAnsi="Segoe UI Emoji" w:cs="Segoe UI Emoji"/>
-          <w:b/>
-          <w:bCs/>
-        </w:rPr>
-        <w:t xml:space="preserve">HTML5 </w:t>
-      </w:r>
-    </w:p>
-    <w:p>
-      <w:pPr>
-        <w:numPr>
-          <w:ilvl w:val="0"/>
-          <w:numId w:val="4"/>
-        </w:numPr>
-        <w:rPr>
-          <w:rFonts w:ascii="Segoe UI Emoji" w:hAnsi="Segoe UI Emoji" w:cs="Segoe UI Emoji"/>
-          <w:b/>
-          <w:bCs/>
-        </w:rPr>
-      </w:pPr>
-      <w:r>
-        <w:rPr>
-          <w:rFonts w:ascii="Segoe UI Emoji" w:hAnsi="Segoe UI Emoji" w:cs="Segoe UI Emoji"/>
-          <w:b/>
-          <w:bCs/>
-        </w:rPr>
-        <w:t xml:space="preserve">div vs span </w:t>
-      </w:r>
-    </w:p>
-    <w:p>
-      <w:pPr>
-        <w:numPr>
-          <w:ilvl w:val="0"/>
-          <w:numId w:val="4"/>
-        </w:numPr>
-        <w:rPr>
-          <w:rFonts w:ascii="Segoe UI Emoji" w:hAnsi="Segoe UI Emoji" w:cs="Segoe UI Emoji"/>
-          <w:b/>
-          <w:bCs/>
-        </w:rPr>
-      </w:pPr>
-      <w:r>
-        <w:rPr>
-          <w:rFonts w:ascii="Segoe UI Emoji" w:hAnsi="Segoe UI Emoji" w:cs="Segoe UI Emoji"/>
-          <w:b/>
-          <w:bCs/>
-        </w:rPr>
-        <w:t xml:space="preserve">id vs class </w:t>
-      </w:r>
-    </w:p>
-    <w:p>
-      <w:pPr>
-        <w:numPr>
-          <w:ilvl w:val="0"/>
-          <w:numId w:val="4"/>
-        </w:numPr>
-        <w:rPr>
-          <w:rFonts w:ascii="Segoe UI Emoji" w:hAnsi="Segoe UI Emoji" w:cs="Segoe UI Emoji"/>
-          <w:b/>
-          <w:bCs/>
-        </w:rPr>
-      </w:pPr>
-      <w:r>
-        <w:rPr>
-          <w:rFonts w:ascii="Segoe UI Emoji" w:hAnsi="Segoe UI Emoji" w:cs="Segoe UI Emoji"/>
-          <w:b/>
-          <w:bCs/>
-        </w:rPr>
-        <w:t xml:space="preserve">Block vs Inline elements </w:t>
-      </w:r>
-    </w:p>
-    <w:p>
-      <w:pPr>
-        <w:numPr>
-          <w:ilvl w:val="0"/>
-          <w:numId w:val="4"/>
-        </w:numPr>
-        <w:rPr>
-          <w:rFonts w:ascii="Segoe UI Emoji" w:hAnsi="Segoe UI Emoji" w:cs="Segoe UI Emoji"/>
-          <w:b/>
-          <w:bCs/>
-        </w:rPr>
-      </w:pPr>
-      <w:r>
-        <w:rPr>
-          <w:rFonts w:ascii="Segoe UI Emoji" w:hAnsi="Segoe UI Emoji" w:cs="Segoe UI Emoji"/>
-          <w:b/>
-          <w:bCs/>
-        </w:rPr>
-        <w:t xml:space="preserve">Forms and validation </w:t>
-      </w:r>
-    </w:p>
-    <w:p>
-      <w:pPr>
-        <w:numPr>
-          <w:ilvl w:val="0"/>
-          <w:numId w:val="4"/>
-        </w:numPr>
-        <w:rPr>
-          <w:rFonts w:ascii="Segoe UI Emoji" w:hAnsi="Segoe UI Emoji" w:cs="Segoe UI Emoji"/>
-          <w:b/>
-          <w:bCs/>
-        </w:rPr>
-      </w:pPr>
-      <w:r>
-        <w:rPr>
-          <w:rFonts w:ascii="Segoe UI Emoji" w:hAnsi="Segoe UI Emoji" w:cs="Segoe UI Emoji"/>
-          <w:b/>
-          <w:bCs/>
-        </w:rPr>
-        <w:t xml:space="preserve">HTML attributes </w:t>
-      </w:r>
-    </w:p>
-    <w:p>
-      <w:pPr>
-        <w:numPr>
-          <w:ilvl w:val="0"/>
-          <w:numId w:val="4"/>
-        </w:numPr>
-        <w:rPr>
-          <w:rFonts w:ascii="Segoe UI Emoji" w:hAnsi="Segoe UI Emoji" w:cs="Segoe UI Emoji"/>
-          <w:b/>
-          <w:bCs/>
-        </w:rPr>
-      </w:pPr>
-      <w:proofErr w:type="spellStart"/>
-      <w:r>
-        <w:rPr>
-          <w:rFonts w:ascii="Segoe UI Emoji" w:hAnsi="Segoe UI Emoji" w:cs="Segoe UI Emoji"/>
-          <w:b/>
-          <w:bCs/>
-        </w:rPr>
-        <w:t>localStorage</w:t>
-      </w:r>
-      <w:proofErr w:type="spellEnd"/>
-      <w:r>
-        <w:rPr>
-          <w:rFonts w:ascii="Segoe UI Emoji" w:hAnsi="Segoe UI Emoji" w:cs="Segoe UI Emoji"/>
-          <w:b/>
-          <w:bCs/>
-        </w:rPr>
-        <w:t xml:space="preserve"> / </w:t>
-      </w:r>
-      <w:proofErr w:type="spellStart"/>
-      <w:r>
-        <w:rPr>
-          <w:rFonts w:ascii="Segoe UI Emoji" w:hAnsi="Segoe UI Emoji" w:cs="Segoe UI Emoji"/>
-          <w:b/>
-          <w:bCs/>
-        </w:rPr>
-        <w:t>sessionStorage</w:t>
-      </w:r>
-      <w:proofErr w:type="spellEnd"/>
-      <w:r>
-        <w:rPr>
-          <w:rFonts w:ascii="Segoe UI Emoji" w:hAnsi="Segoe UI Emoji" w:cs="Segoe UI Emoji"/>
-          <w:b/>
-          <w:bCs/>
-        </w:rPr>
-        <w:t xml:space="preserve"> / cookies </w:t>
-      </w:r>
-    </w:p>
-    <w:p>
-      <w:pPr>
-        <w:numPr>
-          <w:ilvl w:val="0"/>
-          <w:numId w:val="4"/>
-        </w:numPr>
-        <w:rPr>
-          <w:rFonts w:ascii="Segoe UI Emoji" w:hAnsi="Segoe UI Emoji" w:cs="Segoe UI Emoji"/>
-          <w:b/>
-          <w:bCs/>
-        </w:rPr>
-      </w:pPr>
-      <w:r>
-        <w:rPr>
-          <w:rFonts w:ascii="Segoe UI Emoji" w:hAnsi="Segoe UI Emoji" w:cs="Segoe UI Emoji"/>
-          <w:b/>
-          <w:bCs/>
-        </w:rPr>
-        <w:t xml:space="preserve">async vs </w:t>
-      </w:r>
-      <w:proofErr w:type="gramStart"/>
-      <w:r>
-        <w:rPr>
-          <w:rFonts w:ascii="Segoe UI Emoji" w:hAnsi="Segoe UI Emoji" w:cs="Segoe UI Emoji"/>
-          <w:b/>
-          <w:bCs/>
-        </w:rPr>
-        <w:t>defer</w:t>
-      </w:r>
-      <w:proofErr w:type="gramEnd"/>
-      <w:r>
-        <w:rPr>
-          <w:rFonts w:ascii="Segoe UI Emoji" w:hAnsi="Segoe UI Emoji" w:cs="Segoe UI Emoji"/>
-          <w:b/>
-          <w:bCs/>
-        </w:rPr>
-        <w:t xml:space="preserve"> </w:t>
-      </w:r>
-    </w:p>
-    <w:p>
-      <w:pPr>
-        <w:numPr>
-          <w:ilvl w:val="0"/>
-          <w:numId w:val="4"/>
-        </w:numPr>
-        <w:rPr>
-          <w:rFonts w:ascii="Segoe UI Emoji" w:hAnsi="Segoe UI Emoji" w:cs="Segoe UI Emoji"/>
-          <w:b/>
-          <w:bCs/>
-        </w:rPr>
-      </w:pPr>
-      <w:r>
-        <w:rPr>
-          <w:rFonts w:ascii="Segoe UI Emoji" w:hAnsi="Segoe UI Emoji" w:cs="Segoe UI Emoji"/>
-          <w:b/>
-          <w:bCs/>
-        </w:rPr>
-        <w:t xml:space="preserve">Accessibility and SEO </w:t>
-      </w:r>
-    </w:p>
-    <w:p>
-      <w:pPr>
-        <w:rPr>
-          <w:rFonts w:ascii="Segoe UI Emoji" w:hAnsi="Segoe UI Emoji" w:cs="Segoe UI Emoji"/>
-          <w:b/>
-          <w:bCs/>
-        </w:rPr>
-      </w:pPr>
-      <w:r>
-        <w:rPr>
-          <w:rFonts w:ascii="Segoe UI Emoji" w:hAnsi="Segoe UI Emoji" w:cs="Segoe UI Emoji"/>
-          <w:b/>
-          <w:bCs/>
-        </w:rPr>
-        <w:t>Interview tip: Don't just memorize the answers. Practice explaining each answer in 2–4 simple English sentences. This will help you with both your HTML interview and spoken English.</w:t>
-      </w:r>
-    </w:p>
-    <w:p>
-      <w:pPr>
-        <w:rPr>
-          <w:rFonts w:ascii="Segoe UI Emoji" w:hAnsi="Segoe UI Emoji" w:cs="Segoe UI Emoji"/>
-          <w:b/>
-          <w:bCs/>
-          <w:vanish/>
-        </w:rPr>
-      </w:pPr>
-      <w:r>
-        <w:rPr>
-          <w:rFonts w:ascii="Segoe UI Emoji" w:hAnsi="Segoe UI Emoji" w:cs="Segoe UI Emoji"/>
-          <w:b/>
-          <w:bCs/>
-          <w:vanish/>
-        </w:rPr>
-        <w:t>Top of Form</w:t>
-      </w:r>
-    </w:p>
-    <w:p>
-      <w:pPr>
-        <w:rPr>
-          <w:rFonts w:ascii="Segoe UI Emoji" w:hAnsi="Segoe UI Emoji" w:cs="Segoe UI Emoji"/>
-          <w:b/>
-          <w:bCs/>
-        </w:rPr>
-      </w:pPr>
-    </w:p>
-    <w:p>
-      <w:pPr>
-        <w:rPr>
-          <w:rFonts w:ascii="Segoe UI Emoji" w:hAnsi="Segoe UI Emoji" w:cs="Segoe UI Emoji"/>
-          <w:b/>
-          <w:bCs/>
-          <w:vanish/>
-        </w:rPr>
-      </w:pPr>
-      <w:r>
-        <w:rPr>
-          <w:rFonts w:ascii="Segoe UI Emoji" w:hAnsi="Segoe UI Emoji" w:cs="Segoe UI Emoji"/>
-          <w:b/>
-          <w:bCs/>
-          <w:vanish/>
-        </w:rPr>
         <w:t>Bottom of Form</w:t>
       </w:r>
     </w:p>
-    <w:p/>
+    <w:p>
+      <w:pPr>
+        <w:spacing w:line="240" w:lineRule="auto"/>
+      </w:pPr>
+    </w:p>
     <w:sectPr>
       <w:pgSz w:w="11906" w:h="16838"/>
       <w:pgMar w:top="1440" w:right="1440" w:bottom="1440" w:left="1440" w:header="708" w:footer="708" w:gutter="0"/>

</xml_diff>

<commit_message>
some interview questions and solution, some dsa question, input validator(express-validator and zod) and crud operation in express js with different routes
</commit_message>
<xml_diff>
--- a/interview questions/1.html.docx
+++ b/interview questions/1.html.docx
@@ -3714,7 +3714,7 @@
           <w:bCs/>
         </w:rPr>
         <w:pict w14:anchorId="01ECEF8F">
-          <v:rect id="_x0000_i1087" style="width:0;height:1.5pt" o:hralign="center" o:hrstd="t" o:hr="t" fillcolor="#a0a0a0" stroked="f"/>
+          <v:rect id="_x0000_i1033" style="width:0;height:1.5pt" o:hralign="center" o:hrstd="t" o:hr="t" fillcolor="#a0a0a0" stroked="f"/>
         </w:pict>
       </w:r>
     </w:p>
@@ -4000,7 +4000,7 @@
           <w:bCs/>
         </w:rPr>
         <w:pict w14:anchorId="79AEE9EF">
-          <v:rect id="_x0000_i1088" style="width:0;height:1.5pt" o:hralign="center" o:hrstd="t" o:hr="t" fillcolor="#a0a0a0" stroked="f"/>
+          <v:rect id="_x0000_i1034" style="width:0;height:1.5pt" o:hralign="center" o:hrstd="t" o:hr="t" fillcolor="#a0a0a0" stroked="f"/>
         </w:pict>
       </w:r>
     </w:p>
@@ -4202,7 +4202,7 @@
           <w:bCs/>
         </w:rPr>
         <w:pict w14:anchorId="46515D61">
-          <v:rect id="_x0000_i1089" style="width:0;height:1.5pt" o:hralign="center" o:hrstd="t" o:hr="t" fillcolor="#a0a0a0" stroked="f"/>
+          <v:rect id="_x0000_i1035" style="width:0;height:1.5pt" o:hralign="center" o:hrstd="t" o:hr="t" fillcolor="#a0a0a0" stroked="f"/>
         </w:pict>
       </w:r>
     </w:p>
@@ -4537,7 +4537,7 @@
           <w:bCs/>
         </w:rPr>
         <w:pict w14:anchorId="3A781DD7">
-          <v:rect id="_x0000_i1090" style="width:0;height:1.5pt" o:hralign="center" o:hrstd="t" o:hr="t" fillcolor="#a0a0a0" stroked="f"/>
+          <v:rect id="_x0000_i1036" style="width:0;height:1.5pt" o:hralign="center" o:hrstd="t" o:hr="t" fillcolor="#a0a0a0" stroked="f"/>
         </w:pict>
       </w:r>
     </w:p>
@@ -4799,7 +4799,7 @@
         </w:rPr>
         <w:lastRenderedPageBreak/>
         <w:pict w14:anchorId="2D1DA583">
-          <v:rect id="_x0000_i1091" style="width:0;height:1.5pt" o:hralign="center" o:hrstd="t" o:hr="t" fillcolor="#a0a0a0" stroked="f"/>
+          <v:rect id="_x0000_i1037" style="width:0;height:1.5pt" o:hralign="center" o:hrstd="t" o:hr="t" fillcolor="#a0a0a0" stroked="f"/>
         </w:pict>
       </w:r>
     </w:p>
@@ -5029,7 +5029,7 @@
           <w:bCs/>
         </w:rPr>
         <w:pict w14:anchorId="65635559">
-          <v:rect id="_x0000_i1092" style="width:0;height:1.5pt" o:hralign="center" o:hrstd="t" o:hr="t" fillcolor="#a0a0a0" stroked="f"/>
+          <v:rect id="_x0000_i1038" style="width:0;height:1.5pt" o:hralign="center" o:hrstd="t" o:hr="t" fillcolor="#a0a0a0" stroked="f"/>
         </w:pict>
       </w:r>
     </w:p>
@@ -5260,7 +5260,7 @@
           <w:bCs/>
         </w:rPr>
         <w:pict w14:anchorId="2ECE3177">
-          <v:rect id="_x0000_i1093" style="width:0;height:1.5pt" o:hralign="center" o:hrstd="t" o:hr="t" fillcolor="#a0a0a0" stroked="f"/>
+          <v:rect id="_x0000_i1039" style="width:0;height:1.5pt" o:hralign="center" o:hrstd="t" o:hr="t" fillcolor="#a0a0a0" stroked="f"/>
         </w:pict>
       </w:r>
     </w:p>
@@ -5616,7 +5616,7 @@
           <w:bCs/>
         </w:rPr>
         <w:pict w14:anchorId="374C7EEB">
-          <v:rect id="_x0000_i1094" style="width:0;height:1.5pt" o:hralign="center" o:hrstd="t" o:hr="t" fillcolor="#a0a0a0" stroked="f"/>
+          <v:rect id="_x0000_i1040" style="width:0;height:1.5pt" o:hralign="center" o:hrstd="t" o:hr="t" fillcolor="#a0a0a0" stroked="f"/>
         </w:pict>
       </w:r>
     </w:p>
@@ -6066,7 +6066,7 @@
           <w:bCs/>
         </w:rPr>
         <w:pict w14:anchorId="0CADCB4D">
-          <v:rect id="_x0000_i1095" style="width:0;height:1.5pt" o:hralign="center" o:hrstd="t" o:hr="t" fillcolor="#a0a0a0" stroked="f"/>
+          <v:rect id="_x0000_i1041" style="width:0;height:1.5pt" o:hralign="center" o:hrstd="t" o:hr="t" fillcolor="#a0a0a0" stroked="f"/>
         </w:pict>
       </w:r>
     </w:p>
@@ -6454,18 +6454,3579 @@
           <w:rFonts w:ascii="Segoe UI Emoji" w:hAnsi="Segoe UI Emoji" w:cs="Segoe UI Emoji"/>
           <w:b/>
           <w:bCs/>
+        </w:rPr>
+      </w:pPr>
+      <w:r>
+        <w:rPr>
+          <w:rFonts w:ascii="Segoe UI Emoji" w:hAnsi="Segoe UI Emoji" w:cs="Segoe UI Emoji"/>
+          <w:b/>
+          <w:bCs/>
           <w:vanish/>
         </w:rPr>
-      </w:pPr>
-      <w:r>
+        <w:t>Bottom of Form</w:t>
+      </w:r>
+    </w:p>
+    <w:p>
+      <w:pPr>
+        <w:spacing w:line="240" w:lineRule="auto"/>
+        <w:jc w:val="both"/>
+        <w:rPr>
+          <w:rFonts w:ascii="Segoe UI Emoji" w:hAnsi="Segoe UI Emoji" w:cs="Segoe UI Emoji"/>
+          <w:b/>
+          <w:bCs/>
+        </w:rPr>
+      </w:pPr>
+      <w:r>
+        <w:rPr>
+          <w:rFonts w:ascii="Segoe UI Emoji" w:hAnsi="Segoe UI Emoji" w:cs="Segoe UI Emoji"/>
+          <w:b/>
+          <w:bCs/>
+        </w:rPr>
+        <w:t>21. What is HTML Validation?</w:t>
+      </w:r>
+    </w:p>
+    <w:p>
+      <w:pPr>
+        <w:spacing w:line="240" w:lineRule="auto"/>
+        <w:jc w:val="both"/>
+        <w:rPr>
+          <w:rFonts w:ascii="Segoe UI Emoji" w:hAnsi="Segoe UI Emoji" w:cs="Segoe UI Emoji"/>
+          <w:b/>
+          <w:bCs/>
+        </w:rPr>
+      </w:pPr>
+      <w:r>
+        <w:rPr>
+          <w:rFonts w:ascii="Segoe UI Emoji" w:hAnsi="Segoe UI Emoji" w:cs="Segoe UI Emoji"/>
+          <w:b/>
+          <w:bCs/>
+        </w:rPr>
+        <w:t>Answer:</w:t>
+      </w:r>
+      <w:r>
+        <w:rPr>
+          <w:rFonts w:ascii="Segoe UI Emoji" w:hAnsi="Segoe UI Emoji" w:cs="Segoe UI Emoji"/>
+          <w:b/>
+          <w:bCs/>
+        </w:rPr>
+        <w:br/>
+        <w:t>HTML validation is the process of checking whether HTML code follows the HTML standards and syntax rules.</w:t>
+      </w:r>
+    </w:p>
+    <w:p>
+      <w:pPr>
+        <w:spacing w:line="240" w:lineRule="auto"/>
+        <w:jc w:val="both"/>
+        <w:rPr>
+          <w:rFonts w:ascii="Segoe UI Emoji" w:hAnsi="Segoe UI Emoji" w:cs="Segoe UI Emoji"/>
+          <w:b/>
+          <w:bCs/>
+        </w:rPr>
+      </w:pPr>
+      <w:r>
+        <w:rPr>
+          <w:rFonts w:ascii="Segoe UI Emoji" w:hAnsi="Segoe UI Emoji" w:cs="Segoe UI Emoji"/>
+          <w:b/>
+          <w:bCs/>
+        </w:rPr>
+        <w:t>It helps identify errors such as:</w:t>
+      </w:r>
+    </w:p>
+    <w:p>
+      <w:pPr>
+        <w:numPr>
+          <w:ilvl w:val="0"/>
+          <w:numId w:val="8"/>
+        </w:numPr>
+        <w:spacing w:line="240" w:lineRule="auto"/>
+        <w:jc w:val="both"/>
+        <w:rPr>
+          <w:rFonts w:ascii="Segoe UI Emoji" w:hAnsi="Segoe UI Emoji" w:cs="Segoe UI Emoji"/>
+          <w:b/>
+          <w:bCs/>
+        </w:rPr>
+      </w:pPr>
+      <w:r>
+        <w:rPr>
+          <w:rFonts w:ascii="Segoe UI Emoji" w:hAnsi="Segoe UI Emoji" w:cs="Segoe UI Emoji"/>
+          <w:b/>
+          <w:bCs/>
+        </w:rPr>
+        <w:t xml:space="preserve">Missing closing tags </w:t>
+      </w:r>
+    </w:p>
+    <w:p>
+      <w:pPr>
+        <w:numPr>
+          <w:ilvl w:val="0"/>
+          <w:numId w:val="8"/>
+        </w:numPr>
+        <w:spacing w:line="240" w:lineRule="auto"/>
+        <w:jc w:val="both"/>
+        <w:rPr>
+          <w:rFonts w:ascii="Segoe UI Emoji" w:hAnsi="Segoe UI Emoji" w:cs="Segoe UI Emoji"/>
+          <w:b/>
+          <w:bCs/>
+        </w:rPr>
+      </w:pPr>
+      <w:r>
+        <w:rPr>
+          <w:rFonts w:ascii="Segoe UI Emoji" w:hAnsi="Segoe UI Emoji" w:cs="Segoe UI Emoji"/>
+          <w:b/>
+          <w:bCs/>
+        </w:rPr>
+        <w:t xml:space="preserve">Incorrect nesting </w:t>
+      </w:r>
+    </w:p>
+    <w:p>
+      <w:pPr>
+        <w:numPr>
+          <w:ilvl w:val="0"/>
+          <w:numId w:val="8"/>
+        </w:numPr>
+        <w:spacing w:line="240" w:lineRule="auto"/>
+        <w:jc w:val="both"/>
+        <w:rPr>
+          <w:rFonts w:ascii="Segoe UI Emoji" w:hAnsi="Segoe UI Emoji" w:cs="Segoe UI Emoji"/>
+          <w:b/>
+          <w:bCs/>
+        </w:rPr>
+      </w:pPr>
+      <w:r>
+        <w:rPr>
+          <w:rFonts w:ascii="Segoe UI Emoji" w:hAnsi="Segoe UI Emoji" w:cs="Segoe UI Emoji"/>
+          <w:b/>
+          <w:bCs/>
+        </w:rPr>
+        <w:t xml:space="preserve">Invalid attributes </w:t>
+      </w:r>
+    </w:p>
+    <w:p>
+      <w:pPr>
+        <w:numPr>
+          <w:ilvl w:val="0"/>
+          <w:numId w:val="8"/>
+        </w:numPr>
+        <w:spacing w:line="240" w:lineRule="auto"/>
+        <w:jc w:val="both"/>
+        <w:rPr>
+          <w:rFonts w:ascii="Segoe UI Emoji" w:hAnsi="Segoe UI Emoji" w:cs="Segoe UI Emoji"/>
+          <w:b/>
+          <w:bCs/>
+        </w:rPr>
+      </w:pPr>
+      <w:r>
+        <w:rPr>
+          <w:rFonts w:ascii="Segoe UI Emoji" w:hAnsi="Segoe UI Emoji" w:cs="Segoe UI Emoji"/>
+          <w:b/>
+          <w:bCs/>
+        </w:rPr>
+        <w:t xml:space="preserve">Duplicate or incorrect IDs </w:t>
+      </w:r>
+    </w:p>
+    <w:p>
+      <w:pPr>
+        <w:spacing w:line="240" w:lineRule="auto"/>
+        <w:jc w:val="both"/>
+        <w:rPr>
+          <w:rFonts w:ascii="Segoe UI Emoji" w:hAnsi="Segoe UI Emoji" w:cs="Segoe UI Emoji"/>
+          <w:b/>
+          <w:bCs/>
+        </w:rPr>
+      </w:pPr>
+      <w:r>
+        <w:rPr>
+          <w:rFonts w:ascii="Segoe UI Emoji" w:hAnsi="Segoe UI Emoji" w:cs="Segoe UI Emoji"/>
+          <w:b/>
+          <w:bCs/>
+        </w:rPr>
+        <w:t>Example:</w:t>
+      </w:r>
+    </w:p>
+    <w:p>
+      <w:pPr>
+        <w:spacing w:line="240" w:lineRule="auto"/>
+        <w:jc w:val="both"/>
+        <w:rPr>
+          <w:rFonts w:ascii="Segoe UI Emoji" w:hAnsi="Segoe UI Emoji" w:cs="Segoe UI Emoji"/>
+          <w:b/>
+          <w:bCs/>
+        </w:rPr>
+      </w:pPr>
+      <w:r>
+        <w:rPr>
+          <w:rFonts w:ascii="Segoe UI Emoji" w:hAnsi="Segoe UI Emoji" w:cs="Segoe UI Emoji"/>
+          <w:b/>
+          <w:bCs/>
+        </w:rPr>
+        <w:t>&lt;p&gt;Hello World&lt;/p&gt;</w:t>
+      </w:r>
+    </w:p>
+    <w:p>
+      <w:pPr>
+        <w:spacing w:line="240" w:lineRule="auto"/>
+        <w:jc w:val="both"/>
+        <w:rPr>
+          <w:rFonts w:ascii="Segoe UI Emoji" w:hAnsi="Segoe UI Emoji" w:cs="Segoe UI Emoji"/>
+          <w:b/>
+          <w:bCs/>
+        </w:rPr>
+      </w:pPr>
+      <w:r>
+        <w:rPr>
+          <w:rFonts w:ascii="Segoe UI Emoji" w:hAnsi="Segoe UI Emoji" w:cs="Segoe UI Emoji"/>
+          <w:b/>
+          <w:bCs/>
+        </w:rPr>
+        <w:t>A validator can check whether this code is valid HTML.</w:t>
+      </w:r>
+    </w:p>
+    <w:p>
+      <w:pPr>
+        <w:spacing w:line="240" w:lineRule="auto"/>
+        <w:jc w:val="both"/>
+        <w:rPr>
+          <w:rFonts w:ascii="Segoe UI Emoji" w:hAnsi="Segoe UI Emoji" w:cs="Segoe UI Emoji"/>
+          <w:b/>
+          <w:bCs/>
+        </w:rPr>
+      </w:pPr>
+      <w:r>
+        <w:rPr>
+          <w:rFonts w:ascii="Segoe UI Emoji" w:hAnsi="Segoe UI Emoji" w:cs="Segoe UI Emoji"/>
+          <w:b/>
+          <w:bCs/>
+        </w:rPr>
+        <w:t>Interview answer:</w:t>
+      </w:r>
+    </w:p>
+    <w:p>
+      <w:pPr>
+        <w:spacing w:line="240" w:lineRule="auto"/>
+        <w:jc w:val="both"/>
+        <w:rPr>
+          <w:rFonts w:ascii="Segoe UI Emoji" w:hAnsi="Segoe UI Emoji" w:cs="Segoe UI Emoji"/>
+          <w:b/>
+          <w:bCs/>
+        </w:rPr>
+      </w:pPr>
+      <w:r>
+        <w:rPr>
+          <w:rFonts w:ascii="Segoe UI Emoji" w:hAnsi="Segoe UI Emoji" w:cs="Segoe UI Emoji"/>
+          <w:b/>
+          <w:bCs/>
+        </w:rPr>
+        <w:t>"HTML validation helps developers find syntax and structural errors in HTML code and ensures that the page follows web standards."</w:t>
+      </w:r>
+    </w:p>
+    <w:p>
+      <w:pPr>
+        <w:spacing w:line="240" w:lineRule="auto"/>
+        <w:jc w:val="both"/>
+        <w:rPr>
+          <w:rFonts w:ascii="Segoe UI Emoji" w:hAnsi="Segoe UI Emoji" w:cs="Segoe UI Emoji"/>
+          <w:b/>
+          <w:bCs/>
+        </w:rPr>
+      </w:pPr>
+      <w:r>
+        <w:rPr>
+          <w:rFonts w:ascii="Segoe UI Emoji" w:hAnsi="Segoe UI Emoji" w:cs="Segoe UI Emoji"/>
+          <w:b/>
+          <w:bCs/>
+        </w:rPr>
+        <w:lastRenderedPageBreak/>
+        <w:pict w14:anchorId="35D29CB3">
+          <v:rect id="_x0000_i1042" style="width:0;height:1.5pt" o:hralign="center" o:hrstd="t" o:hr="t" fillcolor="#a0a0a0" stroked="f"/>
+        </w:pict>
+      </w:r>
+    </w:p>
+    <w:p>
+      <w:pPr>
+        <w:spacing w:line="240" w:lineRule="auto"/>
+        <w:jc w:val="both"/>
+        <w:rPr>
+          <w:rFonts w:ascii="Segoe UI Emoji" w:hAnsi="Segoe UI Emoji" w:cs="Segoe UI Emoji"/>
+          <w:b/>
+          <w:bCs/>
+        </w:rPr>
+      </w:pPr>
+      <w:r>
+        <w:rPr>
+          <w:rFonts w:ascii="Segoe UI Emoji" w:hAnsi="Segoe UI Emoji" w:cs="Segoe UI Emoji"/>
+          <w:b/>
+          <w:bCs/>
+        </w:rPr>
+        <w:t>22. What are Meta Tags in HTML?</w:t>
+      </w:r>
+    </w:p>
+    <w:p>
+      <w:pPr>
+        <w:spacing w:line="240" w:lineRule="auto"/>
+        <w:jc w:val="both"/>
+        <w:rPr>
+          <w:rFonts w:ascii="Segoe UI Emoji" w:hAnsi="Segoe UI Emoji" w:cs="Segoe UI Emoji"/>
+          <w:b/>
+          <w:bCs/>
+        </w:rPr>
+      </w:pPr>
+      <w:r>
+        <w:rPr>
+          <w:rFonts w:ascii="Segoe UI Emoji" w:hAnsi="Segoe UI Emoji" w:cs="Segoe UI Emoji"/>
+          <w:b/>
+          <w:bCs/>
+        </w:rPr>
+        <w:t>Answer:</w:t>
+      </w:r>
+      <w:r>
+        <w:rPr>
+          <w:rFonts w:ascii="Segoe UI Emoji" w:hAnsi="Segoe UI Emoji" w:cs="Segoe UI Emoji"/>
+          <w:b/>
+          <w:bCs/>
+        </w:rPr>
+        <w:br/>
+        <w:t>Meta tags provide information about a web page to browsers and search engines. They are placed inside the &lt;head&gt; section.</w:t>
+      </w:r>
+    </w:p>
+    <w:p>
+      <w:pPr>
+        <w:spacing w:line="240" w:lineRule="auto"/>
+        <w:jc w:val="both"/>
+        <w:rPr>
+          <w:rFonts w:ascii="Segoe UI Emoji" w:hAnsi="Segoe UI Emoji" w:cs="Segoe UI Emoji"/>
+          <w:b/>
+          <w:bCs/>
+        </w:rPr>
+      </w:pPr>
+      <w:r>
+        <w:rPr>
+          <w:rFonts w:ascii="Segoe UI Emoji" w:hAnsi="Segoe UI Emoji" w:cs="Segoe UI Emoji"/>
+          <w:b/>
+          <w:bCs/>
+        </w:rPr>
+        <w:t>Example:</w:t>
+      </w:r>
+    </w:p>
+    <w:p>
+      <w:pPr>
+        <w:spacing w:line="240" w:lineRule="auto"/>
+        <w:jc w:val="both"/>
+        <w:rPr>
+          <w:rFonts w:ascii="Segoe UI Emoji" w:hAnsi="Segoe UI Emoji" w:cs="Segoe UI Emoji"/>
+          <w:b/>
+          <w:bCs/>
+        </w:rPr>
+      </w:pPr>
+      <w:r>
+        <w:rPr>
+          <w:rFonts w:ascii="Segoe UI Emoji" w:hAnsi="Segoe UI Emoji" w:cs="Segoe UI Emoji"/>
+          <w:b/>
+          <w:bCs/>
+        </w:rPr>
+        <w:t>&lt;head&gt;</w:t>
+      </w:r>
+    </w:p>
+    <w:p>
+      <w:pPr>
+        <w:spacing w:line="240" w:lineRule="auto"/>
+        <w:jc w:val="both"/>
+        <w:rPr>
+          <w:rFonts w:ascii="Segoe UI Emoji" w:hAnsi="Segoe UI Emoji" w:cs="Segoe UI Emoji"/>
+          <w:b/>
+          <w:bCs/>
+        </w:rPr>
+      </w:pPr>
+      <w:r>
+        <w:rPr>
+          <w:rFonts w:ascii="Segoe UI Emoji" w:hAnsi="Segoe UI Emoji" w:cs="Segoe UI Emoji"/>
+          <w:b/>
+          <w:bCs/>
+        </w:rPr>
+        <w:t xml:space="preserve">    &lt;meta charset="UTF-8"&gt;</w:t>
+      </w:r>
+    </w:p>
+    <w:p>
+      <w:pPr>
+        <w:spacing w:line="240" w:lineRule="auto"/>
+        <w:jc w:val="both"/>
+        <w:rPr>
+          <w:rFonts w:ascii="Segoe UI Emoji" w:hAnsi="Segoe UI Emoji" w:cs="Segoe UI Emoji"/>
+          <w:b/>
+          <w:bCs/>
+        </w:rPr>
+      </w:pPr>
+    </w:p>
+    <w:p>
+      <w:pPr>
+        <w:spacing w:line="240" w:lineRule="auto"/>
+        <w:jc w:val="both"/>
+        <w:rPr>
+          <w:rFonts w:ascii="Segoe UI Emoji" w:hAnsi="Segoe UI Emoji" w:cs="Segoe UI Emoji"/>
+          <w:b/>
+          <w:bCs/>
+        </w:rPr>
+      </w:pPr>
+      <w:r>
+        <w:rPr>
+          <w:rFonts w:ascii="Segoe UI Emoji" w:hAnsi="Segoe UI Emoji" w:cs="Segoe UI Emoji"/>
+          <w:b/>
+          <w:bCs/>
+        </w:rPr>
+        <w:t xml:space="preserve">    &lt;meta</w:t>
+      </w:r>
+    </w:p>
+    <w:p>
+      <w:pPr>
+        <w:spacing w:line="240" w:lineRule="auto"/>
+        <w:jc w:val="both"/>
+        <w:rPr>
+          <w:rFonts w:ascii="Segoe UI Emoji" w:hAnsi="Segoe UI Emoji" w:cs="Segoe UI Emoji"/>
+          <w:b/>
+          <w:bCs/>
+        </w:rPr>
+      </w:pPr>
+      <w:r>
+        <w:rPr>
+          <w:rFonts w:ascii="Segoe UI Emoji" w:hAnsi="Segoe UI Emoji" w:cs="Segoe UI Emoji"/>
+          <w:b/>
+          <w:bCs/>
+        </w:rPr>
+        <w:t xml:space="preserve">        name="description"</w:t>
+      </w:r>
+    </w:p>
+    <w:p>
+      <w:pPr>
+        <w:spacing w:line="240" w:lineRule="auto"/>
+        <w:jc w:val="both"/>
+        <w:rPr>
+          <w:rFonts w:ascii="Segoe UI Emoji" w:hAnsi="Segoe UI Emoji" w:cs="Segoe UI Emoji"/>
+          <w:b/>
+          <w:bCs/>
+        </w:rPr>
+      </w:pPr>
+      <w:r>
+        <w:rPr>
+          <w:rFonts w:ascii="Segoe UI Emoji" w:hAnsi="Segoe UI Emoji" w:cs="Segoe UI Emoji"/>
+          <w:b/>
+          <w:bCs/>
+        </w:rPr>
+        <w:t xml:space="preserve">        content="Learn MERN Stack Development"</w:t>
+      </w:r>
+    </w:p>
+    <w:p>
+      <w:pPr>
+        <w:spacing w:line="240" w:lineRule="auto"/>
+        <w:jc w:val="both"/>
+        <w:rPr>
+          <w:rFonts w:ascii="Segoe UI Emoji" w:hAnsi="Segoe UI Emoji" w:cs="Segoe UI Emoji"/>
+          <w:b/>
+          <w:bCs/>
+        </w:rPr>
+      </w:pPr>
+      <w:r>
+        <w:rPr>
+          <w:rFonts w:ascii="Segoe UI Emoji" w:hAnsi="Segoe UI Emoji" w:cs="Segoe UI Emoji"/>
+          <w:b/>
+          <w:bCs/>
+        </w:rPr>
+        <w:t xml:space="preserve">    &gt;</w:t>
+      </w:r>
+    </w:p>
+    <w:p>
+      <w:pPr>
+        <w:spacing w:line="240" w:lineRule="auto"/>
+        <w:jc w:val="both"/>
+        <w:rPr>
+          <w:rFonts w:ascii="Segoe UI Emoji" w:hAnsi="Segoe UI Emoji" w:cs="Segoe UI Emoji"/>
+          <w:b/>
+          <w:bCs/>
+        </w:rPr>
+      </w:pPr>
+    </w:p>
+    <w:p>
+      <w:pPr>
+        <w:spacing w:line="240" w:lineRule="auto"/>
+        <w:jc w:val="both"/>
+        <w:rPr>
+          <w:rFonts w:ascii="Segoe UI Emoji" w:hAnsi="Segoe UI Emoji" w:cs="Segoe UI Emoji"/>
+          <w:b/>
+          <w:bCs/>
+        </w:rPr>
+      </w:pPr>
+      <w:r>
+        <w:rPr>
+          <w:rFonts w:ascii="Segoe UI Emoji" w:hAnsi="Segoe UI Emoji" w:cs="Segoe UI Emoji"/>
+          <w:b/>
+          <w:bCs/>
+        </w:rPr>
+        <w:t xml:space="preserve">    &lt;meta</w:t>
+      </w:r>
+    </w:p>
+    <w:p>
+      <w:pPr>
+        <w:spacing w:line="240" w:lineRule="auto"/>
+        <w:jc w:val="both"/>
+        <w:rPr>
+          <w:rFonts w:ascii="Segoe UI Emoji" w:hAnsi="Segoe UI Emoji" w:cs="Segoe UI Emoji"/>
+          <w:b/>
+          <w:bCs/>
+        </w:rPr>
+      </w:pPr>
+      <w:r>
+        <w:rPr>
+          <w:rFonts w:ascii="Segoe UI Emoji" w:hAnsi="Segoe UI Emoji" w:cs="Segoe UI Emoji"/>
+          <w:b/>
+          <w:bCs/>
+        </w:rPr>
+        <w:t xml:space="preserve">        name="viewport"</w:t>
+      </w:r>
+    </w:p>
+    <w:p>
+      <w:pPr>
+        <w:spacing w:line="240" w:lineRule="auto"/>
+        <w:jc w:val="both"/>
+        <w:rPr>
+          <w:rFonts w:ascii="Segoe UI Emoji" w:hAnsi="Segoe UI Emoji" w:cs="Segoe UI Emoji"/>
+          <w:b/>
+          <w:bCs/>
+        </w:rPr>
+      </w:pPr>
+      <w:r>
+        <w:rPr>
+          <w:rFonts w:ascii="Segoe UI Emoji" w:hAnsi="Segoe UI Emoji" w:cs="Segoe UI Emoji"/>
+          <w:b/>
+          <w:bCs/>
+        </w:rPr>
+        <w:t xml:space="preserve">        content="width=device-width, initial-scale=1.0"</w:t>
+      </w:r>
+    </w:p>
+    <w:p>
+      <w:pPr>
+        <w:spacing w:line="240" w:lineRule="auto"/>
+        <w:jc w:val="both"/>
+        <w:rPr>
+          <w:rFonts w:ascii="Segoe UI Emoji" w:hAnsi="Segoe UI Emoji" w:cs="Segoe UI Emoji"/>
+          <w:b/>
+          <w:bCs/>
+        </w:rPr>
+      </w:pPr>
+      <w:r>
+        <w:rPr>
+          <w:rFonts w:ascii="Segoe UI Emoji" w:hAnsi="Segoe UI Emoji" w:cs="Segoe UI Emoji"/>
+          <w:b/>
+          <w:bCs/>
+        </w:rPr>
+        <w:t xml:space="preserve">    &gt;</w:t>
+      </w:r>
+    </w:p>
+    <w:p>
+      <w:pPr>
+        <w:spacing w:line="240" w:lineRule="auto"/>
+        <w:jc w:val="both"/>
+        <w:rPr>
+          <w:rFonts w:ascii="Segoe UI Emoji" w:hAnsi="Segoe UI Emoji" w:cs="Segoe UI Emoji"/>
+          <w:b/>
+          <w:bCs/>
+        </w:rPr>
+      </w:pPr>
+    </w:p>
+    <w:p>
+      <w:pPr>
+        <w:spacing w:line="240" w:lineRule="auto"/>
+        <w:jc w:val="both"/>
+        <w:rPr>
+          <w:rFonts w:ascii="Segoe UI Emoji" w:hAnsi="Segoe UI Emoji" w:cs="Segoe UI Emoji"/>
+          <w:b/>
+          <w:bCs/>
+        </w:rPr>
+      </w:pPr>
+      <w:r>
+        <w:rPr>
+          <w:rFonts w:ascii="Segoe UI Emoji" w:hAnsi="Segoe UI Emoji" w:cs="Segoe UI Emoji"/>
+          <w:b/>
+          <w:bCs/>
+        </w:rPr>
+        <w:t xml:space="preserve">    &lt;title&gt;MERN Developer&lt;/title&gt;</w:t>
+      </w:r>
+    </w:p>
+    <w:p>
+      <w:pPr>
+        <w:spacing w:line="240" w:lineRule="auto"/>
+        <w:jc w:val="both"/>
+        <w:rPr>
+          <w:rFonts w:ascii="Segoe UI Emoji" w:hAnsi="Segoe UI Emoji" w:cs="Segoe UI Emoji"/>
+          <w:b/>
+          <w:bCs/>
+        </w:rPr>
+      </w:pPr>
+      <w:r>
+        <w:rPr>
+          <w:rFonts w:ascii="Segoe UI Emoji" w:hAnsi="Segoe UI Emoji" w:cs="Segoe UI Emoji"/>
+          <w:b/>
+          <w:bCs/>
+        </w:rPr>
+        <w:t>&lt;/head&gt;</w:t>
+      </w:r>
+    </w:p>
+    <w:p>
+      <w:pPr>
+        <w:spacing w:line="240" w:lineRule="auto"/>
+        <w:jc w:val="both"/>
+        <w:rPr>
+          <w:rFonts w:ascii="Segoe UI Emoji" w:hAnsi="Segoe UI Emoji" w:cs="Segoe UI Emoji"/>
+          <w:b/>
+          <w:bCs/>
+        </w:rPr>
+      </w:pPr>
+      <w:r>
+        <w:rPr>
+          <w:rFonts w:ascii="Segoe UI Emoji" w:hAnsi="Segoe UI Emoji" w:cs="Segoe UI Emoji"/>
+          <w:b/>
+          <w:bCs/>
+        </w:rPr>
+        <w:t>Common meta tags include:</w:t>
+      </w:r>
+    </w:p>
+    <w:p>
+      <w:pPr>
+        <w:numPr>
+          <w:ilvl w:val="0"/>
+          <w:numId w:val="9"/>
+        </w:numPr>
+        <w:spacing w:line="240" w:lineRule="auto"/>
+        <w:jc w:val="both"/>
+        <w:rPr>
+          <w:rFonts w:ascii="Segoe UI Emoji" w:hAnsi="Segoe UI Emoji" w:cs="Segoe UI Emoji"/>
+          <w:b/>
+          <w:bCs/>
+        </w:rPr>
+      </w:pPr>
+      <w:r>
+        <w:rPr>
+          <w:rFonts w:ascii="Segoe UI Emoji" w:hAnsi="Segoe UI Emoji" w:cs="Segoe UI Emoji"/>
+          <w:b/>
+          <w:bCs/>
+        </w:rPr>
+        <w:t xml:space="preserve">charset </w:t>
+      </w:r>
+    </w:p>
+    <w:p>
+      <w:pPr>
+        <w:numPr>
+          <w:ilvl w:val="0"/>
+          <w:numId w:val="9"/>
+        </w:numPr>
+        <w:spacing w:line="240" w:lineRule="auto"/>
+        <w:jc w:val="both"/>
+        <w:rPr>
+          <w:rFonts w:ascii="Segoe UI Emoji" w:hAnsi="Segoe UI Emoji" w:cs="Segoe UI Emoji"/>
+          <w:b/>
+          <w:bCs/>
+        </w:rPr>
+      </w:pPr>
+      <w:r>
+        <w:rPr>
+          <w:rFonts w:ascii="Segoe UI Emoji" w:hAnsi="Segoe UI Emoji" w:cs="Segoe UI Emoji"/>
+          <w:b/>
+          <w:bCs/>
+        </w:rPr>
+        <w:t xml:space="preserve">description </w:t>
+      </w:r>
+    </w:p>
+    <w:p>
+      <w:pPr>
+        <w:numPr>
+          <w:ilvl w:val="0"/>
+          <w:numId w:val="9"/>
+        </w:numPr>
+        <w:spacing w:line="240" w:lineRule="auto"/>
+        <w:jc w:val="both"/>
+        <w:rPr>
+          <w:rFonts w:ascii="Segoe UI Emoji" w:hAnsi="Segoe UI Emoji" w:cs="Segoe UI Emoji"/>
+          <w:b/>
+          <w:bCs/>
+        </w:rPr>
+      </w:pPr>
+      <w:r>
+        <w:rPr>
+          <w:rFonts w:ascii="Segoe UI Emoji" w:hAnsi="Segoe UI Emoji" w:cs="Segoe UI Emoji"/>
+          <w:b/>
+          <w:bCs/>
+        </w:rPr>
+        <w:t xml:space="preserve">viewport </w:t>
+      </w:r>
+    </w:p>
+    <w:p>
+      <w:pPr>
+        <w:numPr>
+          <w:ilvl w:val="0"/>
+          <w:numId w:val="9"/>
+        </w:numPr>
+        <w:spacing w:line="240" w:lineRule="auto"/>
+        <w:jc w:val="both"/>
+        <w:rPr>
+          <w:rFonts w:ascii="Segoe UI Emoji" w:hAnsi="Segoe UI Emoji" w:cs="Segoe UI Emoji"/>
+          <w:b/>
+          <w:bCs/>
+        </w:rPr>
+      </w:pPr>
+      <w:r>
+        <w:rPr>
+          <w:rFonts w:ascii="Segoe UI Emoji" w:hAnsi="Segoe UI Emoji" w:cs="Segoe UI Emoji"/>
+          <w:b/>
+          <w:bCs/>
+        </w:rPr>
+        <w:t xml:space="preserve">robots </w:t>
+      </w:r>
+    </w:p>
+    <w:p>
+      <w:pPr>
+        <w:spacing w:line="240" w:lineRule="auto"/>
+        <w:jc w:val="both"/>
+        <w:rPr>
+          <w:rFonts w:ascii="Segoe UI Emoji" w:hAnsi="Segoe UI Emoji" w:cs="Segoe UI Emoji"/>
+          <w:b/>
+          <w:bCs/>
+        </w:rPr>
+      </w:pPr>
+      <w:r>
+        <w:rPr>
+          <w:rFonts w:ascii="Segoe UI Emoji" w:hAnsi="Segoe UI Emoji" w:cs="Segoe UI Emoji"/>
+          <w:b/>
+          <w:bCs/>
+        </w:rPr>
+        <w:pict w14:anchorId="6BD2600F">
+          <v:rect id="_x0000_i1043" style="width:0;height:1.5pt" o:hralign="center" o:hrstd="t" o:hr="t" fillcolor="#a0a0a0" stroked="f"/>
+        </w:pict>
+      </w:r>
+    </w:p>
+    <w:p>
+      <w:pPr>
+        <w:spacing w:line="240" w:lineRule="auto"/>
+        <w:jc w:val="both"/>
+        <w:rPr>
+          <w:rFonts w:ascii="Segoe UI Emoji" w:hAnsi="Segoe UI Emoji" w:cs="Segoe UI Emoji"/>
+          <w:b/>
+          <w:bCs/>
+        </w:rPr>
+      </w:pPr>
+      <w:r>
+        <w:rPr>
+          <w:rFonts w:ascii="Segoe UI Emoji" w:hAnsi="Segoe UI Emoji" w:cs="Segoe UI Emoji"/>
+          <w:b/>
+          <w:bCs/>
+        </w:rPr>
+        <w:t>23. What is SEO in HTML?</w:t>
+      </w:r>
+    </w:p>
+    <w:p>
+      <w:pPr>
+        <w:spacing w:line="240" w:lineRule="auto"/>
+        <w:jc w:val="both"/>
+        <w:rPr>
+          <w:rFonts w:ascii="Segoe UI Emoji" w:hAnsi="Segoe UI Emoji" w:cs="Segoe UI Emoji"/>
+          <w:b/>
+          <w:bCs/>
+        </w:rPr>
+      </w:pPr>
+      <w:r>
+        <w:rPr>
+          <w:rFonts w:ascii="Segoe UI Emoji" w:hAnsi="Segoe UI Emoji" w:cs="Segoe UI Emoji"/>
+          <w:b/>
+          <w:bCs/>
+        </w:rPr>
+        <w:lastRenderedPageBreak/>
+        <w:t>Answer:</w:t>
+      </w:r>
+      <w:r>
+        <w:rPr>
+          <w:rFonts w:ascii="Segoe UI Emoji" w:hAnsi="Segoe UI Emoji" w:cs="Segoe UI Emoji"/>
+          <w:b/>
+          <w:bCs/>
+        </w:rPr>
+        <w:br/>
+        <w:t>SEO stands for Search Engine Optimization. It helps search engines understand the content of a webpage and can help improve its visibility in search results.</w:t>
+      </w:r>
+    </w:p>
+    <w:p>
+      <w:pPr>
+        <w:spacing w:line="240" w:lineRule="auto"/>
+        <w:jc w:val="both"/>
+        <w:rPr>
+          <w:rFonts w:ascii="Segoe UI Emoji" w:hAnsi="Segoe UI Emoji" w:cs="Segoe UI Emoji"/>
+          <w:b/>
+          <w:bCs/>
+        </w:rPr>
+      </w:pPr>
+      <w:r>
+        <w:rPr>
+          <w:rFonts w:ascii="Segoe UI Emoji" w:hAnsi="Segoe UI Emoji" w:cs="Segoe UI Emoji"/>
+          <w:b/>
+          <w:bCs/>
+        </w:rPr>
+        <w:t>Important HTML practices for SEO include:</w:t>
+      </w:r>
+    </w:p>
+    <w:p>
+      <w:pPr>
+        <w:spacing w:line="240" w:lineRule="auto"/>
+        <w:jc w:val="both"/>
+        <w:rPr>
+          <w:rFonts w:ascii="Segoe UI Emoji" w:hAnsi="Segoe UI Emoji" w:cs="Segoe UI Emoji"/>
+          <w:b/>
+          <w:bCs/>
+        </w:rPr>
+      </w:pPr>
+      <w:r>
+        <w:rPr>
+          <w:rFonts w:ascii="Segoe UI Emoji" w:hAnsi="Segoe UI Emoji" w:cs="Segoe UI Emoji"/>
+          <w:b/>
+          <w:bCs/>
+        </w:rPr>
+        <w:t>&lt;title&gt;MERN Stack Developer&lt;/title&gt;</w:t>
+      </w:r>
+    </w:p>
+    <w:p>
+      <w:pPr>
+        <w:spacing w:line="240" w:lineRule="auto"/>
+        <w:jc w:val="both"/>
+        <w:rPr>
+          <w:rFonts w:ascii="Segoe UI Emoji" w:hAnsi="Segoe UI Emoji" w:cs="Segoe UI Emoji"/>
+          <w:b/>
+          <w:bCs/>
+        </w:rPr>
+      </w:pPr>
+    </w:p>
+    <w:p>
+      <w:pPr>
+        <w:spacing w:line="240" w:lineRule="auto"/>
+        <w:jc w:val="both"/>
+        <w:rPr>
+          <w:rFonts w:ascii="Segoe UI Emoji" w:hAnsi="Segoe UI Emoji" w:cs="Segoe UI Emoji"/>
+          <w:b/>
+          <w:bCs/>
+        </w:rPr>
+      </w:pPr>
+      <w:r>
+        <w:rPr>
+          <w:rFonts w:ascii="Segoe UI Emoji" w:hAnsi="Segoe UI Emoji" w:cs="Segoe UI Emoji"/>
+          <w:b/>
+          <w:bCs/>
+        </w:rPr>
+        <w:t>&lt;meta</w:t>
+      </w:r>
+    </w:p>
+    <w:p>
+      <w:pPr>
+        <w:spacing w:line="240" w:lineRule="auto"/>
+        <w:jc w:val="both"/>
+        <w:rPr>
+          <w:rFonts w:ascii="Segoe UI Emoji" w:hAnsi="Segoe UI Emoji" w:cs="Segoe UI Emoji"/>
+          <w:b/>
+          <w:bCs/>
+        </w:rPr>
+      </w:pPr>
+      <w:r>
+        <w:rPr>
+          <w:rFonts w:ascii="Segoe UI Emoji" w:hAnsi="Segoe UI Emoji" w:cs="Segoe UI Emoji"/>
+          <w:b/>
+          <w:bCs/>
+        </w:rPr>
+        <w:t xml:space="preserve">    name="description"</w:t>
+      </w:r>
+    </w:p>
+    <w:p>
+      <w:pPr>
+        <w:spacing w:line="240" w:lineRule="auto"/>
+        <w:jc w:val="both"/>
+        <w:rPr>
+          <w:rFonts w:ascii="Segoe UI Emoji" w:hAnsi="Segoe UI Emoji" w:cs="Segoe UI Emoji"/>
+          <w:b/>
+          <w:bCs/>
+        </w:rPr>
+      </w:pPr>
+      <w:r>
+        <w:rPr>
+          <w:rFonts w:ascii="Segoe UI Emoji" w:hAnsi="Segoe UI Emoji" w:cs="Segoe UI Emoji"/>
+          <w:b/>
+          <w:bCs/>
+        </w:rPr>
+        <w:t xml:space="preserve">    content="Learn MERN Stack Development."</w:t>
+      </w:r>
+    </w:p>
+    <w:p>
+      <w:pPr>
+        <w:spacing w:line="240" w:lineRule="auto"/>
+        <w:jc w:val="both"/>
+        <w:rPr>
+          <w:rFonts w:ascii="Segoe UI Emoji" w:hAnsi="Segoe UI Emoji" w:cs="Segoe UI Emoji"/>
+          <w:b/>
+          <w:bCs/>
+        </w:rPr>
+      </w:pPr>
+      <w:r>
+        <w:rPr>
+          <w:rFonts w:ascii="Segoe UI Emoji" w:hAnsi="Segoe UI Emoji" w:cs="Segoe UI Emoji"/>
+          <w:b/>
+          <w:bCs/>
+        </w:rPr>
+        <w:t>&gt;</w:t>
+      </w:r>
+    </w:p>
+    <w:p>
+      <w:pPr>
+        <w:spacing w:line="240" w:lineRule="auto"/>
+        <w:jc w:val="both"/>
+        <w:rPr>
+          <w:rFonts w:ascii="Segoe UI Emoji" w:hAnsi="Segoe UI Emoji" w:cs="Segoe UI Emoji"/>
+          <w:b/>
+          <w:bCs/>
+        </w:rPr>
+      </w:pPr>
+    </w:p>
+    <w:p>
+      <w:pPr>
+        <w:spacing w:line="240" w:lineRule="auto"/>
+        <w:jc w:val="both"/>
+        <w:rPr>
+          <w:rFonts w:ascii="Segoe UI Emoji" w:hAnsi="Segoe UI Emoji" w:cs="Segoe UI Emoji"/>
+          <w:b/>
+          <w:bCs/>
+        </w:rPr>
+      </w:pPr>
+      <w:r>
+        <w:rPr>
+          <w:rFonts w:ascii="Segoe UI Emoji" w:hAnsi="Segoe UI Emoji" w:cs="Segoe UI Emoji"/>
+          <w:b/>
+          <w:bCs/>
+        </w:rPr>
+        <w:t>&lt;h1&gt;MERN Stack Development&lt;/h1&gt;</w:t>
+      </w:r>
+    </w:p>
+    <w:p>
+      <w:pPr>
+        <w:spacing w:line="240" w:lineRule="auto"/>
+        <w:jc w:val="both"/>
+        <w:rPr>
+          <w:rFonts w:ascii="Segoe UI Emoji" w:hAnsi="Segoe UI Emoji" w:cs="Segoe UI Emoji"/>
+          <w:b/>
+          <w:bCs/>
+        </w:rPr>
+      </w:pPr>
+    </w:p>
+    <w:p>
+      <w:pPr>
+        <w:spacing w:line="240" w:lineRule="auto"/>
+        <w:jc w:val="both"/>
+        <w:rPr>
+          <w:rFonts w:ascii="Segoe UI Emoji" w:hAnsi="Segoe UI Emoji" w:cs="Segoe UI Emoji"/>
+          <w:b/>
+          <w:bCs/>
+        </w:rPr>
+      </w:pPr>
+      <w:r>
+        <w:rPr>
+          <w:rFonts w:ascii="Segoe UI Emoji" w:hAnsi="Segoe UI Emoji" w:cs="Segoe UI Emoji"/>
+          <w:b/>
+          <w:bCs/>
+        </w:rPr>
+        <w:t>&lt;</w:t>
+      </w:r>
+      <w:proofErr w:type="spellStart"/>
+      <w:r>
+        <w:rPr>
+          <w:rFonts w:ascii="Segoe UI Emoji" w:hAnsi="Segoe UI Emoji" w:cs="Segoe UI Emoji"/>
+          <w:b/>
+          <w:bCs/>
+        </w:rPr>
+        <w:t>img</w:t>
+      </w:r>
+      <w:proofErr w:type="spellEnd"/>
+      <w:r>
+        <w:rPr>
+          <w:rFonts w:ascii="Segoe UI Emoji" w:hAnsi="Segoe UI Emoji" w:cs="Segoe UI Emoji"/>
+          <w:b/>
+          <w:bCs/>
+        </w:rPr>
+        <w:t xml:space="preserve"> </w:t>
+      </w:r>
+      <w:proofErr w:type="spellStart"/>
+      <w:r>
+        <w:rPr>
+          <w:rFonts w:ascii="Segoe UI Emoji" w:hAnsi="Segoe UI Emoji" w:cs="Segoe UI Emoji"/>
+          <w:b/>
+          <w:bCs/>
+        </w:rPr>
+        <w:t>src</w:t>
+      </w:r>
+      <w:proofErr w:type="spellEnd"/>
+      <w:r>
+        <w:rPr>
+          <w:rFonts w:ascii="Segoe UI Emoji" w:hAnsi="Segoe UI Emoji" w:cs="Segoe UI Emoji"/>
+          <w:b/>
+          <w:bCs/>
+        </w:rPr>
+        <w:t>="react.jpg" alt="React.js development"&gt;</w:t>
+      </w:r>
+    </w:p>
+    <w:p>
+      <w:pPr>
+        <w:spacing w:line="240" w:lineRule="auto"/>
+        <w:jc w:val="both"/>
+        <w:rPr>
+          <w:rFonts w:ascii="Segoe UI Emoji" w:hAnsi="Segoe UI Emoji" w:cs="Segoe UI Emoji"/>
+          <w:b/>
+          <w:bCs/>
+        </w:rPr>
+      </w:pPr>
+      <w:r>
+        <w:rPr>
+          <w:rFonts w:ascii="Segoe UI Emoji" w:hAnsi="Segoe UI Emoji" w:cs="Segoe UI Emoji"/>
+          <w:b/>
+          <w:bCs/>
+        </w:rPr>
+        <w:t>Interview answer:</w:t>
+      </w:r>
+    </w:p>
+    <w:p>
+      <w:pPr>
+        <w:spacing w:line="240" w:lineRule="auto"/>
+        <w:jc w:val="both"/>
+        <w:rPr>
+          <w:rFonts w:ascii="Segoe UI Emoji" w:hAnsi="Segoe UI Emoji" w:cs="Segoe UI Emoji"/>
+          <w:b/>
+          <w:bCs/>
+        </w:rPr>
+      </w:pPr>
+      <w:r>
+        <w:rPr>
+          <w:rFonts w:ascii="Segoe UI Emoji" w:hAnsi="Segoe UI Emoji" w:cs="Segoe UI Emoji"/>
+          <w:b/>
+          <w:bCs/>
+        </w:rPr>
+        <w:t>"Semantic HTML, meaningful titles, meta descriptions, proper headings, descriptive links, and useful image alt text can help search engines understand a webpage."</w:t>
+      </w:r>
+    </w:p>
+    <w:p>
+      <w:pPr>
+        <w:spacing w:line="240" w:lineRule="auto"/>
+        <w:jc w:val="both"/>
+        <w:rPr>
+          <w:rFonts w:ascii="Segoe UI Emoji" w:hAnsi="Segoe UI Emoji" w:cs="Segoe UI Emoji"/>
+          <w:b/>
+          <w:bCs/>
+        </w:rPr>
+      </w:pPr>
+      <w:r>
+        <w:rPr>
+          <w:rFonts w:ascii="Segoe UI Emoji" w:hAnsi="Segoe UI Emoji" w:cs="Segoe UI Emoji"/>
+          <w:b/>
+          <w:bCs/>
+        </w:rPr>
+        <w:pict w14:anchorId="00BC01E9">
+          <v:rect id="_x0000_i1044" style="width:0;height:1.5pt" o:hralign="center" o:hrstd="t" o:hr="t" fillcolor="#a0a0a0" stroked="f"/>
+        </w:pict>
+      </w:r>
+    </w:p>
+    <w:p>
+      <w:pPr>
+        <w:spacing w:line="240" w:lineRule="auto"/>
+        <w:jc w:val="both"/>
+        <w:rPr>
+          <w:rFonts w:ascii="Segoe UI Emoji" w:hAnsi="Segoe UI Emoji" w:cs="Segoe UI Emoji"/>
+          <w:b/>
+          <w:bCs/>
+        </w:rPr>
+      </w:pPr>
+      <w:r>
+        <w:rPr>
+          <w:rFonts w:ascii="Segoe UI Emoji" w:hAnsi="Segoe UI Emoji" w:cs="Segoe UI Emoji"/>
+          <w:b/>
+          <w:bCs/>
+        </w:rPr>
+        <w:t>24. What is Accessibility in HTML?</w:t>
+      </w:r>
+    </w:p>
+    <w:p>
+      <w:pPr>
+        <w:spacing w:line="240" w:lineRule="auto"/>
+        <w:jc w:val="both"/>
+        <w:rPr>
+          <w:rFonts w:ascii="Segoe UI Emoji" w:hAnsi="Segoe UI Emoji" w:cs="Segoe UI Emoji"/>
+          <w:b/>
+          <w:bCs/>
+        </w:rPr>
+      </w:pPr>
+      <w:r>
+        <w:rPr>
+          <w:rFonts w:ascii="Segoe UI Emoji" w:hAnsi="Segoe UI Emoji" w:cs="Segoe UI Emoji"/>
+          <w:b/>
+          <w:bCs/>
+        </w:rPr>
+        <w:t>Answer:</w:t>
+      </w:r>
+      <w:r>
+        <w:rPr>
+          <w:rFonts w:ascii="Segoe UI Emoji" w:hAnsi="Segoe UI Emoji" w:cs="Segoe UI Emoji"/>
+          <w:b/>
+          <w:bCs/>
+        </w:rPr>
+        <w:br/>
+        <w:t>Accessibility means designing websites so that people with different abilities can use them effectively, including people who use screen readers or keyboard navigation.</w:t>
+      </w:r>
+    </w:p>
+    <w:p>
+      <w:pPr>
+        <w:spacing w:line="240" w:lineRule="auto"/>
+        <w:jc w:val="both"/>
+        <w:rPr>
+          <w:rFonts w:ascii="Segoe UI Emoji" w:hAnsi="Segoe UI Emoji" w:cs="Segoe UI Emoji"/>
+          <w:b/>
+          <w:bCs/>
+        </w:rPr>
+      </w:pPr>
+      <w:r>
+        <w:rPr>
+          <w:rFonts w:ascii="Segoe UI Emoji" w:hAnsi="Segoe UI Emoji" w:cs="Segoe UI Emoji"/>
+          <w:b/>
+          <w:bCs/>
+        </w:rPr>
+        <w:t>Important practices:</w:t>
+      </w:r>
+    </w:p>
+    <w:p>
+      <w:pPr>
+        <w:spacing w:line="240" w:lineRule="auto"/>
+        <w:jc w:val="both"/>
+        <w:rPr>
+          <w:rFonts w:ascii="Segoe UI Emoji" w:hAnsi="Segoe UI Emoji" w:cs="Segoe UI Emoji"/>
+          <w:b/>
+          <w:bCs/>
+        </w:rPr>
+      </w:pPr>
+      <w:r>
+        <w:rPr>
+          <w:rFonts w:ascii="Segoe UI Emoji" w:hAnsi="Segoe UI Emoji" w:cs="Segoe UI Emoji"/>
+          <w:b/>
+          <w:bCs/>
+        </w:rPr>
+        <w:t>&lt;label for="email"&gt;Email&lt;/label&gt;</w:t>
+      </w:r>
+    </w:p>
+    <w:p>
+      <w:pPr>
+        <w:spacing w:line="240" w:lineRule="auto"/>
+        <w:jc w:val="both"/>
+        <w:rPr>
+          <w:rFonts w:ascii="Segoe UI Emoji" w:hAnsi="Segoe UI Emoji" w:cs="Segoe UI Emoji"/>
+          <w:b/>
+          <w:bCs/>
+        </w:rPr>
+      </w:pPr>
+      <w:r>
+        <w:rPr>
+          <w:rFonts w:ascii="Segoe UI Emoji" w:hAnsi="Segoe UI Emoji" w:cs="Segoe UI Emoji"/>
+          <w:b/>
+          <w:bCs/>
+        </w:rPr>
+        <w:t>&lt;input id="email" type="email"&gt;</w:t>
+      </w:r>
+    </w:p>
+    <w:p>
+      <w:pPr>
+        <w:spacing w:line="240" w:lineRule="auto"/>
+        <w:jc w:val="both"/>
+        <w:rPr>
+          <w:rFonts w:ascii="Segoe UI Emoji" w:hAnsi="Segoe UI Emoji" w:cs="Segoe UI Emoji"/>
+          <w:b/>
+          <w:bCs/>
+        </w:rPr>
+      </w:pPr>
+    </w:p>
+    <w:p>
+      <w:pPr>
+        <w:spacing w:line="240" w:lineRule="auto"/>
+        <w:jc w:val="both"/>
+        <w:rPr>
+          <w:rFonts w:ascii="Segoe UI Emoji" w:hAnsi="Segoe UI Emoji" w:cs="Segoe UI Emoji"/>
+          <w:b/>
+          <w:bCs/>
+        </w:rPr>
+      </w:pPr>
+      <w:r>
+        <w:rPr>
+          <w:rFonts w:ascii="Segoe UI Emoji" w:hAnsi="Segoe UI Emoji" w:cs="Segoe UI Emoji"/>
+          <w:b/>
+          <w:bCs/>
+        </w:rPr>
+        <w:t>&lt;</w:t>
+      </w:r>
+      <w:proofErr w:type="spellStart"/>
+      <w:r>
+        <w:rPr>
+          <w:rFonts w:ascii="Segoe UI Emoji" w:hAnsi="Segoe UI Emoji" w:cs="Segoe UI Emoji"/>
+          <w:b/>
+          <w:bCs/>
+        </w:rPr>
+        <w:t>img</w:t>
+      </w:r>
+      <w:proofErr w:type="spellEnd"/>
+      <w:r>
+        <w:rPr>
+          <w:rFonts w:ascii="Segoe UI Emoji" w:hAnsi="Segoe UI Emoji" w:cs="Segoe UI Emoji"/>
+          <w:b/>
+          <w:bCs/>
+        </w:rPr>
+        <w:t xml:space="preserve"> </w:t>
+      </w:r>
+      <w:proofErr w:type="spellStart"/>
+      <w:r>
+        <w:rPr>
+          <w:rFonts w:ascii="Segoe UI Emoji" w:hAnsi="Segoe UI Emoji" w:cs="Segoe UI Emoji"/>
+          <w:b/>
+          <w:bCs/>
+        </w:rPr>
+        <w:t>src</w:t>
+      </w:r>
+      <w:proofErr w:type="spellEnd"/>
+      <w:r>
+        <w:rPr>
+          <w:rFonts w:ascii="Segoe UI Emoji" w:hAnsi="Segoe UI Emoji" w:cs="Segoe UI Emoji"/>
+          <w:b/>
+          <w:bCs/>
+        </w:rPr>
+        <w:t>="logo.png" alt="Company logo"&gt;</w:t>
+      </w:r>
+    </w:p>
+    <w:p>
+      <w:pPr>
+        <w:spacing w:line="240" w:lineRule="auto"/>
+        <w:jc w:val="both"/>
+        <w:rPr>
+          <w:rFonts w:ascii="Segoe UI Emoji" w:hAnsi="Segoe UI Emoji" w:cs="Segoe UI Emoji"/>
+          <w:b/>
+          <w:bCs/>
+        </w:rPr>
+      </w:pPr>
+    </w:p>
+    <w:p>
+      <w:pPr>
+        <w:spacing w:line="240" w:lineRule="auto"/>
+        <w:jc w:val="both"/>
+        <w:rPr>
+          <w:rFonts w:ascii="Segoe UI Emoji" w:hAnsi="Segoe UI Emoji" w:cs="Segoe UI Emoji"/>
+          <w:b/>
+          <w:bCs/>
+        </w:rPr>
+      </w:pPr>
+      <w:r>
+        <w:rPr>
+          <w:rFonts w:ascii="Segoe UI Emoji" w:hAnsi="Segoe UI Emoji" w:cs="Segoe UI Emoji"/>
+          <w:b/>
+          <w:bCs/>
+        </w:rPr>
+        <w:t>&lt;button type="button"&gt;Submit&lt;/button&gt;</w:t>
+      </w:r>
+    </w:p>
+    <w:p>
+      <w:pPr>
+        <w:spacing w:line="240" w:lineRule="auto"/>
+        <w:jc w:val="both"/>
+        <w:rPr>
+          <w:rFonts w:ascii="Segoe UI Emoji" w:hAnsi="Segoe UI Emoji" w:cs="Segoe UI Emoji"/>
+          <w:b/>
+          <w:bCs/>
+        </w:rPr>
+      </w:pPr>
+      <w:r>
+        <w:rPr>
+          <w:rFonts w:ascii="Segoe UI Emoji" w:hAnsi="Segoe UI Emoji" w:cs="Segoe UI Emoji"/>
+          <w:b/>
+          <w:bCs/>
+        </w:rPr>
+        <w:t>Good accessibility practices include:</w:t>
+      </w:r>
+    </w:p>
+    <w:p>
+      <w:pPr>
+        <w:numPr>
+          <w:ilvl w:val="0"/>
+          <w:numId w:val="10"/>
+        </w:numPr>
+        <w:spacing w:line="240" w:lineRule="auto"/>
+        <w:jc w:val="both"/>
+        <w:rPr>
+          <w:rFonts w:ascii="Segoe UI Emoji" w:hAnsi="Segoe UI Emoji" w:cs="Segoe UI Emoji"/>
+          <w:b/>
+          <w:bCs/>
+        </w:rPr>
+      </w:pPr>
+      <w:r>
+        <w:rPr>
+          <w:rFonts w:ascii="Segoe UI Emoji" w:hAnsi="Segoe UI Emoji" w:cs="Segoe UI Emoji"/>
+          <w:b/>
+          <w:bCs/>
+        </w:rPr>
+        <w:t xml:space="preserve">Using semantic HTML </w:t>
+      </w:r>
+    </w:p>
+    <w:p>
+      <w:pPr>
+        <w:numPr>
+          <w:ilvl w:val="0"/>
+          <w:numId w:val="10"/>
+        </w:numPr>
+        <w:spacing w:line="240" w:lineRule="auto"/>
+        <w:jc w:val="both"/>
+        <w:rPr>
+          <w:rFonts w:ascii="Segoe UI Emoji" w:hAnsi="Segoe UI Emoji" w:cs="Segoe UI Emoji"/>
+          <w:b/>
+          <w:bCs/>
+        </w:rPr>
+      </w:pPr>
+      <w:r>
+        <w:rPr>
+          <w:rFonts w:ascii="Segoe UI Emoji" w:hAnsi="Segoe UI Emoji" w:cs="Segoe UI Emoji"/>
+          <w:b/>
+          <w:bCs/>
+        </w:rPr>
+        <w:lastRenderedPageBreak/>
+        <w:t xml:space="preserve">Providing alt text for meaningful images </w:t>
+      </w:r>
+    </w:p>
+    <w:p>
+      <w:pPr>
+        <w:numPr>
+          <w:ilvl w:val="0"/>
+          <w:numId w:val="10"/>
+        </w:numPr>
+        <w:spacing w:line="240" w:lineRule="auto"/>
+        <w:jc w:val="both"/>
+        <w:rPr>
+          <w:rFonts w:ascii="Segoe UI Emoji" w:hAnsi="Segoe UI Emoji" w:cs="Segoe UI Emoji"/>
+          <w:b/>
+          <w:bCs/>
+        </w:rPr>
+      </w:pPr>
+      <w:r>
+        <w:rPr>
+          <w:rFonts w:ascii="Segoe UI Emoji" w:hAnsi="Segoe UI Emoji" w:cs="Segoe UI Emoji"/>
+          <w:b/>
+          <w:bCs/>
+        </w:rPr>
+        <w:t xml:space="preserve">Using labels for form controls </w:t>
+      </w:r>
+    </w:p>
+    <w:p>
+      <w:pPr>
+        <w:numPr>
+          <w:ilvl w:val="0"/>
+          <w:numId w:val="10"/>
+        </w:numPr>
+        <w:spacing w:line="240" w:lineRule="auto"/>
+        <w:jc w:val="both"/>
+        <w:rPr>
+          <w:rFonts w:ascii="Segoe UI Emoji" w:hAnsi="Segoe UI Emoji" w:cs="Segoe UI Emoji"/>
+          <w:b/>
+          <w:bCs/>
+        </w:rPr>
+      </w:pPr>
+      <w:r>
+        <w:rPr>
+          <w:rFonts w:ascii="Segoe UI Emoji" w:hAnsi="Segoe UI Emoji" w:cs="Segoe UI Emoji"/>
+          <w:b/>
+          <w:bCs/>
+        </w:rPr>
+        <w:t xml:space="preserve">Making interactive elements keyboard accessible </w:t>
+      </w:r>
+    </w:p>
+    <w:p>
+      <w:pPr>
+        <w:numPr>
+          <w:ilvl w:val="0"/>
+          <w:numId w:val="10"/>
+        </w:numPr>
+        <w:spacing w:line="240" w:lineRule="auto"/>
+        <w:jc w:val="both"/>
+        <w:rPr>
+          <w:rFonts w:ascii="Segoe UI Emoji" w:hAnsi="Segoe UI Emoji" w:cs="Segoe UI Emoji"/>
+          <w:b/>
+          <w:bCs/>
+        </w:rPr>
+      </w:pPr>
+      <w:r>
+        <w:rPr>
+          <w:rFonts w:ascii="Segoe UI Emoji" w:hAnsi="Segoe UI Emoji" w:cs="Segoe UI Emoji"/>
+          <w:b/>
+          <w:bCs/>
+        </w:rPr>
+        <w:t xml:space="preserve">Using proper heading structure </w:t>
+      </w:r>
+    </w:p>
+    <w:p>
+      <w:pPr>
+        <w:spacing w:line="240" w:lineRule="auto"/>
+        <w:jc w:val="both"/>
+        <w:rPr>
+          <w:rFonts w:ascii="Segoe UI Emoji" w:hAnsi="Segoe UI Emoji" w:cs="Segoe UI Emoji"/>
+          <w:b/>
+          <w:bCs/>
+        </w:rPr>
+      </w:pPr>
+      <w:r>
+        <w:rPr>
+          <w:rFonts w:ascii="Segoe UI Emoji" w:hAnsi="Segoe UI Emoji" w:cs="Segoe UI Emoji"/>
+          <w:b/>
+          <w:bCs/>
+        </w:rPr>
+        <w:pict w14:anchorId="47A1EED5">
+          <v:rect id="_x0000_i1045" style="width:0;height:1.5pt" o:hralign="center" o:hrstd="t" o:hr="t" fillcolor="#a0a0a0" stroked="f"/>
+        </w:pict>
+      </w:r>
+    </w:p>
+    <w:p>
+      <w:pPr>
+        <w:spacing w:line="240" w:lineRule="auto"/>
+        <w:jc w:val="both"/>
+        <w:rPr>
+          <w:rFonts w:ascii="Segoe UI Emoji" w:hAnsi="Segoe UI Emoji" w:cs="Segoe UI Emoji"/>
+          <w:b/>
+          <w:bCs/>
+        </w:rPr>
+      </w:pPr>
+      <w:r>
+        <w:rPr>
+          <w:rFonts w:ascii="Segoe UI Emoji" w:hAnsi="Segoe UI Emoji" w:cs="Segoe UI Emoji"/>
+          <w:b/>
+          <w:bCs/>
+        </w:rPr>
+        <w:t>25. How do you make an HTML page responsive?</w:t>
+      </w:r>
+    </w:p>
+    <w:p>
+      <w:pPr>
+        <w:spacing w:line="240" w:lineRule="auto"/>
+        <w:jc w:val="both"/>
+        <w:rPr>
+          <w:rFonts w:ascii="Segoe UI Emoji" w:hAnsi="Segoe UI Emoji" w:cs="Segoe UI Emoji"/>
+          <w:b/>
+          <w:bCs/>
+        </w:rPr>
+      </w:pPr>
+      <w:r>
+        <w:rPr>
+          <w:rFonts w:ascii="Segoe UI Emoji" w:hAnsi="Segoe UI Emoji" w:cs="Segoe UI Emoji"/>
+          <w:b/>
+          <w:bCs/>
+        </w:rPr>
+        <w:t>Answer:</w:t>
+      </w:r>
+      <w:r>
+        <w:rPr>
+          <w:rFonts w:ascii="Segoe UI Emoji" w:hAnsi="Segoe UI Emoji" w:cs="Segoe UI Emoji"/>
+          <w:b/>
+          <w:bCs/>
+        </w:rPr>
+        <w:br/>
+        <w:t>Responsive design means making a website work properly on different screen sizes, such as mobile, tablet, and desktop.</w:t>
+      </w:r>
+    </w:p>
+    <w:p>
+      <w:pPr>
+        <w:spacing w:line="240" w:lineRule="auto"/>
+        <w:jc w:val="both"/>
+        <w:rPr>
+          <w:rFonts w:ascii="Segoe UI Emoji" w:hAnsi="Segoe UI Emoji" w:cs="Segoe UI Emoji"/>
+          <w:b/>
+          <w:bCs/>
+        </w:rPr>
+      </w:pPr>
+      <w:r>
+        <w:rPr>
+          <w:rFonts w:ascii="Segoe UI Emoji" w:hAnsi="Segoe UI Emoji" w:cs="Segoe UI Emoji"/>
+          <w:b/>
+          <w:bCs/>
+        </w:rPr>
+        <w:t>A common starting point is the viewport meta tag:</w:t>
+      </w:r>
+    </w:p>
+    <w:p>
+      <w:pPr>
+        <w:spacing w:line="240" w:lineRule="auto"/>
+        <w:jc w:val="both"/>
+        <w:rPr>
+          <w:rFonts w:ascii="Segoe UI Emoji" w:hAnsi="Segoe UI Emoji" w:cs="Segoe UI Emoji"/>
+          <w:b/>
+          <w:bCs/>
+        </w:rPr>
+      </w:pPr>
+      <w:r>
+        <w:rPr>
+          <w:rFonts w:ascii="Segoe UI Emoji" w:hAnsi="Segoe UI Emoji" w:cs="Segoe UI Emoji"/>
+          <w:b/>
+          <w:bCs/>
+        </w:rPr>
+        <w:t>&lt;meta</w:t>
+      </w:r>
+    </w:p>
+    <w:p>
+      <w:pPr>
+        <w:spacing w:line="240" w:lineRule="auto"/>
+        <w:jc w:val="both"/>
+        <w:rPr>
+          <w:rFonts w:ascii="Segoe UI Emoji" w:hAnsi="Segoe UI Emoji" w:cs="Segoe UI Emoji"/>
+          <w:b/>
+          <w:bCs/>
+        </w:rPr>
+      </w:pPr>
+      <w:r>
+        <w:rPr>
+          <w:rFonts w:ascii="Segoe UI Emoji" w:hAnsi="Segoe UI Emoji" w:cs="Segoe UI Emoji"/>
+          <w:b/>
+          <w:bCs/>
+        </w:rPr>
+        <w:t xml:space="preserve">    name="viewport"</w:t>
+      </w:r>
+    </w:p>
+    <w:p>
+      <w:pPr>
+        <w:spacing w:line="240" w:lineRule="auto"/>
+        <w:jc w:val="both"/>
+        <w:rPr>
+          <w:rFonts w:ascii="Segoe UI Emoji" w:hAnsi="Segoe UI Emoji" w:cs="Segoe UI Emoji"/>
+          <w:b/>
+          <w:bCs/>
+        </w:rPr>
+      </w:pPr>
+      <w:r>
+        <w:rPr>
+          <w:rFonts w:ascii="Segoe UI Emoji" w:hAnsi="Segoe UI Emoji" w:cs="Segoe UI Emoji"/>
+          <w:b/>
+          <w:bCs/>
+        </w:rPr>
+        <w:t xml:space="preserve">    content="width=device-width, initial-scale=1.0"</w:t>
+      </w:r>
+    </w:p>
+    <w:p>
+      <w:pPr>
+        <w:spacing w:line="240" w:lineRule="auto"/>
+        <w:jc w:val="both"/>
+        <w:rPr>
+          <w:rFonts w:ascii="Segoe UI Emoji" w:hAnsi="Segoe UI Emoji" w:cs="Segoe UI Emoji"/>
+          <w:b/>
+          <w:bCs/>
+        </w:rPr>
+      </w:pPr>
+      <w:r>
+        <w:rPr>
+          <w:rFonts w:ascii="Segoe UI Emoji" w:hAnsi="Segoe UI Emoji" w:cs="Segoe UI Emoji"/>
+          <w:b/>
+          <w:bCs/>
+        </w:rPr>
+        <w:t>&gt;</w:t>
+      </w:r>
+    </w:p>
+    <w:p>
+      <w:pPr>
+        <w:spacing w:line="240" w:lineRule="auto"/>
+        <w:jc w:val="both"/>
+        <w:rPr>
+          <w:rFonts w:ascii="Segoe UI Emoji" w:hAnsi="Segoe UI Emoji" w:cs="Segoe UI Emoji"/>
+          <w:b/>
+          <w:bCs/>
+        </w:rPr>
+      </w:pPr>
+      <w:r>
+        <w:rPr>
+          <w:rFonts w:ascii="Segoe UI Emoji" w:hAnsi="Segoe UI Emoji" w:cs="Segoe UI Emoji"/>
+          <w:b/>
+          <w:bCs/>
+        </w:rPr>
+        <w:t>CSS media queries are then commonly used:</w:t>
+      </w:r>
+    </w:p>
+    <w:p>
+      <w:pPr>
+        <w:spacing w:line="240" w:lineRule="auto"/>
+        <w:jc w:val="both"/>
+        <w:rPr>
+          <w:rFonts w:ascii="Segoe UI Emoji" w:hAnsi="Segoe UI Emoji" w:cs="Segoe UI Emoji"/>
+          <w:b/>
+          <w:bCs/>
+        </w:rPr>
+      </w:pPr>
+      <w:r>
+        <w:rPr>
+          <w:rFonts w:ascii="Segoe UI Emoji" w:hAnsi="Segoe UI Emoji" w:cs="Segoe UI Emoji"/>
+          <w:b/>
+          <w:bCs/>
+        </w:rPr>
+        <w:t>@media (max-width: 768px) {</w:t>
+      </w:r>
+    </w:p>
+    <w:p>
+      <w:pPr>
+        <w:spacing w:line="240" w:lineRule="auto"/>
+        <w:jc w:val="both"/>
+        <w:rPr>
+          <w:rFonts w:ascii="Segoe UI Emoji" w:hAnsi="Segoe UI Emoji" w:cs="Segoe UI Emoji"/>
+          <w:b/>
+          <w:bCs/>
+        </w:rPr>
+      </w:pPr>
+      <w:r>
+        <w:rPr>
+          <w:rFonts w:ascii="Segoe UI Emoji" w:hAnsi="Segoe UI Emoji" w:cs="Segoe UI Emoji"/>
+          <w:b/>
+          <w:bCs/>
+        </w:rPr>
+        <w:t xml:space="preserve">    .container {</w:t>
+      </w:r>
+    </w:p>
+    <w:p>
+      <w:pPr>
+        <w:spacing w:line="240" w:lineRule="auto"/>
+        <w:jc w:val="both"/>
+        <w:rPr>
+          <w:rFonts w:ascii="Segoe UI Emoji" w:hAnsi="Segoe UI Emoji" w:cs="Segoe UI Emoji"/>
+          <w:b/>
+          <w:bCs/>
+        </w:rPr>
+      </w:pPr>
+      <w:r>
+        <w:rPr>
+          <w:rFonts w:ascii="Segoe UI Emoji" w:hAnsi="Segoe UI Emoji" w:cs="Segoe UI Emoji"/>
+          <w:b/>
+          <w:bCs/>
+        </w:rPr>
+        <w:t xml:space="preserve">        width: 100%;</w:t>
+      </w:r>
+    </w:p>
+    <w:p>
+      <w:pPr>
+        <w:spacing w:line="240" w:lineRule="auto"/>
+        <w:jc w:val="both"/>
+        <w:rPr>
+          <w:rFonts w:ascii="Segoe UI Emoji" w:hAnsi="Segoe UI Emoji" w:cs="Segoe UI Emoji"/>
+          <w:b/>
+          <w:bCs/>
+        </w:rPr>
+      </w:pPr>
+      <w:r>
+        <w:rPr>
+          <w:rFonts w:ascii="Segoe UI Emoji" w:hAnsi="Segoe UI Emoji" w:cs="Segoe UI Emoji"/>
+          <w:b/>
+          <w:bCs/>
+        </w:rPr>
+        <w:t xml:space="preserve">    }</w:t>
+      </w:r>
+    </w:p>
+    <w:p>
+      <w:pPr>
+        <w:spacing w:line="240" w:lineRule="auto"/>
+        <w:jc w:val="both"/>
+        <w:rPr>
+          <w:rFonts w:ascii="Segoe UI Emoji" w:hAnsi="Segoe UI Emoji" w:cs="Segoe UI Emoji"/>
+          <w:b/>
+          <w:bCs/>
+        </w:rPr>
+      </w:pPr>
+      <w:r>
+        <w:rPr>
+          <w:rFonts w:ascii="Segoe UI Emoji" w:hAnsi="Segoe UI Emoji" w:cs="Segoe UI Emoji"/>
+          <w:b/>
+          <w:bCs/>
+        </w:rPr>
+        <w:t>}</w:t>
+      </w:r>
+    </w:p>
+    <w:p>
+      <w:pPr>
+        <w:spacing w:line="240" w:lineRule="auto"/>
+        <w:jc w:val="both"/>
+        <w:rPr>
+          <w:rFonts w:ascii="Segoe UI Emoji" w:hAnsi="Segoe UI Emoji" w:cs="Segoe UI Emoji"/>
+          <w:b/>
+          <w:bCs/>
+        </w:rPr>
+      </w:pPr>
+      <w:r>
+        <w:rPr>
+          <w:rFonts w:ascii="Segoe UI Emoji" w:hAnsi="Segoe UI Emoji" w:cs="Segoe UI Emoji"/>
+          <w:b/>
+          <w:bCs/>
+        </w:rPr>
+        <w:t>Interview answer:</w:t>
+      </w:r>
+    </w:p>
+    <w:p>
+      <w:pPr>
+        <w:spacing w:line="240" w:lineRule="auto"/>
+        <w:jc w:val="both"/>
+        <w:rPr>
+          <w:rFonts w:ascii="Segoe UI Emoji" w:hAnsi="Segoe UI Emoji" w:cs="Segoe UI Emoji"/>
+          <w:b/>
+          <w:bCs/>
+        </w:rPr>
+      </w:pPr>
+      <w:r>
+        <w:rPr>
+          <w:rFonts w:ascii="Segoe UI Emoji" w:hAnsi="Segoe UI Emoji" w:cs="Segoe UI Emoji"/>
+          <w:b/>
+          <w:bCs/>
+        </w:rPr>
+        <w:t>"I use the viewport meta tag along with responsive CSS, flexible layouts, media queries, and responsive images to make a webpage work across different devices."</w:t>
+      </w:r>
+    </w:p>
+    <w:p>
+      <w:pPr>
+        <w:spacing w:line="240" w:lineRule="auto"/>
+        <w:jc w:val="both"/>
+        <w:rPr>
+          <w:rFonts w:ascii="Segoe UI Emoji" w:hAnsi="Segoe UI Emoji" w:cs="Segoe UI Emoji"/>
+          <w:b/>
+          <w:bCs/>
+        </w:rPr>
+      </w:pPr>
+      <w:r>
+        <w:rPr>
+          <w:rFonts w:ascii="Segoe UI Emoji" w:hAnsi="Segoe UI Emoji" w:cs="Segoe UI Emoji"/>
+          <w:b/>
+          <w:bCs/>
+        </w:rPr>
+        <w:pict w14:anchorId="2A543B25">
+          <v:rect id="_x0000_i1046" style="width:0;height:1.5pt" o:hralign="center" o:hrstd="t" o:hr="t" fillcolor="#a0a0a0" stroked="f"/>
+        </w:pict>
+      </w:r>
+    </w:p>
+    <w:p>
+      <w:pPr>
+        <w:spacing w:line="240" w:lineRule="auto"/>
+        <w:jc w:val="both"/>
+        <w:rPr>
+          <w:rFonts w:ascii="Segoe UI Emoji" w:hAnsi="Segoe UI Emoji" w:cs="Segoe UI Emoji"/>
+          <w:b/>
+          <w:bCs/>
+        </w:rPr>
+      </w:pPr>
+      <w:r>
+        <w:rPr>
+          <w:rFonts w:ascii="Segoe UI Emoji" w:hAnsi="Segoe UI Emoji" w:cs="Segoe UI Emoji"/>
+          <w:b/>
+          <w:bCs/>
+        </w:rPr>
+        <w:t>26. What are data-* attributes in HTML?</w:t>
+      </w:r>
+    </w:p>
+    <w:p>
+      <w:pPr>
+        <w:spacing w:line="240" w:lineRule="auto"/>
+        <w:jc w:val="both"/>
+        <w:rPr>
+          <w:rFonts w:ascii="Segoe UI Emoji" w:hAnsi="Segoe UI Emoji" w:cs="Segoe UI Emoji"/>
+          <w:b/>
+          <w:bCs/>
+        </w:rPr>
+      </w:pPr>
+      <w:r>
+        <w:rPr>
+          <w:rFonts w:ascii="Segoe UI Emoji" w:hAnsi="Segoe UI Emoji" w:cs="Segoe UI Emoji"/>
+          <w:b/>
+          <w:bCs/>
+        </w:rPr>
+        <w:t>Answer:</w:t>
+      </w:r>
+      <w:r>
+        <w:rPr>
+          <w:rFonts w:ascii="Segoe UI Emoji" w:hAnsi="Segoe UI Emoji" w:cs="Segoe UI Emoji"/>
+          <w:b/>
+          <w:bCs/>
+        </w:rPr>
+        <w:br/>
+        <w:t>data-* attributes allow developers to store custom data on HTML elements.</w:t>
+      </w:r>
+    </w:p>
+    <w:p>
+      <w:pPr>
+        <w:spacing w:line="240" w:lineRule="auto"/>
+        <w:jc w:val="both"/>
+        <w:rPr>
+          <w:rFonts w:ascii="Segoe UI Emoji" w:hAnsi="Segoe UI Emoji" w:cs="Segoe UI Emoji"/>
+          <w:b/>
+          <w:bCs/>
+        </w:rPr>
+      </w:pPr>
+      <w:r>
+        <w:rPr>
+          <w:rFonts w:ascii="Segoe UI Emoji" w:hAnsi="Segoe UI Emoji" w:cs="Segoe UI Emoji"/>
+          <w:b/>
+          <w:bCs/>
+        </w:rPr>
+        <w:t>Example:</w:t>
+      </w:r>
+    </w:p>
+    <w:p>
+      <w:pPr>
+        <w:spacing w:line="240" w:lineRule="auto"/>
+        <w:jc w:val="both"/>
+        <w:rPr>
+          <w:rFonts w:ascii="Segoe UI Emoji" w:hAnsi="Segoe UI Emoji" w:cs="Segoe UI Emoji"/>
+          <w:b/>
+          <w:bCs/>
+        </w:rPr>
+      </w:pPr>
+      <w:r>
+        <w:rPr>
+          <w:rFonts w:ascii="Segoe UI Emoji" w:hAnsi="Segoe UI Emoji" w:cs="Segoe UI Emoji"/>
+          <w:b/>
+          <w:bCs/>
+        </w:rPr>
+        <w:t>&lt;button</w:t>
+      </w:r>
+    </w:p>
+    <w:p>
+      <w:pPr>
+        <w:spacing w:line="240" w:lineRule="auto"/>
+        <w:jc w:val="both"/>
+        <w:rPr>
+          <w:rFonts w:ascii="Segoe UI Emoji" w:hAnsi="Segoe UI Emoji" w:cs="Segoe UI Emoji"/>
+          <w:b/>
+          <w:bCs/>
+        </w:rPr>
+      </w:pPr>
+      <w:r>
+        <w:rPr>
+          <w:rFonts w:ascii="Segoe UI Emoji" w:hAnsi="Segoe UI Emoji" w:cs="Segoe UI Emoji"/>
+          <w:b/>
+          <w:bCs/>
+        </w:rPr>
+        <w:t xml:space="preserve">    data-user-id="101"</w:t>
+      </w:r>
+    </w:p>
+    <w:p>
+      <w:pPr>
+        <w:spacing w:line="240" w:lineRule="auto"/>
+        <w:jc w:val="both"/>
+        <w:rPr>
+          <w:rFonts w:ascii="Segoe UI Emoji" w:hAnsi="Segoe UI Emoji" w:cs="Segoe UI Emoji"/>
+          <w:b/>
+          <w:bCs/>
+        </w:rPr>
+      </w:pPr>
+      <w:r>
+        <w:rPr>
+          <w:rFonts w:ascii="Segoe UI Emoji" w:hAnsi="Segoe UI Emoji" w:cs="Segoe UI Emoji"/>
+          <w:b/>
+          <w:bCs/>
+        </w:rPr>
+        <w:lastRenderedPageBreak/>
+        <w:t xml:space="preserve">    data-role="admin"</w:t>
+      </w:r>
+    </w:p>
+    <w:p>
+      <w:pPr>
+        <w:spacing w:line="240" w:lineRule="auto"/>
+        <w:jc w:val="both"/>
+        <w:rPr>
+          <w:rFonts w:ascii="Segoe UI Emoji" w:hAnsi="Segoe UI Emoji" w:cs="Segoe UI Emoji"/>
+          <w:b/>
+          <w:bCs/>
+        </w:rPr>
+      </w:pPr>
+      <w:r>
+        <w:rPr>
+          <w:rFonts w:ascii="Segoe UI Emoji" w:hAnsi="Segoe UI Emoji" w:cs="Segoe UI Emoji"/>
+          <w:b/>
+          <w:bCs/>
+        </w:rPr>
+        <w:t>&gt;</w:t>
+      </w:r>
+    </w:p>
+    <w:p>
+      <w:pPr>
+        <w:spacing w:line="240" w:lineRule="auto"/>
+        <w:jc w:val="both"/>
+        <w:rPr>
+          <w:rFonts w:ascii="Segoe UI Emoji" w:hAnsi="Segoe UI Emoji" w:cs="Segoe UI Emoji"/>
+          <w:b/>
+          <w:bCs/>
+        </w:rPr>
+      </w:pPr>
+      <w:r>
+        <w:rPr>
+          <w:rFonts w:ascii="Segoe UI Emoji" w:hAnsi="Segoe UI Emoji" w:cs="Segoe UI Emoji"/>
+          <w:b/>
+          <w:bCs/>
+        </w:rPr>
+        <w:t xml:space="preserve">    View User</w:t>
+      </w:r>
+    </w:p>
+    <w:p>
+      <w:pPr>
+        <w:spacing w:line="240" w:lineRule="auto"/>
+        <w:jc w:val="both"/>
+        <w:rPr>
+          <w:rFonts w:ascii="Segoe UI Emoji" w:hAnsi="Segoe UI Emoji" w:cs="Segoe UI Emoji"/>
+          <w:b/>
+          <w:bCs/>
+        </w:rPr>
+      </w:pPr>
+      <w:r>
+        <w:rPr>
+          <w:rFonts w:ascii="Segoe UI Emoji" w:hAnsi="Segoe UI Emoji" w:cs="Segoe UI Emoji"/>
+          <w:b/>
+          <w:bCs/>
+        </w:rPr>
+        <w:t>&lt;/button&gt;</w:t>
+      </w:r>
+    </w:p>
+    <w:p>
+      <w:pPr>
+        <w:spacing w:line="240" w:lineRule="auto"/>
+        <w:jc w:val="both"/>
+        <w:rPr>
+          <w:rFonts w:ascii="Segoe UI Emoji" w:hAnsi="Segoe UI Emoji" w:cs="Segoe UI Emoji"/>
+          <w:b/>
+          <w:bCs/>
+        </w:rPr>
+      </w:pPr>
+      <w:r>
+        <w:rPr>
+          <w:rFonts w:ascii="Segoe UI Emoji" w:hAnsi="Segoe UI Emoji" w:cs="Segoe UI Emoji"/>
+          <w:b/>
+          <w:bCs/>
+        </w:rPr>
+        <w:t>We can access these values using JavaScript:</w:t>
+      </w:r>
+    </w:p>
+    <w:p>
+      <w:pPr>
+        <w:spacing w:line="240" w:lineRule="auto"/>
+        <w:jc w:val="both"/>
+        <w:rPr>
+          <w:rFonts w:ascii="Segoe UI Emoji" w:hAnsi="Segoe UI Emoji" w:cs="Segoe UI Emoji"/>
+          <w:b/>
+          <w:bCs/>
+        </w:rPr>
+      </w:pPr>
+      <w:proofErr w:type="spellStart"/>
+      <w:r>
+        <w:rPr>
+          <w:rFonts w:ascii="Segoe UI Emoji" w:hAnsi="Segoe UI Emoji" w:cs="Segoe UI Emoji"/>
+          <w:b/>
+          <w:bCs/>
+        </w:rPr>
+        <w:t>const</w:t>
+      </w:r>
+      <w:proofErr w:type="spellEnd"/>
+      <w:r>
+        <w:rPr>
+          <w:rFonts w:ascii="Segoe UI Emoji" w:hAnsi="Segoe UI Emoji" w:cs="Segoe UI Emoji"/>
+          <w:b/>
+          <w:bCs/>
+        </w:rPr>
+        <w:t xml:space="preserve"> button = </w:t>
+      </w:r>
+      <w:proofErr w:type="spellStart"/>
+      <w:proofErr w:type="gramStart"/>
+      <w:r>
+        <w:rPr>
+          <w:rFonts w:ascii="Segoe UI Emoji" w:hAnsi="Segoe UI Emoji" w:cs="Segoe UI Emoji"/>
+          <w:b/>
+          <w:bCs/>
+        </w:rPr>
+        <w:t>document.querySelector</w:t>
+      </w:r>
+      <w:proofErr w:type="spellEnd"/>
+      <w:proofErr w:type="gramEnd"/>
+      <w:r>
+        <w:rPr>
+          <w:rFonts w:ascii="Segoe UI Emoji" w:hAnsi="Segoe UI Emoji" w:cs="Segoe UI Emoji"/>
+          <w:b/>
+          <w:bCs/>
+        </w:rPr>
+        <w:t>("button");</w:t>
+      </w:r>
+    </w:p>
+    <w:p>
+      <w:pPr>
+        <w:spacing w:line="240" w:lineRule="auto"/>
+        <w:jc w:val="both"/>
+        <w:rPr>
+          <w:rFonts w:ascii="Segoe UI Emoji" w:hAnsi="Segoe UI Emoji" w:cs="Segoe UI Emoji"/>
+          <w:b/>
+          <w:bCs/>
+        </w:rPr>
+      </w:pPr>
+    </w:p>
+    <w:p>
+      <w:pPr>
+        <w:spacing w:line="240" w:lineRule="auto"/>
+        <w:jc w:val="both"/>
+        <w:rPr>
+          <w:rFonts w:ascii="Segoe UI Emoji" w:hAnsi="Segoe UI Emoji" w:cs="Segoe UI Emoji"/>
+          <w:b/>
+          <w:bCs/>
+        </w:rPr>
+      </w:pPr>
+      <w:r>
+        <w:rPr>
+          <w:rFonts w:ascii="Segoe UI Emoji" w:hAnsi="Segoe UI Emoji" w:cs="Segoe UI Emoji"/>
+          <w:b/>
+          <w:bCs/>
+        </w:rPr>
+        <w:t>console.log(</w:t>
+      </w:r>
+      <w:proofErr w:type="spellStart"/>
+      <w:proofErr w:type="gramStart"/>
+      <w:r>
+        <w:rPr>
+          <w:rFonts w:ascii="Segoe UI Emoji" w:hAnsi="Segoe UI Emoji" w:cs="Segoe UI Emoji"/>
+          <w:b/>
+          <w:bCs/>
+        </w:rPr>
+        <w:t>button.dataset</w:t>
+      </w:r>
+      <w:proofErr w:type="gramEnd"/>
+      <w:r>
+        <w:rPr>
+          <w:rFonts w:ascii="Segoe UI Emoji" w:hAnsi="Segoe UI Emoji" w:cs="Segoe UI Emoji"/>
+          <w:b/>
+          <w:bCs/>
+        </w:rPr>
+        <w:t>.userId</w:t>
+      </w:r>
+      <w:proofErr w:type="spellEnd"/>
+      <w:r>
+        <w:rPr>
+          <w:rFonts w:ascii="Segoe UI Emoji" w:hAnsi="Segoe UI Emoji" w:cs="Segoe UI Emoji"/>
+          <w:b/>
+          <w:bCs/>
+        </w:rPr>
+        <w:t>);</w:t>
+      </w:r>
+    </w:p>
+    <w:p>
+      <w:pPr>
+        <w:spacing w:line="240" w:lineRule="auto"/>
+        <w:jc w:val="both"/>
+        <w:rPr>
+          <w:rFonts w:ascii="Segoe UI Emoji" w:hAnsi="Segoe UI Emoji" w:cs="Segoe UI Emoji"/>
+          <w:b/>
+          <w:bCs/>
+        </w:rPr>
+      </w:pPr>
+      <w:r>
+        <w:rPr>
+          <w:rFonts w:ascii="Segoe UI Emoji" w:hAnsi="Segoe UI Emoji" w:cs="Segoe UI Emoji"/>
+          <w:b/>
+          <w:bCs/>
+        </w:rPr>
+        <w:t>console.log(</w:t>
+      </w:r>
+      <w:proofErr w:type="spellStart"/>
+      <w:proofErr w:type="gramStart"/>
+      <w:r>
+        <w:rPr>
+          <w:rFonts w:ascii="Segoe UI Emoji" w:hAnsi="Segoe UI Emoji" w:cs="Segoe UI Emoji"/>
+          <w:b/>
+          <w:bCs/>
+        </w:rPr>
+        <w:t>button.dataset</w:t>
+      </w:r>
+      <w:proofErr w:type="gramEnd"/>
+      <w:r>
+        <w:rPr>
+          <w:rFonts w:ascii="Segoe UI Emoji" w:hAnsi="Segoe UI Emoji" w:cs="Segoe UI Emoji"/>
+          <w:b/>
+          <w:bCs/>
+        </w:rPr>
+        <w:t>.role</w:t>
+      </w:r>
+      <w:proofErr w:type="spellEnd"/>
+      <w:r>
+        <w:rPr>
+          <w:rFonts w:ascii="Segoe UI Emoji" w:hAnsi="Segoe UI Emoji" w:cs="Segoe UI Emoji"/>
+          <w:b/>
+          <w:bCs/>
+        </w:rPr>
+        <w:t>);</w:t>
+      </w:r>
+    </w:p>
+    <w:p>
+      <w:pPr>
+        <w:spacing w:line="240" w:lineRule="auto"/>
+        <w:jc w:val="both"/>
+        <w:rPr>
+          <w:rFonts w:ascii="Segoe UI Emoji" w:hAnsi="Segoe UI Emoji" w:cs="Segoe UI Emoji"/>
+          <w:b/>
+          <w:bCs/>
+        </w:rPr>
+      </w:pPr>
+      <w:r>
+        <w:rPr>
+          <w:rFonts w:ascii="Segoe UI Emoji" w:hAnsi="Segoe UI Emoji" w:cs="Segoe UI Emoji"/>
+          <w:b/>
+          <w:bCs/>
+        </w:rPr>
+        <w:t>Output:</w:t>
+      </w:r>
+    </w:p>
+    <w:p>
+      <w:pPr>
+        <w:spacing w:line="240" w:lineRule="auto"/>
+        <w:jc w:val="both"/>
+        <w:rPr>
+          <w:rFonts w:ascii="Segoe UI Emoji" w:hAnsi="Segoe UI Emoji" w:cs="Segoe UI Emoji"/>
+          <w:b/>
+          <w:bCs/>
+        </w:rPr>
+      </w:pPr>
+      <w:r>
+        <w:rPr>
+          <w:rFonts w:ascii="Segoe UI Emoji" w:hAnsi="Segoe UI Emoji" w:cs="Segoe UI Emoji"/>
+          <w:b/>
+          <w:bCs/>
+        </w:rPr>
+        <w:t>101</w:t>
+      </w:r>
+    </w:p>
+    <w:p>
+      <w:pPr>
+        <w:spacing w:line="240" w:lineRule="auto"/>
+        <w:jc w:val="both"/>
+        <w:rPr>
+          <w:rFonts w:ascii="Segoe UI Emoji" w:hAnsi="Segoe UI Emoji" w:cs="Segoe UI Emoji"/>
+          <w:b/>
+          <w:bCs/>
+        </w:rPr>
+      </w:pPr>
+      <w:r>
+        <w:rPr>
+          <w:rFonts w:ascii="Segoe UI Emoji" w:hAnsi="Segoe UI Emoji" w:cs="Segoe UI Emoji"/>
+          <w:b/>
+          <w:bCs/>
+        </w:rPr>
+        <w:t>admin</w:t>
+      </w:r>
+    </w:p>
+    <w:p>
+      <w:pPr>
+        <w:spacing w:line="240" w:lineRule="auto"/>
+        <w:jc w:val="both"/>
+        <w:rPr>
+          <w:rFonts w:ascii="Segoe UI Emoji" w:hAnsi="Segoe UI Emoji" w:cs="Segoe UI Emoji"/>
+          <w:b/>
+          <w:bCs/>
+        </w:rPr>
+      </w:pPr>
+      <w:r>
+        <w:rPr>
+          <w:rFonts w:ascii="Segoe UI Emoji" w:hAnsi="Segoe UI Emoji" w:cs="Segoe UI Emoji"/>
+          <w:b/>
+          <w:bCs/>
+        </w:rPr>
+        <w:t>Interview point: Custom attributes should use the data-* format.</w:t>
+      </w:r>
+    </w:p>
+    <w:p>
+      <w:pPr>
+        <w:spacing w:line="240" w:lineRule="auto"/>
+        <w:jc w:val="both"/>
+        <w:rPr>
+          <w:rFonts w:ascii="Segoe UI Emoji" w:hAnsi="Segoe UI Emoji" w:cs="Segoe UI Emoji"/>
+          <w:b/>
+          <w:bCs/>
+        </w:rPr>
+      </w:pPr>
+      <w:r>
+        <w:rPr>
+          <w:rFonts w:ascii="Segoe UI Emoji" w:hAnsi="Segoe UI Emoji" w:cs="Segoe UI Emoji"/>
+          <w:b/>
+          <w:bCs/>
+        </w:rPr>
+        <w:pict w14:anchorId="7C6DD09B">
+          <v:rect id="_x0000_i1047" style="width:0;height:1.5pt" o:hralign="center" o:hrstd="t" o:hr="t" fillcolor="#a0a0a0" stroked="f"/>
+        </w:pict>
+      </w:r>
+    </w:p>
+    <w:p>
+      <w:pPr>
+        <w:spacing w:line="240" w:lineRule="auto"/>
+        <w:jc w:val="both"/>
+        <w:rPr>
+          <w:rFonts w:ascii="Segoe UI Emoji" w:hAnsi="Segoe UI Emoji" w:cs="Segoe UI Emoji"/>
+          <w:b/>
+          <w:bCs/>
+        </w:rPr>
+      </w:pPr>
+      <w:r>
+        <w:rPr>
+          <w:rFonts w:ascii="Segoe UI Emoji" w:hAnsi="Segoe UI Emoji" w:cs="Segoe UI Emoji"/>
+          <w:b/>
+          <w:bCs/>
+        </w:rPr>
+        <w:t>27. What is the HTML &lt;canvas&gt; element?</w:t>
+      </w:r>
+    </w:p>
+    <w:p>
+      <w:pPr>
+        <w:spacing w:line="240" w:lineRule="auto"/>
+        <w:jc w:val="both"/>
+        <w:rPr>
+          <w:rFonts w:ascii="Segoe UI Emoji" w:hAnsi="Segoe UI Emoji" w:cs="Segoe UI Emoji"/>
+          <w:b/>
+          <w:bCs/>
+        </w:rPr>
+      </w:pPr>
+      <w:r>
+        <w:rPr>
+          <w:rFonts w:ascii="Segoe UI Emoji" w:hAnsi="Segoe UI Emoji" w:cs="Segoe UI Emoji"/>
+          <w:b/>
+          <w:bCs/>
+        </w:rPr>
+        <w:t>Answer:</w:t>
+      </w:r>
+      <w:r>
+        <w:rPr>
+          <w:rFonts w:ascii="Segoe UI Emoji" w:hAnsi="Segoe UI Emoji" w:cs="Segoe UI Emoji"/>
+          <w:b/>
+          <w:bCs/>
+        </w:rPr>
+        <w:br/>
+        <w:t>The &lt;canvas&gt; element provides a drawing area that JavaScript can use to create graphics, animations, charts, games, and other visual content.</w:t>
+      </w:r>
+    </w:p>
+    <w:p>
+      <w:pPr>
+        <w:spacing w:line="240" w:lineRule="auto"/>
+        <w:jc w:val="both"/>
+        <w:rPr>
+          <w:rFonts w:ascii="Segoe UI Emoji" w:hAnsi="Segoe UI Emoji" w:cs="Segoe UI Emoji"/>
+          <w:b/>
+          <w:bCs/>
+        </w:rPr>
+      </w:pPr>
+      <w:r>
+        <w:rPr>
+          <w:rFonts w:ascii="Segoe UI Emoji" w:hAnsi="Segoe UI Emoji" w:cs="Segoe UI Emoji"/>
+          <w:b/>
+          <w:bCs/>
+        </w:rPr>
+        <w:t>Example:</w:t>
+      </w:r>
+    </w:p>
+    <w:p>
+      <w:pPr>
+        <w:spacing w:line="240" w:lineRule="auto"/>
+        <w:jc w:val="both"/>
+        <w:rPr>
+          <w:rFonts w:ascii="Segoe UI Emoji" w:hAnsi="Segoe UI Emoji" w:cs="Segoe UI Emoji"/>
+          <w:b/>
+          <w:bCs/>
+        </w:rPr>
+      </w:pPr>
+      <w:r>
+        <w:rPr>
+          <w:rFonts w:ascii="Segoe UI Emoji" w:hAnsi="Segoe UI Emoji" w:cs="Segoe UI Emoji"/>
+          <w:b/>
+          <w:bCs/>
+        </w:rPr>
+        <w:t>&lt;canvas id="</w:t>
+      </w:r>
+      <w:proofErr w:type="spellStart"/>
+      <w:r>
+        <w:rPr>
+          <w:rFonts w:ascii="Segoe UI Emoji" w:hAnsi="Segoe UI Emoji" w:cs="Segoe UI Emoji"/>
+          <w:b/>
+          <w:bCs/>
+        </w:rPr>
+        <w:t>myCanvas</w:t>
+      </w:r>
+      <w:proofErr w:type="spellEnd"/>
+      <w:r>
+        <w:rPr>
+          <w:rFonts w:ascii="Segoe UI Emoji" w:hAnsi="Segoe UI Emoji" w:cs="Segoe UI Emoji"/>
+          <w:b/>
+          <w:bCs/>
+        </w:rPr>
+        <w:t>" width="400" height="200"&gt;&lt;/canvas&gt;</w:t>
+      </w:r>
+    </w:p>
+    <w:p>
+      <w:pPr>
+        <w:spacing w:line="240" w:lineRule="auto"/>
+        <w:jc w:val="both"/>
+        <w:rPr>
+          <w:rFonts w:ascii="Segoe UI Emoji" w:hAnsi="Segoe UI Emoji" w:cs="Segoe UI Emoji"/>
+          <w:b/>
+          <w:bCs/>
+        </w:rPr>
+      </w:pPr>
+      <w:r>
+        <w:rPr>
+          <w:rFonts w:ascii="Segoe UI Emoji" w:hAnsi="Segoe UI Emoji" w:cs="Segoe UI Emoji"/>
+          <w:b/>
+          <w:bCs/>
+        </w:rPr>
+        <w:t>JavaScript:</w:t>
+      </w:r>
+    </w:p>
+    <w:p>
+      <w:pPr>
+        <w:spacing w:line="240" w:lineRule="auto"/>
+        <w:jc w:val="both"/>
+        <w:rPr>
+          <w:rFonts w:ascii="Segoe UI Emoji" w:hAnsi="Segoe UI Emoji" w:cs="Segoe UI Emoji"/>
+          <w:b/>
+          <w:bCs/>
+        </w:rPr>
+      </w:pPr>
+      <w:proofErr w:type="spellStart"/>
+      <w:r>
+        <w:rPr>
+          <w:rFonts w:ascii="Segoe UI Emoji" w:hAnsi="Segoe UI Emoji" w:cs="Segoe UI Emoji"/>
+          <w:b/>
+          <w:bCs/>
+        </w:rPr>
+        <w:t>const</w:t>
+      </w:r>
+      <w:proofErr w:type="spellEnd"/>
+      <w:r>
+        <w:rPr>
+          <w:rFonts w:ascii="Segoe UI Emoji" w:hAnsi="Segoe UI Emoji" w:cs="Segoe UI Emoji"/>
+          <w:b/>
+          <w:bCs/>
+        </w:rPr>
+        <w:t xml:space="preserve"> canvas = </w:t>
+      </w:r>
+      <w:proofErr w:type="spellStart"/>
+      <w:proofErr w:type="gramStart"/>
+      <w:r>
+        <w:rPr>
+          <w:rFonts w:ascii="Segoe UI Emoji" w:hAnsi="Segoe UI Emoji" w:cs="Segoe UI Emoji"/>
+          <w:b/>
+          <w:bCs/>
+        </w:rPr>
+        <w:t>document.getElementById</w:t>
+      </w:r>
+      <w:proofErr w:type="spellEnd"/>
+      <w:proofErr w:type="gramEnd"/>
+      <w:r>
+        <w:rPr>
+          <w:rFonts w:ascii="Segoe UI Emoji" w:hAnsi="Segoe UI Emoji" w:cs="Segoe UI Emoji"/>
+          <w:b/>
+          <w:bCs/>
+        </w:rPr>
+        <w:t>("</w:t>
+      </w:r>
+      <w:proofErr w:type="spellStart"/>
+      <w:r>
+        <w:rPr>
+          <w:rFonts w:ascii="Segoe UI Emoji" w:hAnsi="Segoe UI Emoji" w:cs="Segoe UI Emoji"/>
+          <w:b/>
+          <w:bCs/>
+        </w:rPr>
+        <w:t>myCanvas</w:t>
+      </w:r>
+      <w:proofErr w:type="spellEnd"/>
+      <w:r>
+        <w:rPr>
+          <w:rFonts w:ascii="Segoe UI Emoji" w:hAnsi="Segoe UI Emoji" w:cs="Segoe UI Emoji"/>
+          <w:b/>
+          <w:bCs/>
+        </w:rPr>
+        <w:t>");</w:t>
+      </w:r>
+    </w:p>
+    <w:p>
+      <w:pPr>
+        <w:spacing w:line="240" w:lineRule="auto"/>
+        <w:jc w:val="both"/>
+        <w:rPr>
+          <w:rFonts w:ascii="Segoe UI Emoji" w:hAnsi="Segoe UI Emoji" w:cs="Segoe UI Emoji"/>
+          <w:b/>
+          <w:bCs/>
+        </w:rPr>
+      </w:pPr>
+      <w:proofErr w:type="spellStart"/>
+      <w:r>
+        <w:rPr>
+          <w:rFonts w:ascii="Segoe UI Emoji" w:hAnsi="Segoe UI Emoji" w:cs="Segoe UI Emoji"/>
+          <w:b/>
+          <w:bCs/>
+        </w:rPr>
+        <w:t>const</w:t>
+      </w:r>
+      <w:proofErr w:type="spellEnd"/>
+      <w:r>
+        <w:rPr>
+          <w:rFonts w:ascii="Segoe UI Emoji" w:hAnsi="Segoe UI Emoji" w:cs="Segoe UI Emoji"/>
+          <w:b/>
+          <w:bCs/>
+        </w:rPr>
+        <w:t xml:space="preserve"> </w:t>
+      </w:r>
+      <w:proofErr w:type="spellStart"/>
+      <w:r>
+        <w:rPr>
+          <w:rFonts w:ascii="Segoe UI Emoji" w:hAnsi="Segoe UI Emoji" w:cs="Segoe UI Emoji"/>
+          <w:b/>
+          <w:bCs/>
+        </w:rPr>
+        <w:t>ctx</w:t>
+      </w:r>
+      <w:proofErr w:type="spellEnd"/>
+      <w:r>
+        <w:rPr>
+          <w:rFonts w:ascii="Segoe UI Emoji" w:hAnsi="Segoe UI Emoji" w:cs="Segoe UI Emoji"/>
+          <w:b/>
+          <w:bCs/>
+        </w:rPr>
+        <w:t xml:space="preserve"> = </w:t>
+      </w:r>
+      <w:proofErr w:type="spellStart"/>
+      <w:proofErr w:type="gramStart"/>
+      <w:r>
+        <w:rPr>
+          <w:rFonts w:ascii="Segoe UI Emoji" w:hAnsi="Segoe UI Emoji" w:cs="Segoe UI Emoji"/>
+          <w:b/>
+          <w:bCs/>
+        </w:rPr>
+        <w:t>canvas.getContext</w:t>
+      </w:r>
+      <w:proofErr w:type="spellEnd"/>
+      <w:proofErr w:type="gramEnd"/>
+      <w:r>
+        <w:rPr>
+          <w:rFonts w:ascii="Segoe UI Emoji" w:hAnsi="Segoe UI Emoji" w:cs="Segoe UI Emoji"/>
+          <w:b/>
+          <w:bCs/>
+        </w:rPr>
+        <w:t>("2d");</w:t>
+      </w:r>
+    </w:p>
+    <w:p>
+      <w:pPr>
+        <w:spacing w:line="240" w:lineRule="auto"/>
+        <w:jc w:val="both"/>
+        <w:rPr>
+          <w:rFonts w:ascii="Segoe UI Emoji" w:hAnsi="Segoe UI Emoji" w:cs="Segoe UI Emoji"/>
+          <w:b/>
+          <w:bCs/>
+        </w:rPr>
+      </w:pPr>
+    </w:p>
+    <w:p>
+      <w:pPr>
+        <w:spacing w:line="240" w:lineRule="auto"/>
+        <w:jc w:val="both"/>
+        <w:rPr>
+          <w:rFonts w:ascii="Segoe UI Emoji" w:hAnsi="Segoe UI Emoji" w:cs="Segoe UI Emoji"/>
+          <w:b/>
+          <w:bCs/>
+        </w:rPr>
+      </w:pPr>
+      <w:proofErr w:type="spellStart"/>
+      <w:proofErr w:type="gramStart"/>
+      <w:r>
+        <w:rPr>
+          <w:rFonts w:ascii="Segoe UI Emoji" w:hAnsi="Segoe UI Emoji" w:cs="Segoe UI Emoji"/>
+          <w:b/>
+          <w:bCs/>
+        </w:rPr>
+        <w:t>ctx.fillRect</w:t>
+      </w:r>
+      <w:proofErr w:type="spellEnd"/>
+      <w:proofErr w:type="gramEnd"/>
+      <w:r>
+        <w:rPr>
+          <w:rFonts w:ascii="Segoe UI Emoji" w:hAnsi="Segoe UI Emoji" w:cs="Segoe UI Emoji"/>
+          <w:b/>
+          <w:bCs/>
+        </w:rPr>
+        <w:t>(50, 50, 100, 100);</w:t>
+      </w:r>
+    </w:p>
+    <w:p>
+      <w:pPr>
+        <w:spacing w:line="240" w:lineRule="auto"/>
+        <w:jc w:val="both"/>
+        <w:rPr>
+          <w:rFonts w:ascii="Segoe UI Emoji" w:hAnsi="Segoe UI Emoji" w:cs="Segoe UI Emoji"/>
+          <w:b/>
+          <w:bCs/>
+        </w:rPr>
+      </w:pPr>
+      <w:r>
+        <w:rPr>
+          <w:rFonts w:ascii="Segoe UI Emoji" w:hAnsi="Segoe UI Emoji" w:cs="Segoe UI Emoji"/>
+          <w:b/>
+          <w:bCs/>
+        </w:rPr>
+        <w:t>Interview point: Canvas is mainly a drawing surface; JavaScript is used to draw on it.</w:t>
+      </w:r>
+    </w:p>
+    <w:p>
+      <w:pPr>
+        <w:spacing w:line="240" w:lineRule="auto"/>
+        <w:jc w:val="both"/>
+        <w:rPr>
+          <w:rFonts w:ascii="Segoe UI Emoji" w:hAnsi="Segoe UI Emoji" w:cs="Segoe UI Emoji"/>
+          <w:b/>
+          <w:bCs/>
+        </w:rPr>
+      </w:pPr>
+      <w:r>
+        <w:rPr>
+          <w:rFonts w:ascii="Segoe UI Emoji" w:hAnsi="Segoe UI Emoji" w:cs="Segoe UI Emoji"/>
+          <w:b/>
+          <w:bCs/>
+        </w:rPr>
+        <w:pict w14:anchorId="1BE8C62B">
+          <v:rect id="_x0000_i1048" style="width:0;height:1.5pt" o:hralign="center" o:hrstd="t" o:hr="t" fillcolor="#a0a0a0" stroked="f"/>
+        </w:pict>
+      </w:r>
+    </w:p>
+    <w:p>
+      <w:pPr>
+        <w:spacing w:line="240" w:lineRule="auto"/>
+        <w:jc w:val="both"/>
+        <w:rPr>
+          <w:rFonts w:ascii="Segoe UI Emoji" w:hAnsi="Segoe UI Emoji" w:cs="Segoe UI Emoji"/>
+          <w:b/>
+          <w:bCs/>
+        </w:rPr>
+      </w:pPr>
+      <w:r>
+        <w:rPr>
+          <w:rFonts w:ascii="Segoe UI Emoji" w:hAnsi="Segoe UI Emoji" w:cs="Segoe UI Emoji"/>
+          <w:b/>
+          <w:bCs/>
+        </w:rPr>
+        <w:t>28. What is SVG in HTML?</w:t>
+      </w:r>
+    </w:p>
+    <w:p>
+      <w:pPr>
+        <w:spacing w:line="240" w:lineRule="auto"/>
+        <w:jc w:val="both"/>
+        <w:rPr>
+          <w:rFonts w:ascii="Segoe UI Emoji" w:hAnsi="Segoe UI Emoji" w:cs="Segoe UI Emoji"/>
+          <w:b/>
+          <w:bCs/>
+        </w:rPr>
+      </w:pPr>
+      <w:r>
+        <w:rPr>
+          <w:rFonts w:ascii="Segoe UI Emoji" w:hAnsi="Segoe UI Emoji" w:cs="Segoe UI Emoji"/>
+          <w:b/>
+          <w:bCs/>
+        </w:rPr>
+        <w:lastRenderedPageBreak/>
+        <w:t>Answer:</w:t>
+      </w:r>
+      <w:r>
+        <w:rPr>
+          <w:rFonts w:ascii="Segoe UI Emoji" w:hAnsi="Segoe UI Emoji" w:cs="Segoe UI Emoji"/>
+          <w:b/>
+          <w:bCs/>
+        </w:rPr>
+        <w:br/>
+        <w:t>SVG stands for Scalable Vector Graphics. It is used to create vector-based graphics such as icons, logos, diagrams, and illustrations.</w:t>
+      </w:r>
+    </w:p>
+    <w:p>
+      <w:pPr>
+        <w:spacing w:line="240" w:lineRule="auto"/>
+        <w:jc w:val="both"/>
+        <w:rPr>
+          <w:rFonts w:ascii="Segoe UI Emoji" w:hAnsi="Segoe UI Emoji" w:cs="Segoe UI Emoji"/>
+          <w:b/>
+          <w:bCs/>
+        </w:rPr>
+      </w:pPr>
+      <w:r>
+        <w:rPr>
+          <w:rFonts w:ascii="Segoe UI Emoji" w:hAnsi="Segoe UI Emoji" w:cs="Segoe UI Emoji"/>
+          <w:b/>
+          <w:bCs/>
+        </w:rPr>
+        <w:t>Example:</w:t>
+      </w:r>
+    </w:p>
+    <w:p>
+      <w:pPr>
+        <w:spacing w:line="240" w:lineRule="auto"/>
+        <w:jc w:val="both"/>
+        <w:rPr>
+          <w:rFonts w:ascii="Segoe UI Emoji" w:hAnsi="Segoe UI Emoji" w:cs="Segoe UI Emoji"/>
+          <w:b/>
+          <w:bCs/>
+        </w:rPr>
+      </w:pPr>
+      <w:r>
+        <w:rPr>
+          <w:rFonts w:ascii="Segoe UI Emoji" w:hAnsi="Segoe UI Emoji" w:cs="Segoe UI Emoji"/>
+          <w:b/>
+          <w:bCs/>
+        </w:rPr>
+        <w:t>SVG vs Canvas</w:t>
+      </w:r>
+    </w:p>
+    <w:tbl>
+      <w:tblPr>
+        <w:tblW w:w="0" w:type="auto"/>
+        <w:tblCellSpacing w:w="15" w:type="dxa"/>
+        <w:tblCellMar>
+          <w:top w:w="15" w:type="dxa"/>
+          <w:left w:w="15" w:type="dxa"/>
+          <w:bottom w:w="15" w:type="dxa"/>
+          <w:right w:w="15" w:type="dxa"/>
+        </w:tblCellMar>
+        <w:tblLook w:val="04A0" w:firstRow="1" w:lastRow="0" w:firstColumn="1" w:lastColumn="0" w:noHBand="0" w:noVBand="1"/>
+      </w:tblPr>
+      <w:tblGrid>
+        <w:gridCol w:w="4348"/>
+        <w:gridCol w:w="4678"/>
+      </w:tblGrid>
+      <w:tr>
+        <w:trPr>
+          <w:tblHeader/>
+          <w:tblCellSpacing w:w="15" w:type="dxa"/>
+        </w:trPr>
+        <w:tc>
+          <w:tcPr>
+            <w:tcW w:w="0" w:type="auto"/>
+            <w:vAlign w:val="center"/>
+            <w:hideMark/>
+          </w:tcPr>
+          <w:p>
+            <w:pPr>
+              <w:spacing w:line="240" w:lineRule="auto"/>
+              <w:jc w:val="both"/>
+              <w:rPr>
+                <w:rFonts w:ascii="Segoe UI Emoji" w:hAnsi="Segoe UI Emoji" w:cs="Segoe UI Emoji"/>
+                <w:b/>
+                <w:bCs/>
+              </w:rPr>
+            </w:pPr>
+            <w:r>
+              <w:rPr>
+                <w:rFonts w:ascii="Segoe UI Emoji" w:hAnsi="Segoe UI Emoji" w:cs="Segoe UI Emoji"/>
+                <w:b/>
+                <w:bCs/>
+              </w:rPr>
+              <w:t>SVG</w:t>
+            </w:r>
+          </w:p>
+        </w:tc>
+        <w:tc>
+          <w:tcPr>
+            <w:tcW w:w="0" w:type="auto"/>
+            <w:vAlign w:val="center"/>
+            <w:hideMark/>
+          </w:tcPr>
+          <w:p>
+            <w:pPr>
+              <w:spacing w:line="240" w:lineRule="auto"/>
+              <w:jc w:val="both"/>
+              <w:rPr>
+                <w:rFonts w:ascii="Segoe UI Emoji" w:hAnsi="Segoe UI Emoji" w:cs="Segoe UI Emoji"/>
+                <w:b/>
+                <w:bCs/>
+              </w:rPr>
+            </w:pPr>
+            <w:r>
+              <w:rPr>
+                <w:rFonts w:ascii="Segoe UI Emoji" w:hAnsi="Segoe UI Emoji" w:cs="Segoe UI Emoji"/>
+                <w:b/>
+                <w:bCs/>
+              </w:rPr>
+              <w:t>Canvas</w:t>
+            </w:r>
+          </w:p>
+        </w:tc>
+      </w:tr>
+      <w:tr>
+        <w:trPr>
+          <w:tblCellSpacing w:w="15" w:type="dxa"/>
+        </w:trPr>
+        <w:tc>
+          <w:tcPr>
+            <w:tcW w:w="0" w:type="auto"/>
+            <w:vAlign w:val="center"/>
+            <w:hideMark/>
+          </w:tcPr>
+          <w:p>
+            <w:pPr>
+              <w:spacing w:line="240" w:lineRule="auto"/>
+              <w:jc w:val="both"/>
+              <w:rPr>
+                <w:rFonts w:ascii="Segoe UI Emoji" w:hAnsi="Segoe UI Emoji" w:cs="Segoe UI Emoji"/>
+                <w:b/>
+                <w:bCs/>
+              </w:rPr>
+            </w:pPr>
+            <w:r>
+              <w:rPr>
+                <w:rFonts w:ascii="Segoe UI Emoji" w:hAnsi="Segoe UI Emoji" w:cs="Segoe UI Emoji"/>
+                <w:b/>
+                <w:bCs/>
+              </w:rPr>
+              <w:t>Vector-based</w:t>
+            </w:r>
+          </w:p>
+        </w:tc>
+        <w:tc>
+          <w:tcPr>
+            <w:tcW w:w="0" w:type="auto"/>
+            <w:vAlign w:val="center"/>
+            <w:hideMark/>
+          </w:tcPr>
+          <w:p>
+            <w:pPr>
+              <w:spacing w:line="240" w:lineRule="auto"/>
+              <w:jc w:val="both"/>
+              <w:rPr>
+                <w:rFonts w:ascii="Segoe UI Emoji" w:hAnsi="Segoe UI Emoji" w:cs="Segoe UI Emoji"/>
+                <w:b/>
+                <w:bCs/>
+              </w:rPr>
+            </w:pPr>
+            <w:r>
+              <w:rPr>
+                <w:rFonts w:ascii="Segoe UI Emoji" w:hAnsi="Segoe UI Emoji" w:cs="Segoe UI Emoji"/>
+                <w:b/>
+                <w:bCs/>
+              </w:rPr>
+              <w:t>Pixel-based drawing surface</w:t>
+            </w:r>
+          </w:p>
+        </w:tc>
+      </w:tr>
+      <w:tr>
+        <w:trPr>
+          <w:tblCellSpacing w:w="15" w:type="dxa"/>
+        </w:trPr>
+        <w:tc>
+          <w:tcPr>
+            <w:tcW w:w="0" w:type="auto"/>
+            <w:vAlign w:val="center"/>
+            <w:hideMark/>
+          </w:tcPr>
+          <w:p>
+            <w:pPr>
+              <w:spacing w:line="240" w:lineRule="auto"/>
+              <w:jc w:val="both"/>
+              <w:rPr>
+                <w:rFonts w:ascii="Segoe UI Emoji" w:hAnsi="Segoe UI Emoji" w:cs="Segoe UI Emoji"/>
+                <w:b/>
+                <w:bCs/>
+              </w:rPr>
+            </w:pPr>
+            <w:r>
+              <w:rPr>
+                <w:rFonts w:ascii="Segoe UI Emoji" w:hAnsi="Segoe UI Emoji" w:cs="Segoe UI Emoji"/>
+                <w:b/>
+                <w:bCs/>
+              </w:rPr>
+              <w:t>Elements can be manipulated individually</w:t>
+            </w:r>
+          </w:p>
+        </w:tc>
+        <w:tc>
+          <w:tcPr>
+            <w:tcW w:w="0" w:type="auto"/>
+            <w:vAlign w:val="center"/>
+            <w:hideMark/>
+          </w:tcPr>
+          <w:p>
+            <w:pPr>
+              <w:spacing w:line="240" w:lineRule="auto"/>
+              <w:jc w:val="both"/>
+              <w:rPr>
+                <w:rFonts w:ascii="Segoe UI Emoji" w:hAnsi="Segoe UI Emoji" w:cs="Segoe UI Emoji"/>
+                <w:b/>
+                <w:bCs/>
+              </w:rPr>
+            </w:pPr>
+            <w:r>
+              <w:rPr>
+                <w:rFonts w:ascii="Segoe UI Emoji" w:hAnsi="Segoe UI Emoji" w:cs="Segoe UI Emoji"/>
+                <w:b/>
+                <w:bCs/>
+              </w:rPr>
+              <w:t>Drawing is generally rendered onto the canvas</w:t>
+            </w:r>
+          </w:p>
+        </w:tc>
+      </w:tr>
+      <w:tr>
+        <w:trPr>
+          <w:tblCellSpacing w:w="15" w:type="dxa"/>
+        </w:trPr>
+        <w:tc>
+          <w:tcPr>
+            <w:tcW w:w="0" w:type="auto"/>
+            <w:vAlign w:val="center"/>
+            <w:hideMark/>
+          </w:tcPr>
+          <w:p>
+            <w:pPr>
+              <w:spacing w:line="240" w:lineRule="auto"/>
+              <w:jc w:val="both"/>
+              <w:rPr>
+                <w:rFonts w:ascii="Segoe UI Emoji" w:hAnsi="Segoe UI Emoji" w:cs="Segoe UI Emoji"/>
+                <w:b/>
+                <w:bCs/>
+              </w:rPr>
+            </w:pPr>
+            <w:r>
+              <w:rPr>
+                <w:rFonts w:ascii="Segoe UI Emoji" w:hAnsi="Segoe UI Emoji" w:cs="Segoe UI Emoji"/>
+                <w:b/>
+                <w:bCs/>
+              </w:rPr>
+              <w:t>Good for icons, diagrams and scalable graphics</w:t>
+            </w:r>
+          </w:p>
+        </w:tc>
+        <w:tc>
+          <w:tcPr>
+            <w:tcW w:w="0" w:type="auto"/>
+            <w:vAlign w:val="center"/>
+            <w:hideMark/>
+          </w:tcPr>
+          <w:p>
+            <w:pPr>
+              <w:spacing w:line="240" w:lineRule="auto"/>
+              <w:jc w:val="both"/>
+              <w:rPr>
+                <w:rFonts w:ascii="Segoe UI Emoji" w:hAnsi="Segoe UI Emoji" w:cs="Segoe UI Emoji"/>
+                <w:b/>
+                <w:bCs/>
+              </w:rPr>
+            </w:pPr>
+            <w:r>
+              <w:rPr>
+                <w:rFonts w:ascii="Segoe UI Emoji" w:hAnsi="Segoe UI Emoji" w:cs="Segoe UI Emoji"/>
+                <w:b/>
+                <w:bCs/>
+              </w:rPr>
+              <w:t>Good for games, complex drawings and animations</w:t>
+            </w:r>
+          </w:p>
+        </w:tc>
+      </w:tr>
+    </w:tbl>
+    <w:p>
+      <w:pPr>
+        <w:spacing w:line="240" w:lineRule="auto"/>
+        <w:jc w:val="both"/>
+        <w:rPr>
+          <w:rFonts w:ascii="Segoe UI Emoji" w:hAnsi="Segoe UI Emoji" w:cs="Segoe UI Emoji"/>
+          <w:b/>
+          <w:bCs/>
+        </w:rPr>
+      </w:pPr>
+      <w:r>
+        <w:rPr>
+          <w:rFonts w:ascii="Segoe UI Emoji" w:hAnsi="Segoe UI Emoji" w:cs="Segoe UI Emoji"/>
+          <w:b/>
+          <w:bCs/>
+        </w:rPr>
+        <w:pict w14:anchorId="1B6364B5">
+          <v:rect id="_x0000_i1061" style="width:0;height:1.5pt" o:hralign="center" o:hrstd="t" o:hr="t" fillcolor="#a0a0a0" stroked="f"/>
+        </w:pict>
+      </w:r>
+    </w:p>
+    <w:p>
+      <w:pPr>
+        <w:spacing w:line="240" w:lineRule="auto"/>
+        <w:jc w:val="both"/>
+        <w:rPr>
+          <w:rFonts w:ascii="Segoe UI Emoji" w:hAnsi="Segoe UI Emoji" w:cs="Segoe UI Emoji"/>
+          <w:b/>
+          <w:bCs/>
+        </w:rPr>
+      </w:pPr>
+      <w:r>
+        <w:rPr>
+          <w:rFonts w:ascii="Segoe UI Emoji" w:hAnsi="Segoe UI Emoji" w:cs="Segoe UI Emoji"/>
+          <w:b/>
+          <w:bCs/>
+        </w:rPr>
+        <w:t>29. What is the DOM?</w:t>
+      </w:r>
+    </w:p>
+    <w:p>
+      <w:pPr>
+        <w:spacing w:line="240" w:lineRule="auto"/>
+        <w:jc w:val="both"/>
+        <w:rPr>
+          <w:rFonts w:ascii="Segoe UI Emoji" w:hAnsi="Segoe UI Emoji" w:cs="Segoe UI Emoji"/>
+          <w:b/>
+          <w:bCs/>
+        </w:rPr>
+      </w:pPr>
+      <w:r>
+        <w:rPr>
+          <w:rFonts w:ascii="Segoe UI Emoji" w:hAnsi="Segoe UI Emoji" w:cs="Segoe UI Emoji"/>
+          <w:b/>
+          <w:bCs/>
+        </w:rPr>
+        <w:t>Answer:</w:t>
+      </w:r>
+      <w:r>
+        <w:rPr>
+          <w:rFonts w:ascii="Segoe UI Emoji" w:hAnsi="Segoe UI Emoji" w:cs="Segoe UI Emoji"/>
+          <w:b/>
+          <w:bCs/>
+        </w:rPr>
+        <w:br/>
+        <w:t>DOM stands for Document Object Model. The browser represents an HTML document as a tree of objects/nodes.</w:t>
+      </w:r>
+    </w:p>
+    <w:p>
+      <w:pPr>
+        <w:spacing w:line="240" w:lineRule="auto"/>
+        <w:jc w:val="both"/>
+        <w:rPr>
+          <w:rFonts w:ascii="Segoe UI Emoji" w:hAnsi="Segoe UI Emoji" w:cs="Segoe UI Emoji"/>
+          <w:b/>
+          <w:bCs/>
+        </w:rPr>
+      </w:pPr>
+      <w:r>
+        <w:rPr>
+          <w:rFonts w:ascii="Segoe UI Emoji" w:hAnsi="Segoe UI Emoji" w:cs="Segoe UI Emoji"/>
+          <w:b/>
+          <w:bCs/>
+        </w:rPr>
+        <w:t>Example:</w:t>
+      </w:r>
+    </w:p>
+    <w:p>
+      <w:pPr>
+        <w:spacing w:line="240" w:lineRule="auto"/>
+        <w:jc w:val="both"/>
+        <w:rPr>
+          <w:rFonts w:ascii="Segoe UI Emoji" w:hAnsi="Segoe UI Emoji" w:cs="Segoe UI Emoji"/>
+          <w:b/>
+          <w:bCs/>
+        </w:rPr>
+      </w:pPr>
+      <w:r>
+        <w:rPr>
+          <w:rFonts w:ascii="Segoe UI Emoji" w:hAnsi="Segoe UI Emoji" w:cs="Segoe UI Emoji"/>
+          <w:b/>
+          <w:bCs/>
+        </w:rPr>
+        <w:t>&lt;body&gt;</w:t>
+      </w:r>
+    </w:p>
+    <w:p>
+      <w:pPr>
+        <w:spacing w:line="240" w:lineRule="auto"/>
+        <w:jc w:val="both"/>
+        <w:rPr>
+          <w:rFonts w:ascii="Segoe UI Emoji" w:hAnsi="Segoe UI Emoji" w:cs="Segoe UI Emoji"/>
+          <w:b/>
+          <w:bCs/>
+        </w:rPr>
+      </w:pPr>
+      <w:r>
+        <w:rPr>
+          <w:rFonts w:ascii="Segoe UI Emoji" w:hAnsi="Segoe UI Emoji" w:cs="Segoe UI Emoji"/>
+          <w:b/>
+          <w:bCs/>
+        </w:rPr>
+        <w:t xml:space="preserve">    &lt;h1&gt;Hello&lt;/h1&gt;</w:t>
+      </w:r>
+    </w:p>
+    <w:p>
+      <w:pPr>
+        <w:spacing w:line="240" w:lineRule="auto"/>
+        <w:jc w:val="both"/>
+        <w:rPr>
+          <w:rFonts w:ascii="Segoe UI Emoji" w:hAnsi="Segoe UI Emoji" w:cs="Segoe UI Emoji"/>
+          <w:b/>
+          <w:bCs/>
+        </w:rPr>
+      </w:pPr>
+      <w:r>
+        <w:rPr>
+          <w:rFonts w:ascii="Segoe UI Emoji" w:hAnsi="Segoe UI Emoji" w:cs="Segoe UI Emoji"/>
+          <w:b/>
+          <w:bCs/>
+        </w:rPr>
+        <w:t xml:space="preserve">    &lt;p&gt;Welcome&lt;/p&gt;</w:t>
+      </w:r>
+    </w:p>
+    <w:p>
+      <w:pPr>
+        <w:spacing w:line="240" w:lineRule="auto"/>
+        <w:jc w:val="both"/>
+        <w:rPr>
+          <w:rFonts w:ascii="Segoe UI Emoji" w:hAnsi="Segoe UI Emoji" w:cs="Segoe UI Emoji"/>
+          <w:b/>
+          <w:bCs/>
+        </w:rPr>
+      </w:pPr>
+      <w:r>
+        <w:rPr>
+          <w:rFonts w:ascii="Segoe UI Emoji" w:hAnsi="Segoe UI Emoji" w:cs="Segoe UI Emoji"/>
+          <w:b/>
+          <w:bCs/>
+        </w:rPr>
+        <w:t>&lt;/body&gt;</w:t>
+      </w:r>
+    </w:p>
+    <w:p>
+      <w:pPr>
+        <w:spacing w:line="240" w:lineRule="auto"/>
+        <w:jc w:val="both"/>
+        <w:rPr>
+          <w:rFonts w:ascii="Segoe UI Emoji" w:hAnsi="Segoe UI Emoji" w:cs="Segoe UI Emoji"/>
+          <w:b/>
+          <w:bCs/>
+        </w:rPr>
+      </w:pPr>
+      <w:r>
+        <w:rPr>
+          <w:rFonts w:ascii="Segoe UI Emoji" w:hAnsi="Segoe UI Emoji" w:cs="Segoe UI Emoji"/>
+          <w:b/>
+          <w:bCs/>
+        </w:rPr>
+        <w:t>Conceptually:</w:t>
+      </w:r>
+    </w:p>
+    <w:p>
+      <w:pPr>
+        <w:spacing w:line="240" w:lineRule="auto"/>
+        <w:jc w:val="both"/>
+        <w:rPr>
+          <w:rFonts w:ascii="Segoe UI Emoji" w:hAnsi="Segoe UI Emoji" w:cs="Segoe UI Emoji"/>
+          <w:b/>
+          <w:bCs/>
+        </w:rPr>
+      </w:pPr>
+      <w:r>
+        <w:rPr>
+          <w:rFonts w:ascii="Segoe UI Emoji" w:hAnsi="Segoe UI Emoji" w:cs="Segoe UI Emoji"/>
+          <w:b/>
+          <w:bCs/>
+        </w:rPr>
+        <w:t>Document</w:t>
+      </w:r>
+    </w:p>
+    <w:p>
+      <w:pPr>
+        <w:spacing w:line="240" w:lineRule="auto"/>
+        <w:jc w:val="both"/>
+        <w:rPr>
+          <w:rFonts w:ascii="Segoe UI Emoji" w:hAnsi="Segoe UI Emoji" w:cs="Segoe UI Emoji"/>
+          <w:b/>
+          <w:bCs/>
+        </w:rPr>
+      </w:pPr>
+      <w:r>
+        <w:rPr>
+          <w:rFonts w:ascii="Segoe UI Emoji" w:hAnsi="Segoe UI Emoji" w:cs="Segoe UI Emoji"/>
+          <w:b/>
+          <w:bCs/>
+        </w:rPr>
+        <w:t xml:space="preserve">   |</w:t>
+      </w:r>
+    </w:p>
+    <w:p>
+      <w:pPr>
+        <w:spacing w:line="240" w:lineRule="auto"/>
+        <w:jc w:val="both"/>
+        <w:rPr>
+          <w:rFonts w:ascii="Segoe UI Emoji" w:hAnsi="Segoe UI Emoji" w:cs="Segoe UI Emoji"/>
+          <w:b/>
+          <w:bCs/>
+        </w:rPr>
+      </w:pPr>
+      <w:r>
+        <w:rPr>
+          <w:rFonts w:ascii="Segoe UI Emoji" w:hAnsi="Segoe UI Emoji" w:cs="Segoe UI Emoji"/>
+          <w:b/>
+          <w:bCs/>
+        </w:rPr>
+        <w:t xml:space="preserve">  html</w:t>
+      </w:r>
+    </w:p>
+    <w:p>
+      <w:pPr>
+        <w:spacing w:line="240" w:lineRule="auto"/>
+        <w:jc w:val="both"/>
+        <w:rPr>
+          <w:rFonts w:ascii="Segoe UI Emoji" w:hAnsi="Segoe UI Emoji" w:cs="Segoe UI Emoji"/>
+          <w:b/>
+          <w:bCs/>
+        </w:rPr>
+      </w:pPr>
+      <w:r>
+        <w:rPr>
+          <w:rFonts w:ascii="Segoe UI Emoji" w:hAnsi="Segoe UI Emoji" w:cs="Segoe UI Emoji"/>
+          <w:b/>
+          <w:bCs/>
+        </w:rPr>
+        <w:t xml:space="preserve">   |</w:t>
+      </w:r>
+    </w:p>
+    <w:p>
+      <w:pPr>
+        <w:spacing w:line="240" w:lineRule="auto"/>
+        <w:jc w:val="both"/>
+        <w:rPr>
+          <w:rFonts w:ascii="Segoe UI Emoji" w:hAnsi="Segoe UI Emoji" w:cs="Segoe UI Emoji"/>
+          <w:b/>
+          <w:bCs/>
+        </w:rPr>
+      </w:pPr>
+      <w:r>
+        <w:rPr>
+          <w:rFonts w:ascii="Segoe UI Emoji" w:hAnsi="Segoe UI Emoji" w:cs="Segoe UI Emoji"/>
+          <w:b/>
+          <w:bCs/>
+        </w:rPr>
+        <w:t xml:space="preserve">  body</w:t>
+      </w:r>
+    </w:p>
+    <w:p>
+      <w:pPr>
+        <w:spacing w:line="240" w:lineRule="auto"/>
+        <w:jc w:val="both"/>
+        <w:rPr>
+          <w:rFonts w:ascii="Segoe UI Emoji" w:hAnsi="Segoe UI Emoji" w:cs="Segoe UI Emoji"/>
+          <w:b/>
+          <w:bCs/>
+        </w:rPr>
+      </w:pPr>
+      <w:r>
+        <w:rPr>
+          <w:rFonts w:ascii="Segoe UI Emoji" w:hAnsi="Segoe UI Emoji" w:cs="Segoe UI Emoji"/>
+          <w:b/>
+          <w:bCs/>
+        </w:rPr>
+        <w:t xml:space="preserve">  /  \</w:t>
+      </w:r>
+    </w:p>
+    <w:p>
+      <w:pPr>
+        <w:spacing w:line="240" w:lineRule="auto"/>
+        <w:jc w:val="both"/>
+        <w:rPr>
+          <w:rFonts w:ascii="Segoe UI Emoji" w:hAnsi="Segoe UI Emoji" w:cs="Segoe UI Emoji"/>
+          <w:b/>
+          <w:bCs/>
+        </w:rPr>
+      </w:pPr>
+      <w:r>
+        <w:rPr>
+          <w:rFonts w:ascii="Segoe UI Emoji" w:hAnsi="Segoe UI Emoji" w:cs="Segoe UI Emoji"/>
+          <w:b/>
+          <w:bCs/>
+        </w:rPr>
+        <w:t>h1    p</w:t>
+      </w:r>
+    </w:p>
+    <w:p>
+      <w:pPr>
+        <w:spacing w:line="240" w:lineRule="auto"/>
+        <w:jc w:val="both"/>
+        <w:rPr>
+          <w:rFonts w:ascii="Segoe UI Emoji" w:hAnsi="Segoe UI Emoji" w:cs="Segoe UI Emoji"/>
+          <w:b/>
+          <w:bCs/>
+        </w:rPr>
+      </w:pPr>
+      <w:r>
+        <w:rPr>
+          <w:rFonts w:ascii="Segoe UI Emoji" w:hAnsi="Segoe UI Emoji" w:cs="Segoe UI Emoji"/>
+          <w:b/>
+          <w:bCs/>
+        </w:rPr>
+        <w:t>JavaScript can use the DOM to read, modify, add, or remove HTML elements.</w:t>
+      </w:r>
+    </w:p>
+    <w:p>
+      <w:pPr>
+        <w:spacing w:line="240" w:lineRule="auto"/>
+        <w:jc w:val="both"/>
+        <w:rPr>
+          <w:rFonts w:ascii="Segoe UI Emoji" w:hAnsi="Segoe UI Emoji" w:cs="Segoe UI Emoji"/>
+          <w:b/>
+          <w:bCs/>
+        </w:rPr>
+      </w:pPr>
+      <w:r>
+        <w:rPr>
+          <w:rFonts w:ascii="Segoe UI Emoji" w:hAnsi="Segoe UI Emoji" w:cs="Segoe UI Emoji"/>
+          <w:b/>
+          <w:bCs/>
+        </w:rPr>
+        <w:lastRenderedPageBreak/>
+        <w:t>Example:</w:t>
+      </w:r>
+    </w:p>
+    <w:p>
+      <w:pPr>
+        <w:spacing w:line="240" w:lineRule="auto"/>
+        <w:jc w:val="both"/>
+        <w:rPr>
+          <w:rFonts w:ascii="Segoe UI Emoji" w:hAnsi="Segoe UI Emoji" w:cs="Segoe UI Emoji"/>
+          <w:b/>
+          <w:bCs/>
+        </w:rPr>
+      </w:pPr>
+      <w:proofErr w:type="spellStart"/>
+      <w:r>
+        <w:rPr>
+          <w:rFonts w:ascii="Segoe UI Emoji" w:hAnsi="Segoe UI Emoji" w:cs="Segoe UI Emoji"/>
+          <w:b/>
+          <w:bCs/>
+        </w:rPr>
+        <w:t>const</w:t>
+      </w:r>
+      <w:proofErr w:type="spellEnd"/>
+      <w:r>
+        <w:rPr>
+          <w:rFonts w:ascii="Segoe UI Emoji" w:hAnsi="Segoe UI Emoji" w:cs="Segoe UI Emoji"/>
+          <w:b/>
+          <w:bCs/>
+        </w:rPr>
+        <w:t xml:space="preserve"> heading = </w:t>
+      </w:r>
+      <w:proofErr w:type="spellStart"/>
+      <w:proofErr w:type="gramStart"/>
+      <w:r>
+        <w:rPr>
+          <w:rFonts w:ascii="Segoe UI Emoji" w:hAnsi="Segoe UI Emoji" w:cs="Segoe UI Emoji"/>
+          <w:b/>
+          <w:bCs/>
+        </w:rPr>
+        <w:t>document.querySelector</w:t>
+      </w:r>
+      <w:proofErr w:type="spellEnd"/>
+      <w:proofErr w:type="gramEnd"/>
+      <w:r>
+        <w:rPr>
+          <w:rFonts w:ascii="Segoe UI Emoji" w:hAnsi="Segoe UI Emoji" w:cs="Segoe UI Emoji"/>
+          <w:b/>
+          <w:bCs/>
+        </w:rPr>
+        <w:t>("h1");</w:t>
+      </w:r>
+    </w:p>
+    <w:p>
+      <w:pPr>
+        <w:spacing w:line="240" w:lineRule="auto"/>
+        <w:jc w:val="both"/>
+        <w:rPr>
+          <w:rFonts w:ascii="Segoe UI Emoji" w:hAnsi="Segoe UI Emoji" w:cs="Segoe UI Emoji"/>
+          <w:b/>
+          <w:bCs/>
+        </w:rPr>
+      </w:pPr>
+    </w:p>
+    <w:p>
+      <w:pPr>
+        <w:spacing w:line="240" w:lineRule="auto"/>
+        <w:jc w:val="both"/>
+        <w:rPr>
+          <w:rFonts w:ascii="Segoe UI Emoji" w:hAnsi="Segoe UI Emoji" w:cs="Segoe UI Emoji"/>
+          <w:b/>
+          <w:bCs/>
+        </w:rPr>
+      </w:pPr>
+      <w:proofErr w:type="spellStart"/>
+      <w:proofErr w:type="gramStart"/>
+      <w:r>
+        <w:rPr>
+          <w:rFonts w:ascii="Segoe UI Emoji" w:hAnsi="Segoe UI Emoji" w:cs="Segoe UI Emoji"/>
+          <w:b/>
+          <w:bCs/>
+        </w:rPr>
+        <w:t>heading.textContent</w:t>
+      </w:r>
+      <w:proofErr w:type="spellEnd"/>
+      <w:proofErr w:type="gramEnd"/>
+      <w:r>
+        <w:rPr>
+          <w:rFonts w:ascii="Segoe UI Emoji" w:hAnsi="Segoe UI Emoji" w:cs="Segoe UI Emoji"/>
+          <w:b/>
+          <w:bCs/>
+        </w:rPr>
+        <w:t xml:space="preserve"> = "Hello Sandeep";</w:t>
+      </w:r>
+    </w:p>
+    <w:p>
+      <w:pPr>
+        <w:spacing w:line="240" w:lineRule="auto"/>
+        <w:jc w:val="both"/>
+        <w:rPr>
+          <w:rFonts w:ascii="Segoe UI Emoji" w:hAnsi="Segoe UI Emoji" w:cs="Segoe UI Emoji"/>
+          <w:b/>
+          <w:bCs/>
+        </w:rPr>
+      </w:pPr>
+      <w:r>
+        <w:rPr>
+          <w:rFonts w:ascii="Segoe UI Emoji" w:hAnsi="Segoe UI Emoji" w:cs="Segoe UI Emoji"/>
+          <w:b/>
+          <w:bCs/>
+        </w:rPr>
+        <w:pict w14:anchorId="4F1B2A87">
+          <v:rect id="_x0000_i1062" style="width:0;height:1.5pt" o:hralign="center" o:hrstd="t" o:hr="t" fillcolor="#a0a0a0" stroked="f"/>
+        </w:pict>
+      </w:r>
+    </w:p>
+    <w:p>
+      <w:pPr>
+        <w:spacing w:line="240" w:lineRule="auto"/>
+        <w:jc w:val="both"/>
+        <w:rPr>
+          <w:rFonts w:ascii="Segoe UI Emoji" w:hAnsi="Segoe UI Emoji" w:cs="Segoe UI Emoji"/>
+          <w:b/>
+          <w:bCs/>
+        </w:rPr>
+      </w:pPr>
+      <w:r>
+        <w:rPr>
+          <w:rFonts w:ascii="Segoe UI Emoji" w:hAnsi="Segoe UI Emoji" w:cs="Segoe UI Emoji"/>
+          <w:b/>
+          <w:bCs/>
+        </w:rPr>
+        <w:t>30. What is the difference between HTML and the DOM?</w:t>
+      </w:r>
+    </w:p>
+    <w:p>
+      <w:pPr>
+        <w:spacing w:line="240" w:lineRule="auto"/>
+        <w:jc w:val="both"/>
+        <w:rPr>
+          <w:rFonts w:ascii="Segoe UI Emoji" w:hAnsi="Segoe UI Emoji" w:cs="Segoe UI Emoji"/>
+          <w:b/>
+          <w:bCs/>
+        </w:rPr>
+      </w:pPr>
+      <w:r>
+        <w:rPr>
+          <w:rFonts w:ascii="Segoe UI Emoji" w:hAnsi="Segoe UI Emoji" w:cs="Segoe UI Emoji"/>
+          <w:b/>
+          <w:bCs/>
+        </w:rPr>
+        <w:t>Answer:</w:t>
+      </w:r>
+    </w:p>
+    <w:p>
+      <w:pPr>
+        <w:spacing w:line="240" w:lineRule="auto"/>
+        <w:jc w:val="both"/>
+        <w:rPr>
+          <w:rFonts w:ascii="Segoe UI Emoji" w:hAnsi="Segoe UI Emoji" w:cs="Segoe UI Emoji"/>
+          <w:b/>
+          <w:bCs/>
+        </w:rPr>
+      </w:pPr>
+      <w:r>
+        <w:rPr>
+          <w:rFonts w:ascii="Segoe UI Emoji" w:hAnsi="Segoe UI Emoji" w:cs="Segoe UI Emoji"/>
+          <w:b/>
+          <w:bCs/>
+        </w:rPr>
+        <w:t>HTML is the markup/code used to define the structure of a webpage.</w:t>
+      </w:r>
+    </w:p>
+    <w:p>
+      <w:pPr>
+        <w:spacing w:line="240" w:lineRule="auto"/>
+        <w:jc w:val="both"/>
+        <w:rPr>
+          <w:rFonts w:ascii="Segoe UI Emoji" w:hAnsi="Segoe UI Emoji" w:cs="Segoe UI Emoji"/>
+          <w:b/>
+          <w:bCs/>
+        </w:rPr>
+      </w:pPr>
+      <w:r>
+        <w:rPr>
+          <w:rFonts w:ascii="Segoe UI Emoji" w:hAnsi="Segoe UI Emoji" w:cs="Segoe UI Emoji"/>
+          <w:b/>
+          <w:bCs/>
+        </w:rPr>
+        <w:t>DOM is the browser's object representation of that HTML document, which JavaScript can manipulate.</w:t>
+      </w:r>
+    </w:p>
+    <w:p>
+      <w:pPr>
+        <w:spacing w:line="240" w:lineRule="auto"/>
+        <w:jc w:val="both"/>
+        <w:rPr>
+          <w:rFonts w:ascii="Segoe UI Emoji" w:hAnsi="Segoe UI Emoji" w:cs="Segoe UI Emoji"/>
+          <w:b/>
+          <w:bCs/>
+        </w:rPr>
+      </w:pPr>
+      <w:r>
+        <w:rPr>
+          <w:rFonts w:ascii="Segoe UI Emoji" w:hAnsi="Segoe UI Emoji" w:cs="Segoe UI Emoji"/>
+          <w:b/>
+          <w:bCs/>
+        </w:rPr>
+        <w:t>Example:</w:t>
+      </w:r>
+    </w:p>
+    <w:p>
+      <w:pPr>
+        <w:spacing w:line="240" w:lineRule="auto"/>
+        <w:jc w:val="both"/>
+        <w:rPr>
+          <w:rFonts w:ascii="Segoe UI Emoji" w:hAnsi="Segoe UI Emoji" w:cs="Segoe UI Emoji"/>
+          <w:b/>
+          <w:bCs/>
+        </w:rPr>
+      </w:pPr>
+      <w:r>
+        <w:rPr>
+          <w:rFonts w:ascii="Segoe UI Emoji" w:hAnsi="Segoe UI Emoji" w:cs="Segoe UI Emoji"/>
+          <w:b/>
+          <w:bCs/>
+        </w:rPr>
+        <w:t>&lt;h1&gt;Hello&lt;/h1&gt;</w:t>
+      </w:r>
+    </w:p>
+    <w:p>
+      <w:pPr>
+        <w:spacing w:line="240" w:lineRule="auto"/>
+        <w:jc w:val="both"/>
+        <w:rPr>
+          <w:rFonts w:ascii="Segoe UI Emoji" w:hAnsi="Segoe UI Emoji" w:cs="Segoe UI Emoji"/>
+          <w:b/>
+          <w:bCs/>
+        </w:rPr>
+      </w:pPr>
+      <w:r>
+        <w:rPr>
+          <w:rFonts w:ascii="Segoe UI Emoji" w:hAnsi="Segoe UI Emoji" w:cs="Segoe UI Emoji"/>
+          <w:b/>
+          <w:bCs/>
+        </w:rPr>
+        <w:t>JavaScript can access and change it through the DOM:</w:t>
+      </w:r>
+    </w:p>
+    <w:p>
+      <w:pPr>
+        <w:spacing w:line="240" w:lineRule="auto"/>
+        <w:jc w:val="both"/>
+        <w:rPr>
+          <w:rFonts w:ascii="Segoe UI Emoji" w:hAnsi="Segoe UI Emoji" w:cs="Segoe UI Emoji"/>
+          <w:b/>
+          <w:bCs/>
+        </w:rPr>
+      </w:pPr>
+      <w:proofErr w:type="spellStart"/>
+      <w:proofErr w:type="gramStart"/>
+      <w:r>
+        <w:rPr>
+          <w:rFonts w:ascii="Segoe UI Emoji" w:hAnsi="Segoe UI Emoji" w:cs="Segoe UI Emoji"/>
+          <w:b/>
+          <w:bCs/>
+        </w:rPr>
+        <w:t>document.querySelector</w:t>
+      </w:r>
+      <w:proofErr w:type="spellEnd"/>
+      <w:proofErr w:type="gramEnd"/>
+      <w:r>
+        <w:rPr>
+          <w:rFonts w:ascii="Segoe UI Emoji" w:hAnsi="Segoe UI Emoji" w:cs="Segoe UI Emoji"/>
+          <w:b/>
+          <w:bCs/>
+        </w:rPr>
+        <w:t>("h1"</w:t>
+      </w:r>
+      <w:proofErr w:type="gramStart"/>
+      <w:r>
+        <w:rPr>
+          <w:rFonts w:ascii="Segoe UI Emoji" w:hAnsi="Segoe UI Emoji" w:cs="Segoe UI Emoji"/>
+          <w:b/>
+          <w:bCs/>
+        </w:rPr>
+        <w:t>).</w:t>
+      </w:r>
+      <w:proofErr w:type="spellStart"/>
+      <w:r>
+        <w:rPr>
+          <w:rFonts w:ascii="Segoe UI Emoji" w:hAnsi="Segoe UI Emoji" w:cs="Segoe UI Emoji"/>
+          <w:b/>
+          <w:bCs/>
+        </w:rPr>
+        <w:t>textContent</w:t>
+      </w:r>
+      <w:proofErr w:type="spellEnd"/>
+      <w:proofErr w:type="gramEnd"/>
+      <w:r>
+        <w:rPr>
+          <w:rFonts w:ascii="Segoe UI Emoji" w:hAnsi="Segoe UI Emoji" w:cs="Segoe UI Emoji"/>
+          <w:b/>
+          <w:bCs/>
+        </w:rPr>
+        <w:t xml:space="preserve"> = "Hello World";</w:t>
+      </w:r>
+    </w:p>
+    <w:p>
+      <w:pPr>
+        <w:spacing w:line="240" w:lineRule="auto"/>
+        <w:jc w:val="both"/>
+        <w:rPr>
+          <w:rFonts w:ascii="Segoe UI Emoji" w:hAnsi="Segoe UI Emoji" w:cs="Segoe UI Emoji"/>
+          <w:b/>
+          <w:bCs/>
+        </w:rPr>
+      </w:pPr>
+      <w:r>
+        <w:rPr>
+          <w:rFonts w:ascii="Segoe UI Emoji" w:hAnsi="Segoe UI Emoji" w:cs="Segoe UI Emoji"/>
+          <w:b/>
+          <w:bCs/>
+        </w:rPr>
+        <w:t>So, in simple words:</w:t>
+      </w:r>
+    </w:p>
+    <w:p>
+      <w:pPr>
+        <w:spacing w:line="240" w:lineRule="auto"/>
+        <w:jc w:val="both"/>
+        <w:rPr>
+          <w:rFonts w:ascii="Segoe UI Emoji" w:hAnsi="Segoe UI Emoji" w:cs="Segoe UI Emoji"/>
+          <w:b/>
+          <w:bCs/>
+        </w:rPr>
+      </w:pPr>
+      <w:r>
+        <w:rPr>
+          <w:rFonts w:ascii="Segoe UI Emoji" w:hAnsi="Segoe UI Emoji" w:cs="Segoe UI Emoji"/>
+          <w:b/>
+          <w:bCs/>
+        </w:rPr>
+        <w:t>HTML creates the structure, and the DOM allows JavaScript to interact with that structure.</w:t>
+      </w:r>
+    </w:p>
+    <w:p>
+      <w:pPr>
+        <w:spacing w:line="240" w:lineRule="auto"/>
+        <w:jc w:val="both"/>
         <w:rPr>
           <w:rFonts w:ascii="Segoe UI Emoji" w:hAnsi="Segoe UI Emoji" w:cs="Segoe UI Emoji"/>
           <w:b/>
           <w:bCs/>
           <w:vanish/>
         </w:rPr>
-        <w:t>Bottom of Form</w:t>
-      </w:r>
+      </w:pPr>
     </w:p>
     <w:p>
       <w:pPr>
@@ -6784,9 +10345,9 @@
     </w:lvl>
   </w:abstractNum>
   <w:abstractNum w:abstractNumId="2" w15:restartNumberingAfterBreak="0">
-    <w:nsid w:val="2F1F6265"/>
+    <w:nsid w:val="2C1615D5"/>
     <w:multiLevelType w:val="multilevel"/>
-    <w:tmpl w:val="EE3C1404"/>
+    <w:tmpl w:val="79E02646"/>
     <w:lvl w:ilvl="0">
       <w:start w:val="1"/>
       <w:numFmt w:val="bullet"/>
@@ -6933,9 +10494,9 @@
     </w:lvl>
   </w:abstractNum>
   <w:abstractNum w:abstractNumId="3" w15:restartNumberingAfterBreak="0">
-    <w:nsid w:val="49200E01"/>
+    <w:nsid w:val="2F1F6265"/>
     <w:multiLevelType w:val="multilevel"/>
-    <w:tmpl w:val="D7BAB886"/>
+    <w:tmpl w:val="EE3C1404"/>
     <w:lvl w:ilvl="0">
       <w:start w:val="1"/>
       <w:numFmt w:val="bullet"/>
@@ -7082,235 +10643,9 @@
     </w:lvl>
   </w:abstractNum>
   <w:abstractNum w:abstractNumId="4" w15:restartNumberingAfterBreak="0">
-    <w:nsid w:val="521B2D9B"/>
+    <w:nsid w:val="49200E01"/>
     <w:multiLevelType w:val="multilevel"/>
-    <w:tmpl w:val="AA0C0176"/>
-    <w:lvl w:ilvl="0">
-      <w:start w:val="1"/>
-      <w:numFmt w:val="decimal"/>
-      <w:lvlText w:val="%1."/>
-      <w:lvlJc w:val="left"/>
-      <w:pPr>
-        <w:tabs>
-          <w:tab w:val="num" w:pos="720"/>
-        </w:tabs>
-        <w:ind w:left="720" w:hanging="360"/>
-      </w:pPr>
-    </w:lvl>
-    <w:lvl w:ilvl="1" w:tentative="1">
-      <w:start w:val="1"/>
-      <w:numFmt w:val="decimal"/>
-      <w:lvlText w:val="%2."/>
-      <w:lvlJc w:val="left"/>
-      <w:pPr>
-        <w:tabs>
-          <w:tab w:val="num" w:pos="1440"/>
-        </w:tabs>
-        <w:ind w:left="1440" w:hanging="360"/>
-      </w:pPr>
-    </w:lvl>
-    <w:lvl w:ilvl="2" w:tentative="1">
-      <w:start w:val="1"/>
-      <w:numFmt w:val="decimal"/>
-      <w:lvlText w:val="%3."/>
-      <w:lvlJc w:val="left"/>
-      <w:pPr>
-        <w:tabs>
-          <w:tab w:val="num" w:pos="2160"/>
-        </w:tabs>
-        <w:ind w:left="2160" w:hanging="360"/>
-      </w:pPr>
-    </w:lvl>
-    <w:lvl w:ilvl="3" w:tentative="1">
-      <w:start w:val="1"/>
-      <w:numFmt w:val="decimal"/>
-      <w:lvlText w:val="%4."/>
-      <w:lvlJc w:val="left"/>
-      <w:pPr>
-        <w:tabs>
-          <w:tab w:val="num" w:pos="2880"/>
-        </w:tabs>
-        <w:ind w:left="2880" w:hanging="360"/>
-      </w:pPr>
-    </w:lvl>
-    <w:lvl w:ilvl="4" w:tentative="1">
-      <w:start w:val="1"/>
-      <w:numFmt w:val="decimal"/>
-      <w:lvlText w:val="%5."/>
-      <w:lvlJc w:val="left"/>
-      <w:pPr>
-        <w:tabs>
-          <w:tab w:val="num" w:pos="3600"/>
-        </w:tabs>
-        <w:ind w:left="3600" w:hanging="360"/>
-      </w:pPr>
-    </w:lvl>
-    <w:lvl w:ilvl="5" w:tentative="1">
-      <w:start w:val="1"/>
-      <w:numFmt w:val="decimal"/>
-      <w:lvlText w:val="%6."/>
-      <w:lvlJc w:val="left"/>
-      <w:pPr>
-        <w:tabs>
-          <w:tab w:val="num" w:pos="4320"/>
-        </w:tabs>
-        <w:ind w:left="4320" w:hanging="360"/>
-      </w:pPr>
-    </w:lvl>
-    <w:lvl w:ilvl="6" w:tentative="1">
-      <w:start w:val="1"/>
-      <w:numFmt w:val="decimal"/>
-      <w:lvlText w:val="%7."/>
-      <w:lvlJc w:val="left"/>
-      <w:pPr>
-        <w:tabs>
-          <w:tab w:val="num" w:pos="5040"/>
-        </w:tabs>
-        <w:ind w:left="5040" w:hanging="360"/>
-      </w:pPr>
-    </w:lvl>
-    <w:lvl w:ilvl="7" w:tentative="1">
-      <w:start w:val="1"/>
-      <w:numFmt w:val="decimal"/>
-      <w:lvlText w:val="%8."/>
-      <w:lvlJc w:val="left"/>
-      <w:pPr>
-        <w:tabs>
-          <w:tab w:val="num" w:pos="5760"/>
-        </w:tabs>
-        <w:ind w:left="5760" w:hanging="360"/>
-      </w:pPr>
-    </w:lvl>
-    <w:lvl w:ilvl="8" w:tentative="1">
-      <w:start w:val="1"/>
-      <w:numFmt w:val="decimal"/>
-      <w:lvlText w:val="%9."/>
-      <w:lvlJc w:val="left"/>
-      <w:pPr>
-        <w:tabs>
-          <w:tab w:val="num" w:pos="6480"/>
-        </w:tabs>
-        <w:ind w:left="6480" w:hanging="360"/>
-      </w:pPr>
-    </w:lvl>
-  </w:abstractNum>
-  <w:abstractNum w:abstractNumId="5" w15:restartNumberingAfterBreak="0">
-    <w:nsid w:val="55AB4EBB"/>
-    <w:multiLevelType w:val="multilevel"/>
-    <w:tmpl w:val="658E677A"/>
-    <w:lvl w:ilvl="0">
-      <w:start w:val="1"/>
-      <w:numFmt w:val="decimal"/>
-      <w:lvlText w:val="%1."/>
-      <w:lvlJc w:val="left"/>
-      <w:pPr>
-        <w:tabs>
-          <w:tab w:val="num" w:pos="720"/>
-        </w:tabs>
-        <w:ind w:left="720" w:hanging="360"/>
-      </w:pPr>
-    </w:lvl>
-    <w:lvl w:ilvl="1" w:tentative="1">
-      <w:start w:val="1"/>
-      <w:numFmt w:val="decimal"/>
-      <w:lvlText w:val="%2."/>
-      <w:lvlJc w:val="left"/>
-      <w:pPr>
-        <w:tabs>
-          <w:tab w:val="num" w:pos="1440"/>
-        </w:tabs>
-        <w:ind w:left="1440" w:hanging="360"/>
-      </w:pPr>
-    </w:lvl>
-    <w:lvl w:ilvl="2" w:tentative="1">
-      <w:start w:val="1"/>
-      <w:numFmt w:val="decimal"/>
-      <w:lvlText w:val="%3."/>
-      <w:lvlJc w:val="left"/>
-      <w:pPr>
-        <w:tabs>
-          <w:tab w:val="num" w:pos="2160"/>
-        </w:tabs>
-        <w:ind w:left="2160" w:hanging="360"/>
-      </w:pPr>
-    </w:lvl>
-    <w:lvl w:ilvl="3" w:tentative="1">
-      <w:start w:val="1"/>
-      <w:numFmt w:val="decimal"/>
-      <w:lvlText w:val="%4."/>
-      <w:lvlJc w:val="left"/>
-      <w:pPr>
-        <w:tabs>
-          <w:tab w:val="num" w:pos="2880"/>
-        </w:tabs>
-        <w:ind w:left="2880" w:hanging="360"/>
-      </w:pPr>
-    </w:lvl>
-    <w:lvl w:ilvl="4" w:tentative="1">
-      <w:start w:val="1"/>
-      <w:numFmt w:val="decimal"/>
-      <w:lvlText w:val="%5."/>
-      <w:lvlJc w:val="left"/>
-      <w:pPr>
-        <w:tabs>
-          <w:tab w:val="num" w:pos="3600"/>
-        </w:tabs>
-        <w:ind w:left="3600" w:hanging="360"/>
-      </w:pPr>
-    </w:lvl>
-    <w:lvl w:ilvl="5" w:tentative="1">
-      <w:start w:val="1"/>
-      <w:numFmt w:val="decimal"/>
-      <w:lvlText w:val="%6."/>
-      <w:lvlJc w:val="left"/>
-      <w:pPr>
-        <w:tabs>
-          <w:tab w:val="num" w:pos="4320"/>
-        </w:tabs>
-        <w:ind w:left="4320" w:hanging="360"/>
-      </w:pPr>
-    </w:lvl>
-    <w:lvl w:ilvl="6" w:tentative="1">
-      <w:start w:val="1"/>
-      <w:numFmt w:val="decimal"/>
-      <w:lvlText w:val="%7."/>
-      <w:lvlJc w:val="left"/>
-      <w:pPr>
-        <w:tabs>
-          <w:tab w:val="num" w:pos="5040"/>
-        </w:tabs>
-        <w:ind w:left="5040" w:hanging="360"/>
-      </w:pPr>
-    </w:lvl>
-    <w:lvl w:ilvl="7" w:tentative="1">
-      <w:start w:val="1"/>
-      <w:numFmt w:val="decimal"/>
-      <w:lvlText w:val="%8."/>
-      <w:lvlJc w:val="left"/>
-      <w:pPr>
-        <w:tabs>
-          <w:tab w:val="num" w:pos="5760"/>
-        </w:tabs>
-        <w:ind w:left="5760" w:hanging="360"/>
-      </w:pPr>
-    </w:lvl>
-    <w:lvl w:ilvl="8" w:tentative="1">
-      <w:start w:val="1"/>
-      <w:numFmt w:val="decimal"/>
-      <w:lvlText w:val="%9."/>
-      <w:lvlJc w:val="left"/>
-      <w:pPr>
-        <w:tabs>
-          <w:tab w:val="num" w:pos="6480"/>
-        </w:tabs>
-        <w:ind w:left="6480" w:hanging="360"/>
-      </w:pPr>
-    </w:lvl>
-  </w:abstractNum>
-  <w:abstractNum w:abstractNumId="6" w15:restartNumberingAfterBreak="0">
-    <w:nsid w:val="5AA950B4"/>
-    <w:multiLevelType w:val="multilevel"/>
-    <w:tmpl w:val="90DA64E6"/>
+    <w:tmpl w:val="D7BAB886"/>
     <w:lvl w:ilvl="0">
       <w:start w:val="1"/>
       <w:numFmt w:val="bullet"/>
@@ -7456,26 +10791,708 @@
       </w:rPr>
     </w:lvl>
   </w:abstractNum>
+  <w:abstractNum w:abstractNumId="5" w15:restartNumberingAfterBreak="0">
+    <w:nsid w:val="521B2D9B"/>
+    <w:multiLevelType w:val="multilevel"/>
+    <w:tmpl w:val="AA0C0176"/>
+    <w:lvl w:ilvl="0">
+      <w:start w:val="1"/>
+      <w:numFmt w:val="decimal"/>
+      <w:lvlText w:val="%1."/>
+      <w:lvlJc w:val="left"/>
+      <w:pPr>
+        <w:tabs>
+          <w:tab w:val="num" w:pos="720"/>
+        </w:tabs>
+        <w:ind w:left="720" w:hanging="360"/>
+      </w:pPr>
+    </w:lvl>
+    <w:lvl w:ilvl="1" w:tentative="1">
+      <w:start w:val="1"/>
+      <w:numFmt w:val="decimal"/>
+      <w:lvlText w:val="%2."/>
+      <w:lvlJc w:val="left"/>
+      <w:pPr>
+        <w:tabs>
+          <w:tab w:val="num" w:pos="1440"/>
+        </w:tabs>
+        <w:ind w:left="1440" w:hanging="360"/>
+      </w:pPr>
+    </w:lvl>
+    <w:lvl w:ilvl="2" w:tentative="1">
+      <w:start w:val="1"/>
+      <w:numFmt w:val="decimal"/>
+      <w:lvlText w:val="%3."/>
+      <w:lvlJc w:val="left"/>
+      <w:pPr>
+        <w:tabs>
+          <w:tab w:val="num" w:pos="2160"/>
+        </w:tabs>
+        <w:ind w:left="2160" w:hanging="360"/>
+      </w:pPr>
+    </w:lvl>
+    <w:lvl w:ilvl="3" w:tentative="1">
+      <w:start w:val="1"/>
+      <w:numFmt w:val="decimal"/>
+      <w:lvlText w:val="%4."/>
+      <w:lvlJc w:val="left"/>
+      <w:pPr>
+        <w:tabs>
+          <w:tab w:val="num" w:pos="2880"/>
+        </w:tabs>
+        <w:ind w:left="2880" w:hanging="360"/>
+      </w:pPr>
+    </w:lvl>
+    <w:lvl w:ilvl="4" w:tentative="1">
+      <w:start w:val="1"/>
+      <w:numFmt w:val="decimal"/>
+      <w:lvlText w:val="%5."/>
+      <w:lvlJc w:val="left"/>
+      <w:pPr>
+        <w:tabs>
+          <w:tab w:val="num" w:pos="3600"/>
+        </w:tabs>
+        <w:ind w:left="3600" w:hanging="360"/>
+      </w:pPr>
+    </w:lvl>
+    <w:lvl w:ilvl="5" w:tentative="1">
+      <w:start w:val="1"/>
+      <w:numFmt w:val="decimal"/>
+      <w:lvlText w:val="%6."/>
+      <w:lvlJc w:val="left"/>
+      <w:pPr>
+        <w:tabs>
+          <w:tab w:val="num" w:pos="4320"/>
+        </w:tabs>
+        <w:ind w:left="4320" w:hanging="360"/>
+      </w:pPr>
+    </w:lvl>
+    <w:lvl w:ilvl="6" w:tentative="1">
+      <w:start w:val="1"/>
+      <w:numFmt w:val="decimal"/>
+      <w:lvlText w:val="%7."/>
+      <w:lvlJc w:val="left"/>
+      <w:pPr>
+        <w:tabs>
+          <w:tab w:val="num" w:pos="5040"/>
+        </w:tabs>
+        <w:ind w:left="5040" w:hanging="360"/>
+      </w:pPr>
+    </w:lvl>
+    <w:lvl w:ilvl="7" w:tentative="1">
+      <w:start w:val="1"/>
+      <w:numFmt w:val="decimal"/>
+      <w:lvlText w:val="%8."/>
+      <w:lvlJc w:val="left"/>
+      <w:pPr>
+        <w:tabs>
+          <w:tab w:val="num" w:pos="5760"/>
+        </w:tabs>
+        <w:ind w:left="5760" w:hanging="360"/>
+      </w:pPr>
+    </w:lvl>
+    <w:lvl w:ilvl="8" w:tentative="1">
+      <w:start w:val="1"/>
+      <w:numFmt w:val="decimal"/>
+      <w:lvlText w:val="%9."/>
+      <w:lvlJc w:val="left"/>
+      <w:pPr>
+        <w:tabs>
+          <w:tab w:val="num" w:pos="6480"/>
+        </w:tabs>
+        <w:ind w:left="6480" w:hanging="360"/>
+      </w:pPr>
+    </w:lvl>
+  </w:abstractNum>
+  <w:abstractNum w:abstractNumId="6" w15:restartNumberingAfterBreak="0">
+    <w:nsid w:val="52986AE0"/>
+    <w:multiLevelType w:val="multilevel"/>
+    <w:tmpl w:val="AAE002BE"/>
+    <w:lvl w:ilvl="0">
+      <w:start w:val="1"/>
+      <w:numFmt w:val="bullet"/>
+      <w:lvlText w:val=""/>
+      <w:lvlJc w:val="left"/>
+      <w:pPr>
+        <w:tabs>
+          <w:tab w:val="num" w:pos="720"/>
+        </w:tabs>
+        <w:ind w:left="720" w:hanging="360"/>
+      </w:pPr>
+      <w:rPr>
+        <w:rFonts w:ascii="Symbol" w:hAnsi="Symbol" w:hint="default"/>
+        <w:sz w:val="20"/>
+      </w:rPr>
+    </w:lvl>
+    <w:lvl w:ilvl="1" w:tentative="1">
+      <w:start w:val="1"/>
+      <w:numFmt w:val="bullet"/>
+      <w:lvlText w:val="o"/>
+      <w:lvlJc w:val="left"/>
+      <w:pPr>
+        <w:tabs>
+          <w:tab w:val="num" w:pos="1440"/>
+        </w:tabs>
+        <w:ind w:left="1440" w:hanging="360"/>
+      </w:pPr>
+      <w:rPr>
+        <w:rFonts w:ascii="Courier New" w:hAnsi="Courier New" w:hint="default"/>
+        <w:sz w:val="20"/>
+      </w:rPr>
+    </w:lvl>
+    <w:lvl w:ilvl="2" w:tentative="1">
+      <w:start w:val="1"/>
+      <w:numFmt w:val="bullet"/>
+      <w:lvlText w:val=""/>
+      <w:lvlJc w:val="left"/>
+      <w:pPr>
+        <w:tabs>
+          <w:tab w:val="num" w:pos="2160"/>
+        </w:tabs>
+        <w:ind w:left="2160" w:hanging="360"/>
+      </w:pPr>
+      <w:rPr>
+        <w:rFonts w:ascii="Wingdings" w:hAnsi="Wingdings" w:hint="default"/>
+        <w:sz w:val="20"/>
+      </w:rPr>
+    </w:lvl>
+    <w:lvl w:ilvl="3" w:tentative="1">
+      <w:start w:val="1"/>
+      <w:numFmt w:val="bullet"/>
+      <w:lvlText w:val=""/>
+      <w:lvlJc w:val="left"/>
+      <w:pPr>
+        <w:tabs>
+          <w:tab w:val="num" w:pos="2880"/>
+        </w:tabs>
+        <w:ind w:left="2880" w:hanging="360"/>
+      </w:pPr>
+      <w:rPr>
+        <w:rFonts w:ascii="Wingdings" w:hAnsi="Wingdings" w:hint="default"/>
+        <w:sz w:val="20"/>
+      </w:rPr>
+    </w:lvl>
+    <w:lvl w:ilvl="4" w:tentative="1">
+      <w:start w:val="1"/>
+      <w:numFmt w:val="bullet"/>
+      <w:lvlText w:val=""/>
+      <w:lvlJc w:val="left"/>
+      <w:pPr>
+        <w:tabs>
+          <w:tab w:val="num" w:pos="3600"/>
+        </w:tabs>
+        <w:ind w:left="3600" w:hanging="360"/>
+      </w:pPr>
+      <w:rPr>
+        <w:rFonts w:ascii="Wingdings" w:hAnsi="Wingdings" w:hint="default"/>
+        <w:sz w:val="20"/>
+      </w:rPr>
+    </w:lvl>
+    <w:lvl w:ilvl="5" w:tentative="1">
+      <w:start w:val="1"/>
+      <w:numFmt w:val="bullet"/>
+      <w:lvlText w:val=""/>
+      <w:lvlJc w:val="left"/>
+      <w:pPr>
+        <w:tabs>
+          <w:tab w:val="num" w:pos="4320"/>
+        </w:tabs>
+        <w:ind w:left="4320" w:hanging="360"/>
+      </w:pPr>
+      <w:rPr>
+        <w:rFonts w:ascii="Wingdings" w:hAnsi="Wingdings" w:hint="default"/>
+        <w:sz w:val="20"/>
+      </w:rPr>
+    </w:lvl>
+    <w:lvl w:ilvl="6" w:tentative="1">
+      <w:start w:val="1"/>
+      <w:numFmt w:val="bullet"/>
+      <w:lvlText w:val=""/>
+      <w:lvlJc w:val="left"/>
+      <w:pPr>
+        <w:tabs>
+          <w:tab w:val="num" w:pos="5040"/>
+        </w:tabs>
+        <w:ind w:left="5040" w:hanging="360"/>
+      </w:pPr>
+      <w:rPr>
+        <w:rFonts w:ascii="Wingdings" w:hAnsi="Wingdings" w:hint="default"/>
+        <w:sz w:val="20"/>
+      </w:rPr>
+    </w:lvl>
+    <w:lvl w:ilvl="7" w:tentative="1">
+      <w:start w:val="1"/>
+      <w:numFmt w:val="bullet"/>
+      <w:lvlText w:val=""/>
+      <w:lvlJc w:val="left"/>
+      <w:pPr>
+        <w:tabs>
+          <w:tab w:val="num" w:pos="5760"/>
+        </w:tabs>
+        <w:ind w:left="5760" w:hanging="360"/>
+      </w:pPr>
+      <w:rPr>
+        <w:rFonts w:ascii="Wingdings" w:hAnsi="Wingdings" w:hint="default"/>
+        <w:sz w:val="20"/>
+      </w:rPr>
+    </w:lvl>
+    <w:lvl w:ilvl="8" w:tentative="1">
+      <w:start w:val="1"/>
+      <w:numFmt w:val="bullet"/>
+      <w:lvlText w:val=""/>
+      <w:lvlJc w:val="left"/>
+      <w:pPr>
+        <w:tabs>
+          <w:tab w:val="num" w:pos="6480"/>
+        </w:tabs>
+        <w:ind w:left="6480" w:hanging="360"/>
+      </w:pPr>
+      <w:rPr>
+        <w:rFonts w:ascii="Wingdings" w:hAnsi="Wingdings" w:hint="default"/>
+        <w:sz w:val="20"/>
+      </w:rPr>
+    </w:lvl>
+  </w:abstractNum>
+  <w:abstractNum w:abstractNumId="7" w15:restartNumberingAfterBreak="0">
+    <w:nsid w:val="55AB4EBB"/>
+    <w:multiLevelType w:val="multilevel"/>
+    <w:tmpl w:val="658E677A"/>
+    <w:lvl w:ilvl="0">
+      <w:start w:val="1"/>
+      <w:numFmt w:val="decimal"/>
+      <w:lvlText w:val="%1."/>
+      <w:lvlJc w:val="left"/>
+      <w:pPr>
+        <w:tabs>
+          <w:tab w:val="num" w:pos="720"/>
+        </w:tabs>
+        <w:ind w:left="720" w:hanging="360"/>
+      </w:pPr>
+    </w:lvl>
+    <w:lvl w:ilvl="1" w:tentative="1">
+      <w:start w:val="1"/>
+      <w:numFmt w:val="decimal"/>
+      <w:lvlText w:val="%2."/>
+      <w:lvlJc w:val="left"/>
+      <w:pPr>
+        <w:tabs>
+          <w:tab w:val="num" w:pos="1440"/>
+        </w:tabs>
+        <w:ind w:left="1440" w:hanging="360"/>
+      </w:pPr>
+    </w:lvl>
+    <w:lvl w:ilvl="2" w:tentative="1">
+      <w:start w:val="1"/>
+      <w:numFmt w:val="decimal"/>
+      <w:lvlText w:val="%3."/>
+      <w:lvlJc w:val="left"/>
+      <w:pPr>
+        <w:tabs>
+          <w:tab w:val="num" w:pos="2160"/>
+        </w:tabs>
+        <w:ind w:left="2160" w:hanging="360"/>
+      </w:pPr>
+    </w:lvl>
+    <w:lvl w:ilvl="3" w:tentative="1">
+      <w:start w:val="1"/>
+      <w:numFmt w:val="decimal"/>
+      <w:lvlText w:val="%4."/>
+      <w:lvlJc w:val="left"/>
+      <w:pPr>
+        <w:tabs>
+          <w:tab w:val="num" w:pos="2880"/>
+        </w:tabs>
+        <w:ind w:left="2880" w:hanging="360"/>
+      </w:pPr>
+    </w:lvl>
+    <w:lvl w:ilvl="4" w:tentative="1">
+      <w:start w:val="1"/>
+      <w:numFmt w:val="decimal"/>
+      <w:lvlText w:val="%5."/>
+      <w:lvlJc w:val="left"/>
+      <w:pPr>
+        <w:tabs>
+          <w:tab w:val="num" w:pos="3600"/>
+        </w:tabs>
+        <w:ind w:left="3600" w:hanging="360"/>
+      </w:pPr>
+    </w:lvl>
+    <w:lvl w:ilvl="5" w:tentative="1">
+      <w:start w:val="1"/>
+      <w:numFmt w:val="decimal"/>
+      <w:lvlText w:val="%6."/>
+      <w:lvlJc w:val="left"/>
+      <w:pPr>
+        <w:tabs>
+          <w:tab w:val="num" w:pos="4320"/>
+        </w:tabs>
+        <w:ind w:left="4320" w:hanging="360"/>
+      </w:pPr>
+    </w:lvl>
+    <w:lvl w:ilvl="6" w:tentative="1">
+      <w:start w:val="1"/>
+      <w:numFmt w:val="decimal"/>
+      <w:lvlText w:val="%7."/>
+      <w:lvlJc w:val="left"/>
+      <w:pPr>
+        <w:tabs>
+          <w:tab w:val="num" w:pos="5040"/>
+        </w:tabs>
+        <w:ind w:left="5040" w:hanging="360"/>
+      </w:pPr>
+    </w:lvl>
+    <w:lvl w:ilvl="7" w:tentative="1">
+      <w:start w:val="1"/>
+      <w:numFmt w:val="decimal"/>
+      <w:lvlText w:val="%8."/>
+      <w:lvlJc w:val="left"/>
+      <w:pPr>
+        <w:tabs>
+          <w:tab w:val="num" w:pos="5760"/>
+        </w:tabs>
+        <w:ind w:left="5760" w:hanging="360"/>
+      </w:pPr>
+    </w:lvl>
+    <w:lvl w:ilvl="8" w:tentative="1">
+      <w:start w:val="1"/>
+      <w:numFmt w:val="decimal"/>
+      <w:lvlText w:val="%9."/>
+      <w:lvlJc w:val="left"/>
+      <w:pPr>
+        <w:tabs>
+          <w:tab w:val="num" w:pos="6480"/>
+        </w:tabs>
+        <w:ind w:left="6480" w:hanging="360"/>
+      </w:pPr>
+    </w:lvl>
+  </w:abstractNum>
+  <w:abstractNum w:abstractNumId="8" w15:restartNumberingAfterBreak="0">
+    <w:nsid w:val="5AA950B4"/>
+    <w:multiLevelType w:val="multilevel"/>
+    <w:tmpl w:val="90DA64E6"/>
+    <w:lvl w:ilvl="0">
+      <w:start w:val="1"/>
+      <w:numFmt w:val="bullet"/>
+      <w:lvlText w:val=""/>
+      <w:lvlJc w:val="left"/>
+      <w:pPr>
+        <w:tabs>
+          <w:tab w:val="num" w:pos="720"/>
+        </w:tabs>
+        <w:ind w:left="720" w:hanging="360"/>
+      </w:pPr>
+      <w:rPr>
+        <w:rFonts w:ascii="Symbol" w:hAnsi="Symbol" w:hint="default"/>
+        <w:sz w:val="20"/>
+      </w:rPr>
+    </w:lvl>
+    <w:lvl w:ilvl="1" w:tentative="1">
+      <w:start w:val="1"/>
+      <w:numFmt w:val="bullet"/>
+      <w:lvlText w:val="o"/>
+      <w:lvlJc w:val="left"/>
+      <w:pPr>
+        <w:tabs>
+          <w:tab w:val="num" w:pos="1440"/>
+        </w:tabs>
+        <w:ind w:left="1440" w:hanging="360"/>
+      </w:pPr>
+      <w:rPr>
+        <w:rFonts w:ascii="Courier New" w:hAnsi="Courier New" w:hint="default"/>
+        <w:sz w:val="20"/>
+      </w:rPr>
+    </w:lvl>
+    <w:lvl w:ilvl="2" w:tentative="1">
+      <w:start w:val="1"/>
+      <w:numFmt w:val="bullet"/>
+      <w:lvlText w:val=""/>
+      <w:lvlJc w:val="left"/>
+      <w:pPr>
+        <w:tabs>
+          <w:tab w:val="num" w:pos="2160"/>
+        </w:tabs>
+        <w:ind w:left="2160" w:hanging="360"/>
+      </w:pPr>
+      <w:rPr>
+        <w:rFonts w:ascii="Wingdings" w:hAnsi="Wingdings" w:hint="default"/>
+        <w:sz w:val="20"/>
+      </w:rPr>
+    </w:lvl>
+    <w:lvl w:ilvl="3" w:tentative="1">
+      <w:start w:val="1"/>
+      <w:numFmt w:val="bullet"/>
+      <w:lvlText w:val=""/>
+      <w:lvlJc w:val="left"/>
+      <w:pPr>
+        <w:tabs>
+          <w:tab w:val="num" w:pos="2880"/>
+        </w:tabs>
+        <w:ind w:left="2880" w:hanging="360"/>
+      </w:pPr>
+      <w:rPr>
+        <w:rFonts w:ascii="Wingdings" w:hAnsi="Wingdings" w:hint="default"/>
+        <w:sz w:val="20"/>
+      </w:rPr>
+    </w:lvl>
+    <w:lvl w:ilvl="4" w:tentative="1">
+      <w:start w:val="1"/>
+      <w:numFmt w:val="bullet"/>
+      <w:lvlText w:val=""/>
+      <w:lvlJc w:val="left"/>
+      <w:pPr>
+        <w:tabs>
+          <w:tab w:val="num" w:pos="3600"/>
+        </w:tabs>
+        <w:ind w:left="3600" w:hanging="360"/>
+      </w:pPr>
+      <w:rPr>
+        <w:rFonts w:ascii="Wingdings" w:hAnsi="Wingdings" w:hint="default"/>
+        <w:sz w:val="20"/>
+      </w:rPr>
+    </w:lvl>
+    <w:lvl w:ilvl="5" w:tentative="1">
+      <w:start w:val="1"/>
+      <w:numFmt w:val="bullet"/>
+      <w:lvlText w:val=""/>
+      <w:lvlJc w:val="left"/>
+      <w:pPr>
+        <w:tabs>
+          <w:tab w:val="num" w:pos="4320"/>
+        </w:tabs>
+        <w:ind w:left="4320" w:hanging="360"/>
+      </w:pPr>
+      <w:rPr>
+        <w:rFonts w:ascii="Wingdings" w:hAnsi="Wingdings" w:hint="default"/>
+        <w:sz w:val="20"/>
+      </w:rPr>
+    </w:lvl>
+    <w:lvl w:ilvl="6" w:tentative="1">
+      <w:start w:val="1"/>
+      <w:numFmt w:val="bullet"/>
+      <w:lvlText w:val=""/>
+      <w:lvlJc w:val="left"/>
+      <w:pPr>
+        <w:tabs>
+          <w:tab w:val="num" w:pos="5040"/>
+        </w:tabs>
+        <w:ind w:left="5040" w:hanging="360"/>
+      </w:pPr>
+      <w:rPr>
+        <w:rFonts w:ascii="Wingdings" w:hAnsi="Wingdings" w:hint="default"/>
+        <w:sz w:val="20"/>
+      </w:rPr>
+    </w:lvl>
+    <w:lvl w:ilvl="7" w:tentative="1">
+      <w:start w:val="1"/>
+      <w:numFmt w:val="bullet"/>
+      <w:lvlText w:val=""/>
+      <w:lvlJc w:val="left"/>
+      <w:pPr>
+        <w:tabs>
+          <w:tab w:val="num" w:pos="5760"/>
+        </w:tabs>
+        <w:ind w:left="5760" w:hanging="360"/>
+      </w:pPr>
+      <w:rPr>
+        <w:rFonts w:ascii="Wingdings" w:hAnsi="Wingdings" w:hint="default"/>
+        <w:sz w:val="20"/>
+      </w:rPr>
+    </w:lvl>
+    <w:lvl w:ilvl="8" w:tentative="1">
+      <w:start w:val="1"/>
+      <w:numFmt w:val="bullet"/>
+      <w:lvlText w:val=""/>
+      <w:lvlJc w:val="left"/>
+      <w:pPr>
+        <w:tabs>
+          <w:tab w:val="num" w:pos="6480"/>
+        </w:tabs>
+        <w:ind w:left="6480" w:hanging="360"/>
+      </w:pPr>
+      <w:rPr>
+        <w:rFonts w:ascii="Wingdings" w:hAnsi="Wingdings" w:hint="default"/>
+        <w:sz w:val="20"/>
+      </w:rPr>
+    </w:lvl>
+  </w:abstractNum>
+  <w:abstractNum w:abstractNumId="9" w15:restartNumberingAfterBreak="0">
+    <w:nsid w:val="689A3026"/>
+    <w:multiLevelType w:val="multilevel"/>
+    <w:tmpl w:val="A106F4A4"/>
+    <w:lvl w:ilvl="0">
+      <w:start w:val="1"/>
+      <w:numFmt w:val="bullet"/>
+      <w:lvlText w:val=""/>
+      <w:lvlJc w:val="left"/>
+      <w:pPr>
+        <w:tabs>
+          <w:tab w:val="num" w:pos="720"/>
+        </w:tabs>
+        <w:ind w:left="720" w:hanging="360"/>
+      </w:pPr>
+      <w:rPr>
+        <w:rFonts w:ascii="Symbol" w:hAnsi="Symbol" w:hint="default"/>
+        <w:sz w:val="20"/>
+      </w:rPr>
+    </w:lvl>
+    <w:lvl w:ilvl="1" w:tentative="1">
+      <w:start w:val="1"/>
+      <w:numFmt w:val="bullet"/>
+      <w:lvlText w:val="o"/>
+      <w:lvlJc w:val="left"/>
+      <w:pPr>
+        <w:tabs>
+          <w:tab w:val="num" w:pos="1440"/>
+        </w:tabs>
+        <w:ind w:left="1440" w:hanging="360"/>
+      </w:pPr>
+      <w:rPr>
+        <w:rFonts w:ascii="Courier New" w:hAnsi="Courier New" w:hint="default"/>
+        <w:sz w:val="20"/>
+      </w:rPr>
+    </w:lvl>
+    <w:lvl w:ilvl="2" w:tentative="1">
+      <w:start w:val="1"/>
+      <w:numFmt w:val="bullet"/>
+      <w:lvlText w:val=""/>
+      <w:lvlJc w:val="left"/>
+      <w:pPr>
+        <w:tabs>
+          <w:tab w:val="num" w:pos="2160"/>
+        </w:tabs>
+        <w:ind w:left="2160" w:hanging="360"/>
+      </w:pPr>
+      <w:rPr>
+        <w:rFonts w:ascii="Wingdings" w:hAnsi="Wingdings" w:hint="default"/>
+        <w:sz w:val="20"/>
+      </w:rPr>
+    </w:lvl>
+    <w:lvl w:ilvl="3" w:tentative="1">
+      <w:start w:val="1"/>
+      <w:numFmt w:val="bullet"/>
+      <w:lvlText w:val=""/>
+      <w:lvlJc w:val="left"/>
+      <w:pPr>
+        <w:tabs>
+          <w:tab w:val="num" w:pos="2880"/>
+        </w:tabs>
+        <w:ind w:left="2880" w:hanging="360"/>
+      </w:pPr>
+      <w:rPr>
+        <w:rFonts w:ascii="Wingdings" w:hAnsi="Wingdings" w:hint="default"/>
+        <w:sz w:val="20"/>
+      </w:rPr>
+    </w:lvl>
+    <w:lvl w:ilvl="4" w:tentative="1">
+      <w:start w:val="1"/>
+      <w:numFmt w:val="bullet"/>
+      <w:lvlText w:val=""/>
+      <w:lvlJc w:val="left"/>
+      <w:pPr>
+        <w:tabs>
+          <w:tab w:val="num" w:pos="3600"/>
+        </w:tabs>
+        <w:ind w:left="3600" w:hanging="360"/>
+      </w:pPr>
+      <w:rPr>
+        <w:rFonts w:ascii="Wingdings" w:hAnsi="Wingdings" w:hint="default"/>
+        <w:sz w:val="20"/>
+      </w:rPr>
+    </w:lvl>
+    <w:lvl w:ilvl="5" w:tentative="1">
+      <w:start w:val="1"/>
+      <w:numFmt w:val="bullet"/>
+      <w:lvlText w:val=""/>
+      <w:lvlJc w:val="left"/>
+      <w:pPr>
+        <w:tabs>
+          <w:tab w:val="num" w:pos="4320"/>
+        </w:tabs>
+        <w:ind w:left="4320" w:hanging="360"/>
+      </w:pPr>
+      <w:rPr>
+        <w:rFonts w:ascii="Wingdings" w:hAnsi="Wingdings" w:hint="default"/>
+        <w:sz w:val="20"/>
+      </w:rPr>
+    </w:lvl>
+    <w:lvl w:ilvl="6" w:tentative="1">
+      <w:start w:val="1"/>
+      <w:numFmt w:val="bullet"/>
+      <w:lvlText w:val=""/>
+      <w:lvlJc w:val="left"/>
+      <w:pPr>
+        <w:tabs>
+          <w:tab w:val="num" w:pos="5040"/>
+        </w:tabs>
+        <w:ind w:left="5040" w:hanging="360"/>
+      </w:pPr>
+      <w:rPr>
+        <w:rFonts w:ascii="Wingdings" w:hAnsi="Wingdings" w:hint="default"/>
+        <w:sz w:val="20"/>
+      </w:rPr>
+    </w:lvl>
+    <w:lvl w:ilvl="7" w:tentative="1">
+      <w:start w:val="1"/>
+      <w:numFmt w:val="bullet"/>
+      <w:lvlText w:val=""/>
+      <w:lvlJc w:val="left"/>
+      <w:pPr>
+        <w:tabs>
+          <w:tab w:val="num" w:pos="5760"/>
+        </w:tabs>
+        <w:ind w:left="5760" w:hanging="360"/>
+      </w:pPr>
+      <w:rPr>
+        <w:rFonts w:ascii="Wingdings" w:hAnsi="Wingdings" w:hint="default"/>
+        <w:sz w:val="20"/>
+      </w:rPr>
+    </w:lvl>
+    <w:lvl w:ilvl="8" w:tentative="1">
+      <w:start w:val="1"/>
+      <w:numFmt w:val="bullet"/>
+      <w:lvlText w:val=""/>
+      <w:lvlJc w:val="left"/>
+      <w:pPr>
+        <w:tabs>
+          <w:tab w:val="num" w:pos="6480"/>
+        </w:tabs>
+        <w:ind w:left="6480" w:hanging="360"/>
+      </w:pPr>
+      <w:rPr>
+        <w:rFonts w:ascii="Wingdings" w:hAnsi="Wingdings" w:hint="default"/>
+        <w:sz w:val="20"/>
+      </w:rPr>
+    </w:lvl>
+  </w:abstractNum>
   <w:num w:numId="1" w16cid:durableId="470249161">
-    <w:abstractNumId w:val="5"/>
+    <w:abstractNumId w:val="7"/>
   </w:num>
   <w:num w:numId="2" w16cid:durableId="1077674249">
-    <w:abstractNumId w:val="3"/>
+    <w:abstractNumId w:val="4"/>
   </w:num>
   <w:num w:numId="3" w16cid:durableId="871839872">
-    <w:abstractNumId w:val="6"/>
+    <w:abstractNumId w:val="8"/>
   </w:num>
   <w:num w:numId="4" w16cid:durableId="771514644">
-    <w:abstractNumId w:val="4"/>
+    <w:abstractNumId w:val="5"/>
   </w:num>
   <w:num w:numId="5" w16cid:durableId="286736976">
     <w:abstractNumId w:val="1"/>
   </w:num>
   <w:num w:numId="6" w16cid:durableId="747267576">
-    <w:abstractNumId w:val="2"/>
+    <w:abstractNumId w:val="3"/>
   </w:num>
   <w:num w:numId="7" w16cid:durableId="818107710">
     <w:abstractNumId w:val="0"/>
+  </w:num>
+  <w:num w:numId="8" w16cid:durableId="1868716115">
+    <w:abstractNumId w:val="9"/>
+  </w:num>
+  <w:num w:numId="9" w16cid:durableId="1184856918">
+    <w:abstractNumId w:val="2"/>
+  </w:num>
+  <w:num w:numId="10" w16cid:durableId="1039284607">
+    <w:abstractNumId w:val="6"/>
   </w:num>
 </w:numbering>
 </file>

</xml_diff>